<commit_message>
feat: ship MonoField 0.11.5 release candidate
</commit_message>
<xml_diff>
--- a/apps/monofield-site/downloads/monofield-user-guide-ko.docx
+++ b/apps/monofield-site/downloads/monofield-user-guide-ko.docx
@@ -843,7 +843,7 @@
           <w:color w:val="111216"/>
           <w:sz w:val="21"/>
         </w:rPr>
-        <w:t>DB는 읽기 전용으로 시작하고, 쓰기는 승인된 쓰기 또는 전체 허용 정책을 명시적으로 선택합니다.</w:t>
+        <w:t>DB는 읽기 전용으로 시작합니다. 쓰기가 필요하면 ‘쓰기마다 승인’ 또는 ‘항상 쓰기 허용’을 선택합니다. 두 쓰기 모드도 구조화된 INSERT·UPDATE·DELETE만 허용하며 DDL과 임의 SQL은 차단합니다.</w:t>
       </w:r>
     </w:p>
     <w:p>
@@ -891,7 +891,7 @@
           <w:color w:val="111216"/>
           <w:sz w:val="21"/>
         </w:rPr>
-        <w:t>인터페이스/화면 명세를 코드에서 만들 때는 실제 코드베이스 폴더를 먼저 연결합니다.</w:t>
+        <w:t>코드 기반 인터페이스 명세는 실제 코드베이스 폴더를 먼저 연결합니다. 화면 명세는 업로드하거나 캡처한 화면을 기준으로 작성합니다.</w:t>
       </w:r>
     </w:p>
     <w:tbl>
@@ -1665,7 +1665,7 @@
           <w:color w:val="5D6470"/>
           <w:sz w:val="19"/>
         </w:rPr>
-        <w:t>선택한 폴더를 CLI의 기본 작업 루트로 사용합니다. MonoField가 실행 구성을 탐색하고 파일·Git·브라우저·DB 문맥을 같은 프로젝트에 연결합니다.</w:t>
+        <w:t>선택한 폴더를 CLI와 내장 터미널의 기본 작업 루트로 사용합니다. MonoField가 실행 구성을 탐색하고 파일·Git·서버 로그·브라우저·DB 문맥을 같은 프로젝트에 연결합니다.</w:t>
       </w:r>
     </w:p>
     <w:tbl>
@@ -1791,7 +1791,7 @@
                 <w:color w:val="1737A6"/>
                 <w:sz w:val="17"/>
               </w:rPr>
-              <w:t>03  요청</w:t>
+              <w:t>03  터미널/대화</w:t>
             </w:r>
           </w:p>
           <w:p>
@@ -4328,7 +4328,7 @@
                 <w:color w:val="111216"/>
                 <w:sz w:val="17"/>
               </w:rPr>
-              <w:t>코드 기반 인터페이스/화면 명세는 작업 폴더 검증 후 옵션 폼을 엽니다. 코드 없는 인터페이스는 최소 정보만 받고 비어 있는 요청·응답을 AI가 초안으로 채울 수 있습니다.</w:t>
+              <w:t>코드 기반 인터페이스 명세는 실제 코드 폴더 검증 → 옵션 폼 → 스캔 → XLSX 흐름입니다. 코드 없는 인터페이스는 최소 정보로 AI 초안을 만든 뒤 제안을 검토·확정해야 내보낼 수 있습니다. 화면 명세는 업로드/캡처 화면에 마커·Description·Check Point를 편집하고 HTML 미리보기 후 PPTX로 내보냅니다.</w:t>
             </w:r>
           </w:p>
         </w:tc>
@@ -4811,7 +4811,7 @@
                 <w:color w:val="111216"/>
                 <w:sz w:val="17"/>
               </w:rPr>
-              <w:t>‘분기 실적 발표용 10장 슬라이드를 만들어줘.’</w:t>
+              <w:t>‘업로드한 주문 화면을 마커·Description·Check Point가 포함된 화면 명세서로 만들어줘.’</w:t>
             </w:r>
           </w:p>
         </w:tc>
@@ -5274,6 +5274,4893 @@
                 <w:sz w:val="17"/>
               </w:rPr>
               <w:t>문제가 반복되면 실행 중인 프로젝트, 선택한 실행 구성, CLI 버전, 모델명, 브라우저 승인 상태를 함께 확인하세요.</w:t>
+            </w:r>
+          </w:p>
+        </w:tc>
+      </w:tr>
+    </w:tbl>
+    <w:p>
+      <w:r>
+        <w:br w:type="page"/>
+      </w:r>
+    </w:p>
+    <w:p>
+      <w:pPr>
+        <w:spacing w:after="120"/>
+      </w:pPr>
+      <w:r>
+        <w:rPr>
+          <w:rFonts w:ascii="Calibri" w:hAnsi="Calibri"/>
+          <w:b/>
+          <w:color w:val="2E5BFF"/>
+          <w:sz w:val="17"/>
+        </w:rPr>
+        <w:t>12  /  MULTI-PROJECT</w:t>
+      </w:r>
+    </w:p>
+    <w:p>
+      <w:pPr>
+        <w:spacing w:after="160"/>
+      </w:pPr>
+      <w:r>
+        <w:rPr>
+          <w:rFonts w:ascii="Calibri" w:hAnsi="Calibri"/>
+          <w:b/>
+          <w:color w:val="1737A6"/>
+          <w:sz w:val="42"/>
+        </w:rPr>
+        <w:t>여러 서버를 한 워크스페이스에서 관리합니다</w:t>
+      </w:r>
+    </w:p>
+    <w:p>
+      <w:pPr>
+        <w:spacing w:after="200"/>
+      </w:pPr>
+      <w:r>
+        <w:rPr>
+          <w:rFonts w:ascii="Calibri" w:hAnsi="Calibri"/>
+          <w:b w:val="0"/>
+          <w:color w:val="5D6470"/>
+          <w:sz w:val="21"/>
+        </w:rPr>
+        <w:t>상위 폴더를 열면 MonoField가 실행 가능한 하위 프로젝트를 발견합니다. 활성 프로젝트를 바꿔도 각 서버의 PID·URL·로그·실행 구성이 섞이지 않습니다.</w:t>
+      </w:r>
+    </w:p>
+    <w:tbl>
+      <w:tblPr>
+        <w:tblW w:type="auto" w:w="0"/>
+        <w:jc w:val="center"/>
+        <w:tblLayout w:type="fixed"/>
+        <w:tblLook w:firstColumn="1" w:firstRow="1" w:lastColumn="0" w:lastRow="0" w:noHBand="0" w:noVBand="1" w:val="04A0"/>
+      </w:tblPr>
+      <w:tblGrid>
+        <w:gridCol w:w="3762"/>
+        <w:gridCol w:w="3762"/>
+        <w:gridCol w:w="3762"/>
+        <w:gridCol w:w="3762"/>
+      </w:tblGrid>
+      <w:tr>
+        <w:tc>
+          <w:tcPr>
+            <w:tcW w:type="dxa" w:w="3139"/>
+            <w:vAlign w:val="center"/>
+            <w:shd w:fill="EEF1F6"/>
+            <w:tcBorders>
+              <w:top w:val="single" w:sz="4" w:color="D7DEE9"/>
+              <w:left w:val="single" w:sz="4" w:color="D7DEE9"/>
+              <w:bottom w:val="single" w:sz="4" w:color="D7DEE9"/>
+              <w:right w:val="single" w:sz="4" w:color="D7DEE9"/>
+              <w:insideH w:val="single" w:sz="4" w:color="D7DEE9"/>
+              <w:insideV w:val="single" w:sz="4" w:color="D7DEE9"/>
+            </w:tcBorders>
+          </w:tcPr>
+          <w:p>
+            <w:pPr>
+              <w:spacing w:after="80"/>
+            </w:pPr>
+            <w:r>
+              <w:rPr>
+                <w:rFonts w:ascii="Calibri" w:hAnsi="Calibri"/>
+                <w:b/>
+                <w:color w:val="1737A6"/>
+                <w:sz w:val="17"/>
+              </w:rPr>
+              <w:t>01  워크스페이스</w:t>
+            </w:r>
+          </w:p>
+          <w:p>
+            <w:r>
+              <w:rPr>
+                <w:rFonts w:ascii="Calibri" w:hAnsi="Calibri"/>
+                <w:b w:val="0"/>
+                <w:color w:val="5D6470"/>
+                <w:sz w:val="17"/>
+              </w:rPr>
+              <w:t>여러 저장소가 들어 있는 상위 폴더 선택</w:t>
+            </w:r>
+          </w:p>
+        </w:tc>
+        <w:tc>
+          <w:tcPr>
+            <w:tcW w:type="dxa" w:w="3139"/>
+            <w:vAlign w:val="center"/>
+            <w:shd w:fill="EEF1F6"/>
+            <w:tcBorders>
+              <w:top w:val="single" w:sz="4" w:color="D7DEE9"/>
+              <w:left w:val="single" w:sz="4" w:color="D7DEE9"/>
+              <w:bottom w:val="single" w:sz="4" w:color="D7DEE9"/>
+              <w:right w:val="single" w:sz="4" w:color="D7DEE9"/>
+              <w:insideH w:val="single" w:sz="4" w:color="D7DEE9"/>
+              <w:insideV w:val="single" w:sz="4" w:color="D7DEE9"/>
+            </w:tcBorders>
+          </w:tcPr>
+          <w:p>
+            <w:pPr>
+              <w:spacing w:after="80"/>
+            </w:pPr>
+            <w:r>
+              <w:rPr>
+                <w:rFonts w:ascii="Calibri" w:hAnsi="Calibri"/>
+                <w:b/>
+                <w:color w:val="1737A6"/>
+                <w:sz w:val="17"/>
+              </w:rPr>
+              <w:t>02  활성 프로젝트</w:t>
+            </w:r>
+          </w:p>
+          <w:p>
+            <w:r>
+              <w:rPr>
+                <w:rFonts w:ascii="Calibri" w:hAnsi="Calibri"/>
+                <w:b w:val="0"/>
+                <w:color w:val="5D6470"/>
+                <w:sz w:val="17"/>
+              </w:rPr>
+              <w:t>AOP·ACR·AGW 등 현재 작업 대상 선택</w:t>
+            </w:r>
+          </w:p>
+        </w:tc>
+        <w:tc>
+          <w:tcPr>
+            <w:tcW w:type="dxa" w:w="3139"/>
+            <w:vAlign w:val="center"/>
+            <w:shd w:fill="EEF1F6"/>
+            <w:tcBorders>
+              <w:top w:val="single" w:sz="4" w:color="D7DEE9"/>
+              <w:left w:val="single" w:sz="4" w:color="D7DEE9"/>
+              <w:bottom w:val="single" w:sz="4" w:color="D7DEE9"/>
+              <w:right w:val="single" w:sz="4" w:color="D7DEE9"/>
+              <w:insideH w:val="single" w:sz="4" w:color="D7DEE9"/>
+              <w:insideV w:val="single" w:sz="4" w:color="D7DEE9"/>
+            </w:tcBorders>
+          </w:tcPr>
+          <w:p>
+            <w:pPr>
+              <w:spacing w:after="80"/>
+            </w:pPr>
+            <w:r>
+              <w:rPr>
+                <w:rFonts w:ascii="Calibri" w:hAnsi="Calibri"/>
+                <w:b/>
+                <w:color w:val="1737A6"/>
+                <w:sz w:val="17"/>
+              </w:rPr>
+              <w:t>03  독립 실행</w:t>
+            </w:r>
+          </w:p>
+          <w:p>
+            <w:r>
+              <w:rPr>
+                <w:rFonts w:ascii="Calibri" w:hAnsi="Calibri"/>
+                <w:b w:val="0"/>
+                <w:color w:val="5D6470"/>
+                <w:sz w:val="17"/>
+              </w:rPr>
+              <w:t>프로젝트별 구성·프로필·포트로 실행</w:t>
+            </w:r>
+          </w:p>
+        </w:tc>
+        <w:tc>
+          <w:tcPr>
+            <w:tcW w:type="dxa" w:w="3139"/>
+            <w:vAlign w:val="center"/>
+            <w:shd w:fill="EEF1F6"/>
+            <w:tcBorders>
+              <w:top w:val="single" w:sz="4" w:color="D7DEE9"/>
+              <w:left w:val="single" w:sz="4" w:color="D7DEE9"/>
+              <w:bottom w:val="single" w:sz="4" w:color="D7DEE9"/>
+              <w:right w:val="single" w:sz="4" w:color="D7DEE9"/>
+              <w:insideH w:val="single" w:sz="4" w:color="D7DEE9"/>
+              <w:insideV w:val="single" w:sz="4" w:color="D7DEE9"/>
+            </w:tcBorders>
+          </w:tcPr>
+          <w:p>
+            <w:pPr>
+              <w:spacing w:after="80"/>
+            </w:pPr>
+            <w:r>
+              <w:rPr>
+                <w:rFonts w:ascii="Calibri" w:hAnsi="Calibri"/>
+                <w:b/>
+                <w:color w:val="1737A6"/>
+                <w:sz w:val="17"/>
+              </w:rPr>
+              <w:t>04  상태 복원</w:t>
+            </w:r>
+          </w:p>
+          <w:p>
+            <w:r>
+              <w:rPr>
+                <w:rFonts w:ascii="Calibri" w:hAnsi="Calibri"/>
+                <w:b w:val="0"/>
+                <w:color w:val="5D6470"/>
+                <w:sz w:val="17"/>
+              </w:rPr>
+              <w:t>다시 선택하면 기존 로그와 실행 상태 확인</w:t>
+            </w:r>
+          </w:p>
+        </w:tc>
+      </w:tr>
+    </w:tbl>
+    <w:p>
+      <w:pPr>
+        <w:spacing w:after="20"/>
+      </w:pPr>
+    </w:p>
+    <w:tbl>
+      <w:tblPr>
+        <w:tblW w:type="auto" w:w="0"/>
+        <w:jc w:val="center"/>
+        <w:tblLayout w:type="fixed"/>
+        <w:tblLook w:firstColumn="1" w:firstRow="1" w:lastColumn="0" w:lastRow="0" w:noHBand="0" w:noVBand="1" w:val="04A0"/>
+      </w:tblPr>
+      <w:tblGrid>
+        <w:gridCol w:w="5016"/>
+        <w:gridCol w:w="5016"/>
+        <w:gridCol w:w="5016"/>
+      </w:tblGrid>
+      <w:tr>
+        <w:trPr>
+          <w:tblHeader w:val="true"/>
+        </w:trPr>
+        <w:tc>
+          <w:tcPr>
+            <w:tcW w:type="dxa" w:w="1872"/>
+            <w:shd w:fill="DDE4EE"/>
+            <w:tcBorders>
+              <w:top w:val="single" w:sz="6" w:color="CAD2DF"/>
+              <w:left w:val="single" w:sz="6" w:color="CAD2DF"/>
+              <w:bottom w:val="single" w:sz="6" w:color="CAD2DF"/>
+              <w:right w:val="single" w:sz="6" w:color="CAD2DF"/>
+              <w:insideH w:val="single" w:sz="6" w:color="CAD2DF"/>
+              <w:insideV w:val="single" w:sz="6" w:color="CAD2DF"/>
+            </w:tcBorders>
+          </w:tcPr>
+          <w:p>
+            <w:pPr>
+              <w:spacing w:after="0"/>
+            </w:pPr>
+            <w:r>
+              <w:rPr>
+                <w:rFonts w:ascii="Calibri" w:hAnsi="Calibri"/>
+                <w:b/>
+                <w:color w:val="1737A6"/>
+                <w:sz w:val="17"/>
+              </w:rPr>
+              <w:t>표시</w:t>
+            </w:r>
+          </w:p>
+        </w:tc>
+        <w:tc>
+          <w:tcPr>
+            <w:tcW w:type="dxa" w:w="6048"/>
+            <w:shd w:fill="DDE4EE"/>
+            <w:tcBorders>
+              <w:top w:val="single" w:sz="6" w:color="CAD2DF"/>
+              <w:left w:val="single" w:sz="6" w:color="CAD2DF"/>
+              <w:bottom w:val="single" w:sz="6" w:color="CAD2DF"/>
+              <w:right w:val="single" w:sz="6" w:color="CAD2DF"/>
+              <w:insideH w:val="single" w:sz="6" w:color="CAD2DF"/>
+              <w:insideV w:val="single" w:sz="6" w:color="CAD2DF"/>
+            </w:tcBorders>
+          </w:tcPr>
+          <w:p>
+            <w:pPr>
+              <w:spacing w:after="0"/>
+            </w:pPr>
+            <w:r>
+              <w:rPr>
+                <w:rFonts w:ascii="Calibri" w:hAnsi="Calibri"/>
+                <w:b/>
+                <w:color w:val="1737A6"/>
+                <w:sz w:val="17"/>
+              </w:rPr>
+              <w:t>의미</w:t>
+            </w:r>
+          </w:p>
+        </w:tc>
+        <w:tc>
+          <w:tcPr>
+            <w:tcW w:type="dxa" w:w="5040"/>
+            <w:shd w:fill="DDE4EE"/>
+            <w:tcBorders>
+              <w:top w:val="single" w:sz="6" w:color="CAD2DF"/>
+              <w:left w:val="single" w:sz="6" w:color="CAD2DF"/>
+              <w:bottom w:val="single" w:sz="6" w:color="CAD2DF"/>
+              <w:right w:val="single" w:sz="6" w:color="CAD2DF"/>
+              <w:insideH w:val="single" w:sz="6" w:color="CAD2DF"/>
+              <w:insideV w:val="single" w:sz="6" w:color="CAD2DF"/>
+            </w:tcBorders>
+          </w:tcPr>
+          <w:p>
+            <w:pPr>
+              <w:spacing w:after="0"/>
+            </w:pPr>
+            <w:r>
+              <w:rPr>
+                <w:rFonts w:ascii="Calibri" w:hAnsi="Calibri"/>
+                <w:b/>
+                <w:color w:val="1737A6"/>
+                <w:sz w:val="17"/>
+              </w:rPr>
+              <w:t>사용자가 할 일</w:t>
+            </w:r>
+          </w:p>
+        </w:tc>
+      </w:tr>
+      <w:tr>
+        <w:tc>
+          <w:tcPr>
+            <w:tcW w:type="dxa" w:w="1872"/>
+            <w:tcBorders>
+              <w:top w:val="single" w:sz="6" w:color="CAD2DF"/>
+              <w:left w:val="single" w:sz="6" w:color="CAD2DF"/>
+              <w:bottom w:val="single" w:sz="6" w:color="CAD2DF"/>
+              <w:right w:val="single" w:sz="6" w:color="CAD2DF"/>
+              <w:insideH w:val="single" w:sz="6" w:color="CAD2DF"/>
+              <w:insideV w:val="single" w:sz="6" w:color="CAD2DF"/>
+            </w:tcBorders>
+            <w:vAlign w:val="center"/>
+          </w:tcPr>
+          <w:p>
+            <w:pPr>
+              <w:spacing w:after="0"/>
+            </w:pPr>
+            <w:r>
+              <w:rPr>
+                <w:rFonts w:ascii="Calibri" w:hAnsi="Calibri"/>
+                <w:b w:val="0"/>
+                <w:color w:val="111216"/>
+                <w:sz w:val="16"/>
+              </w:rPr>
+              <w:t>초록 · 실행 중</w:t>
+            </w:r>
+          </w:p>
+        </w:tc>
+        <w:tc>
+          <w:tcPr>
+            <w:tcW w:type="dxa" w:w="6048"/>
+            <w:tcBorders>
+              <w:top w:val="single" w:sz="6" w:color="CAD2DF"/>
+              <w:left w:val="single" w:sz="6" w:color="CAD2DF"/>
+              <w:bottom w:val="single" w:sz="6" w:color="CAD2DF"/>
+              <w:right w:val="single" w:sz="6" w:color="CAD2DF"/>
+              <w:insideH w:val="single" w:sz="6" w:color="CAD2DF"/>
+              <w:insideV w:val="single" w:sz="6" w:color="CAD2DF"/>
+            </w:tcBorders>
+            <w:vAlign w:val="center"/>
+          </w:tcPr>
+          <w:p>
+            <w:pPr>
+              <w:spacing w:after="0"/>
+            </w:pPr>
+            <w:r>
+              <w:rPr>
+                <w:rFonts w:ascii="Calibri" w:hAnsi="Calibri"/>
+                <w:b w:val="0"/>
+                <w:color w:val="111216"/>
+                <w:sz w:val="16"/>
+              </w:rPr>
+              <w:t>해당 프로젝트 프로세스가 살아 있고 URL 또는 로그가 연결됨</w:t>
+            </w:r>
+          </w:p>
+        </w:tc>
+        <w:tc>
+          <w:tcPr>
+            <w:tcW w:type="dxa" w:w="5040"/>
+            <w:tcBorders>
+              <w:top w:val="single" w:sz="6" w:color="CAD2DF"/>
+              <w:left w:val="single" w:sz="6" w:color="CAD2DF"/>
+              <w:bottom w:val="single" w:sz="6" w:color="CAD2DF"/>
+              <w:right w:val="single" w:sz="6" w:color="CAD2DF"/>
+              <w:insideH w:val="single" w:sz="6" w:color="CAD2DF"/>
+              <w:insideV w:val="single" w:sz="6" w:color="CAD2DF"/>
+            </w:tcBorders>
+            <w:vAlign w:val="center"/>
+          </w:tcPr>
+          <w:p>
+            <w:pPr>
+              <w:spacing w:after="0"/>
+            </w:pPr>
+            <w:r>
+              <w:rPr>
+                <w:rFonts w:ascii="Calibri" w:hAnsi="Calibri"/>
+                <w:b w:val="0"/>
+                <w:color w:val="111216"/>
+                <w:sz w:val="16"/>
+              </w:rPr>
+              <w:t>로그를 보거나 브라우저에서 검증</w:t>
+            </w:r>
+          </w:p>
+        </w:tc>
+      </w:tr>
+      <w:tr>
+        <w:tc>
+          <w:tcPr>
+            <w:tcW w:type="dxa" w:w="1872"/>
+            <w:tcBorders>
+              <w:top w:val="single" w:sz="6" w:color="CAD2DF"/>
+              <w:left w:val="single" w:sz="6" w:color="CAD2DF"/>
+              <w:bottom w:val="single" w:sz="6" w:color="CAD2DF"/>
+              <w:right w:val="single" w:sz="6" w:color="CAD2DF"/>
+              <w:insideH w:val="single" w:sz="6" w:color="CAD2DF"/>
+              <w:insideV w:val="single" w:sz="6" w:color="CAD2DF"/>
+            </w:tcBorders>
+            <w:vAlign w:val="center"/>
+          </w:tcPr>
+          <w:p>
+            <w:pPr>
+              <w:spacing w:after="0"/>
+            </w:pPr>
+            <w:r>
+              <w:rPr>
+                <w:rFonts w:ascii="Calibri" w:hAnsi="Calibri"/>
+                <w:b w:val="0"/>
+                <w:color w:val="111216"/>
+                <w:sz w:val="16"/>
+              </w:rPr>
+              <w:t>파랑 · 불러오는 중</w:t>
+            </w:r>
+          </w:p>
+        </w:tc>
+        <w:tc>
+          <w:tcPr>
+            <w:tcW w:type="dxa" w:w="6048"/>
+            <w:tcBorders>
+              <w:top w:val="single" w:sz="6" w:color="CAD2DF"/>
+              <w:left w:val="single" w:sz="6" w:color="CAD2DF"/>
+              <w:bottom w:val="single" w:sz="6" w:color="CAD2DF"/>
+              <w:right w:val="single" w:sz="6" w:color="CAD2DF"/>
+              <w:insideH w:val="single" w:sz="6" w:color="CAD2DF"/>
+              <w:insideV w:val="single" w:sz="6" w:color="CAD2DF"/>
+            </w:tcBorders>
+            <w:vAlign w:val="center"/>
+          </w:tcPr>
+          <w:p>
+            <w:pPr>
+              <w:spacing w:after="0"/>
+            </w:pPr>
+            <w:r>
+              <w:rPr>
+                <w:rFonts w:ascii="Calibri" w:hAnsi="Calibri"/>
+                <w:b w:val="0"/>
+                <w:color w:val="111216"/>
+                <w:sz w:val="16"/>
+              </w:rPr>
+              <w:t>실행 구성·Git 상태·서버 상태를 비동기로 갱신 중</w:t>
+            </w:r>
+          </w:p>
+        </w:tc>
+        <w:tc>
+          <w:tcPr>
+            <w:tcW w:type="dxa" w:w="5040"/>
+            <w:tcBorders>
+              <w:top w:val="single" w:sz="6" w:color="CAD2DF"/>
+              <w:left w:val="single" w:sz="6" w:color="CAD2DF"/>
+              <w:bottom w:val="single" w:sz="6" w:color="CAD2DF"/>
+              <w:right w:val="single" w:sz="6" w:color="CAD2DF"/>
+              <w:insideH w:val="single" w:sz="6" w:color="CAD2DF"/>
+              <w:insideV w:val="single" w:sz="6" w:color="CAD2DF"/>
+            </w:tcBorders>
+            <w:vAlign w:val="center"/>
+          </w:tcPr>
+          <w:p>
+            <w:pPr>
+              <w:spacing w:after="0"/>
+            </w:pPr>
+            <w:r>
+              <w:rPr>
+                <w:rFonts w:ascii="Calibri" w:hAnsi="Calibri"/>
+                <w:b w:val="0"/>
+                <w:color w:val="111216"/>
+                <w:sz w:val="16"/>
+              </w:rPr>
+              <w:t>전환을 반복하지 말고 완료 표시 확인</w:t>
+            </w:r>
+          </w:p>
+        </w:tc>
+      </w:tr>
+      <w:tr>
+        <w:tc>
+          <w:tcPr>
+            <w:tcW w:type="dxa" w:w="1872"/>
+            <w:tcBorders>
+              <w:top w:val="single" w:sz="6" w:color="CAD2DF"/>
+              <w:left w:val="single" w:sz="6" w:color="CAD2DF"/>
+              <w:bottom w:val="single" w:sz="6" w:color="CAD2DF"/>
+              <w:right w:val="single" w:sz="6" w:color="CAD2DF"/>
+              <w:insideH w:val="single" w:sz="6" w:color="CAD2DF"/>
+              <w:insideV w:val="single" w:sz="6" w:color="CAD2DF"/>
+            </w:tcBorders>
+            <w:vAlign w:val="center"/>
+          </w:tcPr>
+          <w:p>
+            <w:pPr>
+              <w:spacing w:after="0"/>
+            </w:pPr>
+            <w:r>
+              <w:rPr>
+                <w:rFonts w:ascii="Calibri" w:hAnsi="Calibri"/>
+                <w:b w:val="0"/>
+                <w:color w:val="111216"/>
+                <w:sz w:val="16"/>
+              </w:rPr>
+              <w:t>회색 · 중지됨</w:t>
+            </w:r>
+          </w:p>
+        </w:tc>
+        <w:tc>
+          <w:tcPr>
+            <w:tcW w:type="dxa" w:w="6048"/>
+            <w:tcBorders>
+              <w:top w:val="single" w:sz="6" w:color="CAD2DF"/>
+              <w:left w:val="single" w:sz="6" w:color="CAD2DF"/>
+              <w:bottom w:val="single" w:sz="6" w:color="CAD2DF"/>
+              <w:right w:val="single" w:sz="6" w:color="CAD2DF"/>
+              <w:insideH w:val="single" w:sz="6" w:color="CAD2DF"/>
+              <w:insideV w:val="single" w:sz="6" w:color="CAD2DF"/>
+            </w:tcBorders>
+            <w:vAlign w:val="center"/>
+          </w:tcPr>
+          <w:p>
+            <w:pPr>
+              <w:spacing w:after="0"/>
+            </w:pPr>
+            <w:r>
+              <w:rPr>
+                <w:rFonts w:ascii="Calibri" w:hAnsi="Calibri"/>
+                <w:b w:val="0"/>
+                <w:color w:val="111216"/>
+                <w:sz w:val="16"/>
+              </w:rPr>
+              <w:t>구성은 발견됐지만 현재 실행 프로세스가 없음</w:t>
+            </w:r>
+          </w:p>
+        </w:tc>
+        <w:tc>
+          <w:tcPr>
+            <w:tcW w:type="dxa" w:w="5040"/>
+            <w:tcBorders>
+              <w:top w:val="single" w:sz="6" w:color="CAD2DF"/>
+              <w:left w:val="single" w:sz="6" w:color="CAD2DF"/>
+              <w:bottom w:val="single" w:sz="6" w:color="CAD2DF"/>
+              <w:right w:val="single" w:sz="6" w:color="CAD2DF"/>
+              <w:insideH w:val="single" w:sz="6" w:color="CAD2DF"/>
+              <w:insideV w:val="single" w:sz="6" w:color="CAD2DF"/>
+            </w:tcBorders>
+            <w:vAlign w:val="center"/>
+          </w:tcPr>
+          <w:p>
+            <w:pPr>
+              <w:spacing w:after="0"/>
+            </w:pPr>
+            <w:r>
+              <w:rPr>
+                <w:rFonts w:ascii="Calibri" w:hAnsi="Calibri"/>
+                <w:b w:val="0"/>
+                <w:color w:val="111216"/>
+                <w:sz w:val="16"/>
+              </w:rPr>
+              <w:t>프로필과 포트를 확인한 뒤 실행</w:t>
+            </w:r>
+          </w:p>
+        </w:tc>
+      </w:tr>
+      <w:tr>
+        <w:tc>
+          <w:tcPr>
+            <w:tcW w:type="dxa" w:w="1872"/>
+            <w:tcBorders>
+              <w:top w:val="single" w:sz="6" w:color="CAD2DF"/>
+              <w:left w:val="single" w:sz="6" w:color="CAD2DF"/>
+              <w:bottom w:val="single" w:sz="6" w:color="CAD2DF"/>
+              <w:right w:val="single" w:sz="6" w:color="CAD2DF"/>
+              <w:insideH w:val="single" w:sz="6" w:color="CAD2DF"/>
+              <w:insideV w:val="single" w:sz="6" w:color="CAD2DF"/>
+            </w:tcBorders>
+            <w:vAlign w:val="center"/>
+          </w:tcPr>
+          <w:p>
+            <w:pPr>
+              <w:spacing w:after="0"/>
+            </w:pPr>
+            <w:r>
+              <w:rPr>
+                <w:rFonts w:ascii="Calibri" w:hAnsi="Calibri"/>
+                <w:b w:val="0"/>
+                <w:color w:val="111216"/>
+                <w:sz w:val="16"/>
+              </w:rPr>
+              <w:t>빨강 · 실패</w:t>
+            </w:r>
+          </w:p>
+        </w:tc>
+        <w:tc>
+          <w:tcPr>
+            <w:tcW w:type="dxa" w:w="6048"/>
+            <w:tcBorders>
+              <w:top w:val="single" w:sz="6" w:color="CAD2DF"/>
+              <w:left w:val="single" w:sz="6" w:color="CAD2DF"/>
+              <w:bottom w:val="single" w:sz="6" w:color="CAD2DF"/>
+              <w:right w:val="single" w:sz="6" w:color="CAD2DF"/>
+              <w:insideH w:val="single" w:sz="6" w:color="CAD2DF"/>
+              <w:insideV w:val="single" w:sz="6" w:color="CAD2DF"/>
+            </w:tcBorders>
+            <w:vAlign w:val="center"/>
+          </w:tcPr>
+          <w:p>
+            <w:pPr>
+              <w:spacing w:after="0"/>
+            </w:pPr>
+            <w:r>
+              <w:rPr>
+                <w:rFonts w:ascii="Calibri" w:hAnsi="Calibri"/>
+                <w:b w:val="0"/>
+                <w:color w:val="111216"/>
+                <w:sz w:val="16"/>
+              </w:rPr>
+              <w:t>포트 충돌, 누락된 런타임, 명령 실패 등이 로그에 기록됨</w:t>
+            </w:r>
+          </w:p>
+        </w:tc>
+        <w:tc>
+          <w:tcPr>
+            <w:tcW w:type="dxa" w:w="5040"/>
+            <w:tcBorders>
+              <w:top w:val="single" w:sz="6" w:color="CAD2DF"/>
+              <w:left w:val="single" w:sz="6" w:color="CAD2DF"/>
+              <w:bottom w:val="single" w:sz="6" w:color="CAD2DF"/>
+              <w:right w:val="single" w:sz="6" w:color="CAD2DF"/>
+              <w:insideH w:val="single" w:sz="6" w:color="CAD2DF"/>
+              <w:insideV w:val="single" w:sz="6" w:color="CAD2DF"/>
+            </w:tcBorders>
+            <w:vAlign w:val="center"/>
+          </w:tcPr>
+          <w:p>
+            <w:pPr>
+              <w:spacing w:after="0"/>
+            </w:pPr>
+            <w:r>
+              <w:rPr>
+                <w:rFonts w:ascii="Calibri" w:hAnsi="Calibri"/>
+                <w:b w:val="0"/>
+                <w:color w:val="111216"/>
+                <w:sz w:val="16"/>
+              </w:rPr>
+              <w:t>실행 로그의 전체 오류를 열어 원인 수정</w:t>
+            </w:r>
+          </w:p>
+        </w:tc>
+      </w:tr>
+    </w:tbl>
+    <w:p>
+      <w:pPr>
+        <w:spacing w:after="20"/>
+      </w:pPr>
+    </w:p>
+    <w:tbl>
+      <w:tblPr>
+        <w:tblW w:type="auto" w:w="0"/>
+        <w:jc w:val="center"/>
+        <w:tblLayout w:type="fixed"/>
+        <w:tblLook w:firstColumn="1" w:firstRow="1" w:lastColumn="0" w:lastRow="0" w:noHBand="0" w:noVBand="1" w:val="04A0"/>
+      </w:tblPr>
+      <w:tblGrid>
+        <w:gridCol w:w="7524"/>
+        <w:gridCol w:w="7524"/>
+      </w:tblGrid>
+      <w:tr>
+        <w:tc>
+          <w:tcPr>
+            <w:tcW w:type="dxa" w:w="1440"/>
+            <w:tcBorders>
+              <w:top w:val="single" w:sz="8" w:color="2E5BFF"/>
+              <w:left w:val="single" w:sz="8" w:color="2E5BFF"/>
+              <w:bottom w:val="single" w:sz="8" w:color="2E5BFF"/>
+              <w:right w:val="single" w:sz="8" w:color="2E5BFF"/>
+              <w:insideH w:val="single" w:sz="8" w:color="2E5BFF"/>
+              <w:insideV w:val="single" w:sz="8" w:color="2E5BFF"/>
+            </w:tcBorders>
+            <w:vAlign w:val="center"/>
+            <w:shd w:fill="2E5BFF"/>
+          </w:tcPr>
+          <w:p>
+            <w:pPr>
+              <w:jc w:val="center"/>
+            </w:pPr>
+            <w:r>
+              <w:rPr>
+                <w:rFonts w:ascii="Calibri" w:hAnsi="Calibri"/>
+                <w:b/>
+                <w:color w:val="FFFFFF"/>
+                <w:sz w:val="17"/>
+              </w:rPr>
+              <w:t>성능</w:t>
+            </w:r>
+          </w:p>
+        </w:tc>
+        <w:tc>
+          <w:tcPr>
+            <w:tcW w:type="dxa" w:w="11520"/>
+            <w:tcBorders>
+              <w:top w:val="single" w:sz="8" w:color="2E5BFF"/>
+              <w:left w:val="single" w:sz="8" w:color="2E5BFF"/>
+              <w:bottom w:val="single" w:sz="8" w:color="2E5BFF"/>
+              <w:right w:val="single" w:sz="8" w:color="2E5BFF"/>
+              <w:insideH w:val="single" w:sz="8" w:color="2E5BFF"/>
+              <w:insideV w:val="single" w:sz="8" w:color="2E5BFF"/>
+            </w:tcBorders>
+            <w:vAlign w:val="center"/>
+            <w:shd w:fill="F4F6FB"/>
+          </w:tcPr>
+          <w:p>
+            <w:r>
+              <w:rPr>
+                <w:rFonts w:ascii="Calibri" w:hAnsi="Calibri"/>
+                <w:b w:val="0"/>
+                <w:color w:val="111216"/>
+                <w:sz w:val="17"/>
+              </w:rPr>
+              <w:t>전체 트리를 매번 재귀 스캔하지 않습니다. 알려진 프로젝트 표식만 제한적으로 찾고, 무거운 폴더는 제외하며, Git 감시와 상세 로딩은 활성 프로젝트에 집중합니다.</w:t>
+            </w:r>
+          </w:p>
+        </w:tc>
+      </w:tr>
+    </w:tbl>
+    <w:p>
+      <w:r>
+        <w:br w:type="page"/>
+      </w:r>
+    </w:p>
+    <w:p>
+      <w:pPr>
+        <w:spacing w:after="120"/>
+      </w:pPr>
+      <w:r>
+        <w:rPr>
+          <w:rFonts w:ascii="Calibri" w:hAnsi="Calibri"/>
+          <w:b/>
+          <w:color w:val="2E5BFF"/>
+          <w:sz w:val="17"/>
+        </w:rPr>
+        <w:t>13  /  DATABASE GOVERNANCE</w:t>
+      </w:r>
+    </w:p>
+    <w:p>
+      <w:pPr>
+        <w:spacing w:after="160"/>
+      </w:pPr>
+      <w:r>
+        <w:rPr>
+          <w:rFonts w:ascii="Calibri" w:hAnsi="Calibri"/>
+          <w:b/>
+          <w:color w:val="1737A6"/>
+          <w:sz w:val="42"/>
+        </w:rPr>
+        <w:t>DB는 연결보다 권한이 먼저입니다</w:t>
+      </w:r>
+    </w:p>
+    <w:p>
+      <w:pPr>
+        <w:spacing w:after="200"/>
+      </w:pPr>
+      <w:r>
+        <w:rPr>
+          <w:rFonts w:ascii="Calibri" w:hAnsi="Calibri"/>
+          <w:b w:val="0"/>
+          <w:color w:val="5D6470"/>
+          <w:sz w:val="21"/>
+        </w:rPr>
+        <w:t>프로젝트에는 연결 ID만 남고 실제 자격 증명은 Desktop 암호화 저장소에 보관됩니다. 멀티 프로젝트에서는 활성 모듈마다 연결과 정책을 따로 선택합니다.</w:t>
+      </w:r>
+    </w:p>
+    <w:tbl>
+      <w:tblPr>
+        <w:tblW w:type="auto" w:w="0"/>
+        <w:jc w:val="center"/>
+        <w:tblLayout w:type="fixed"/>
+        <w:tblLook w:firstColumn="1" w:firstRow="1" w:lastColumn="0" w:lastRow="0" w:noHBand="0" w:noVBand="1" w:val="04A0"/>
+      </w:tblPr>
+      <w:tblGrid>
+        <w:gridCol w:w="3762"/>
+        <w:gridCol w:w="3762"/>
+        <w:gridCol w:w="3762"/>
+        <w:gridCol w:w="3762"/>
+      </w:tblGrid>
+      <w:tr>
+        <w:tc>
+          <w:tcPr>
+            <w:tcW w:type="dxa" w:w="3139"/>
+            <w:vAlign w:val="center"/>
+            <w:shd w:fill="EEF1F6"/>
+            <w:tcBorders>
+              <w:top w:val="single" w:sz="4" w:color="D7DEE9"/>
+              <w:left w:val="single" w:sz="4" w:color="D7DEE9"/>
+              <w:bottom w:val="single" w:sz="4" w:color="D7DEE9"/>
+              <w:right w:val="single" w:sz="4" w:color="D7DEE9"/>
+              <w:insideH w:val="single" w:sz="4" w:color="D7DEE9"/>
+              <w:insideV w:val="single" w:sz="4" w:color="D7DEE9"/>
+            </w:tcBorders>
+          </w:tcPr>
+          <w:p>
+            <w:pPr>
+              <w:spacing w:after="80"/>
+            </w:pPr>
+            <w:r>
+              <w:rPr>
+                <w:rFonts w:ascii="Calibri" w:hAnsi="Calibri"/>
+                <w:b/>
+                <w:color w:val="1737A6"/>
+                <w:sz w:val="17"/>
+              </w:rPr>
+              <w:t>01  읽기</w:t>
+            </w:r>
+          </w:p>
+          <w:p>
+            <w:r>
+              <w:rPr>
+                <w:rFonts w:ascii="Calibri" w:hAnsi="Calibri"/>
+                <w:b w:val="0"/>
+                <w:color w:val="5D6470"/>
+                <w:sz w:val="17"/>
+              </w:rPr>
+              <w:t>스키마·키·허용된 샘플 조회</w:t>
+            </w:r>
+          </w:p>
+        </w:tc>
+        <w:tc>
+          <w:tcPr>
+            <w:tcW w:type="dxa" w:w="3139"/>
+            <w:vAlign w:val="center"/>
+            <w:shd w:fill="EEF1F6"/>
+            <w:tcBorders>
+              <w:top w:val="single" w:sz="4" w:color="D7DEE9"/>
+              <w:left w:val="single" w:sz="4" w:color="D7DEE9"/>
+              <w:bottom w:val="single" w:sz="4" w:color="D7DEE9"/>
+              <w:right w:val="single" w:sz="4" w:color="D7DEE9"/>
+              <w:insideH w:val="single" w:sz="4" w:color="D7DEE9"/>
+              <w:insideV w:val="single" w:sz="4" w:color="D7DEE9"/>
+            </w:tcBorders>
+          </w:tcPr>
+          <w:p>
+            <w:pPr>
+              <w:spacing w:after="80"/>
+            </w:pPr>
+            <w:r>
+              <w:rPr>
+                <w:rFonts w:ascii="Calibri" w:hAnsi="Calibri"/>
+                <w:b/>
+                <w:color w:val="1737A6"/>
+                <w:sz w:val="17"/>
+              </w:rPr>
+              <w:t>02  승인형 쓰기</w:t>
+            </w:r>
+          </w:p>
+          <w:p>
+            <w:r>
+              <w:rPr>
+                <w:rFonts w:ascii="Calibri" w:hAnsi="Calibri"/>
+                <w:b w:val="0"/>
+                <w:color w:val="5D6470"/>
+                <w:sz w:val="17"/>
+              </w:rPr>
+              <w:t>INSERT·UPDATE·DELETE마다 사용자 승인</w:t>
+            </w:r>
+          </w:p>
+        </w:tc>
+        <w:tc>
+          <w:tcPr>
+            <w:tcW w:type="dxa" w:w="3139"/>
+            <w:vAlign w:val="center"/>
+            <w:shd w:fill="EEF1F6"/>
+            <w:tcBorders>
+              <w:top w:val="single" w:sz="4" w:color="D7DEE9"/>
+              <w:left w:val="single" w:sz="4" w:color="D7DEE9"/>
+              <w:bottom w:val="single" w:sz="4" w:color="D7DEE9"/>
+              <w:right w:val="single" w:sz="4" w:color="D7DEE9"/>
+              <w:insideH w:val="single" w:sz="4" w:color="D7DEE9"/>
+              <w:insideV w:val="single" w:sz="4" w:color="D7DEE9"/>
+            </w:tcBorders>
+          </w:tcPr>
+          <w:p>
+            <w:pPr>
+              <w:spacing w:after="80"/>
+            </w:pPr>
+            <w:r>
+              <w:rPr>
+                <w:rFonts w:ascii="Calibri" w:hAnsi="Calibri"/>
+                <w:b/>
+                <w:color w:val="1737A6"/>
+                <w:sz w:val="17"/>
+              </w:rPr>
+              <w:t>03  항상 허용</w:t>
+            </w:r>
+          </w:p>
+          <w:p>
+            <w:r>
+              <w:rPr>
+                <w:rFonts w:ascii="Calibri" w:hAnsi="Calibri"/>
+                <w:b w:val="0"/>
+                <w:color w:val="5D6470"/>
+                <w:sz w:val="17"/>
+              </w:rPr>
+              <w:t>선택한 DB와 프로젝트 범위에서 구조화된 쓰기</w:t>
+            </w:r>
+          </w:p>
+        </w:tc>
+        <w:tc>
+          <w:tcPr>
+            <w:tcW w:type="dxa" w:w="3139"/>
+            <w:vAlign w:val="center"/>
+            <w:shd w:fill="EEF1F6"/>
+            <w:tcBorders>
+              <w:top w:val="single" w:sz="4" w:color="D7DEE9"/>
+              <w:left w:val="single" w:sz="4" w:color="D7DEE9"/>
+              <w:bottom w:val="single" w:sz="4" w:color="D7DEE9"/>
+              <w:right w:val="single" w:sz="4" w:color="D7DEE9"/>
+              <w:insideH w:val="single" w:sz="4" w:color="D7DEE9"/>
+              <w:insideV w:val="single" w:sz="4" w:color="D7DEE9"/>
+            </w:tcBorders>
+          </w:tcPr>
+          <w:p>
+            <w:pPr>
+              <w:spacing w:after="80"/>
+            </w:pPr>
+            <w:r>
+              <w:rPr>
+                <w:rFonts w:ascii="Calibri" w:hAnsi="Calibri"/>
+                <w:b/>
+                <w:color w:val="1737A6"/>
+                <w:sz w:val="17"/>
+              </w:rPr>
+              <w:t>04  감사</w:t>
+            </w:r>
+          </w:p>
+          <w:p>
+            <w:r>
+              <w:rPr>
+                <w:rFonts w:ascii="Calibri" w:hAnsi="Calibri"/>
+                <w:b w:val="0"/>
+                <w:color w:val="5D6470"/>
+                <w:sz w:val="17"/>
+              </w:rPr>
+              <w:t>대상·정책·결과를 로컬 기록으로 확인</w:t>
+            </w:r>
+          </w:p>
+        </w:tc>
+      </w:tr>
+    </w:tbl>
+    <w:p>
+      <w:pPr>
+        <w:spacing w:after="20"/>
+      </w:pPr>
+    </w:p>
+    <w:tbl>
+      <w:tblPr>
+        <w:tblW w:type="auto" w:w="0"/>
+        <w:jc w:val="center"/>
+        <w:tblLayout w:type="fixed"/>
+        <w:tblLook w:firstColumn="1" w:firstRow="1" w:lastColumn="0" w:lastRow="0" w:noHBand="0" w:noVBand="1" w:val="04A0"/>
+      </w:tblPr>
+      <w:tblGrid>
+        <w:gridCol w:w="5016"/>
+        <w:gridCol w:w="5016"/>
+        <w:gridCol w:w="5016"/>
+      </w:tblGrid>
+      <w:tr>
+        <w:trPr>
+          <w:tblHeader w:val="true"/>
+        </w:trPr>
+        <w:tc>
+          <w:tcPr>
+            <w:tcW w:type="dxa" w:w="2448"/>
+            <w:shd w:fill="DDE4EE"/>
+            <w:tcBorders>
+              <w:top w:val="single" w:sz="6" w:color="CAD2DF"/>
+              <w:left w:val="single" w:sz="6" w:color="CAD2DF"/>
+              <w:bottom w:val="single" w:sz="6" w:color="CAD2DF"/>
+              <w:right w:val="single" w:sz="6" w:color="CAD2DF"/>
+              <w:insideH w:val="single" w:sz="6" w:color="CAD2DF"/>
+              <w:insideV w:val="single" w:sz="6" w:color="CAD2DF"/>
+            </w:tcBorders>
+          </w:tcPr>
+          <w:p>
+            <w:pPr>
+              <w:spacing w:after="0"/>
+            </w:pPr>
+            <w:r>
+              <w:rPr>
+                <w:rFonts w:ascii="Calibri" w:hAnsi="Calibri"/>
+                <w:b/>
+                <w:color w:val="1737A6"/>
+                <w:sz w:val="17"/>
+              </w:rPr>
+              <w:t>정책</w:t>
+            </w:r>
+          </w:p>
+        </w:tc>
+        <w:tc>
+          <w:tcPr>
+            <w:tcW w:type="dxa" w:w="5760"/>
+            <w:shd w:fill="DDE4EE"/>
+            <w:tcBorders>
+              <w:top w:val="single" w:sz="6" w:color="CAD2DF"/>
+              <w:left w:val="single" w:sz="6" w:color="CAD2DF"/>
+              <w:bottom w:val="single" w:sz="6" w:color="CAD2DF"/>
+              <w:right w:val="single" w:sz="6" w:color="CAD2DF"/>
+              <w:insideH w:val="single" w:sz="6" w:color="CAD2DF"/>
+              <w:insideV w:val="single" w:sz="6" w:color="CAD2DF"/>
+            </w:tcBorders>
+          </w:tcPr>
+          <w:p>
+            <w:pPr>
+              <w:spacing w:after="0"/>
+            </w:pPr>
+            <w:r>
+              <w:rPr>
+                <w:rFonts w:ascii="Calibri" w:hAnsi="Calibri"/>
+                <w:b/>
+                <w:color w:val="1737A6"/>
+                <w:sz w:val="17"/>
+              </w:rPr>
+              <w:t>허용 범위</w:t>
+            </w:r>
+          </w:p>
+        </w:tc>
+        <w:tc>
+          <w:tcPr>
+            <w:tcW w:type="dxa" w:w="4752"/>
+            <w:shd w:fill="DDE4EE"/>
+            <w:tcBorders>
+              <w:top w:val="single" w:sz="6" w:color="CAD2DF"/>
+              <w:left w:val="single" w:sz="6" w:color="CAD2DF"/>
+              <w:bottom w:val="single" w:sz="6" w:color="CAD2DF"/>
+              <w:right w:val="single" w:sz="6" w:color="CAD2DF"/>
+              <w:insideH w:val="single" w:sz="6" w:color="CAD2DF"/>
+              <w:insideV w:val="single" w:sz="6" w:color="CAD2DF"/>
+            </w:tcBorders>
+          </w:tcPr>
+          <w:p>
+            <w:pPr>
+              <w:spacing w:after="0"/>
+            </w:pPr>
+            <w:r>
+              <w:rPr>
+                <w:rFonts w:ascii="Calibri" w:hAnsi="Calibri"/>
+                <w:b/>
+                <w:color w:val="1737A6"/>
+                <w:sz w:val="17"/>
+              </w:rPr>
+              <w:t>권장 상황</w:t>
+            </w:r>
+          </w:p>
+        </w:tc>
+      </w:tr>
+      <w:tr>
+        <w:tc>
+          <w:tcPr>
+            <w:tcW w:type="dxa" w:w="2448"/>
+            <w:tcBorders>
+              <w:top w:val="single" w:sz="6" w:color="CAD2DF"/>
+              <w:left w:val="single" w:sz="6" w:color="CAD2DF"/>
+              <w:bottom w:val="single" w:sz="6" w:color="CAD2DF"/>
+              <w:right w:val="single" w:sz="6" w:color="CAD2DF"/>
+              <w:insideH w:val="single" w:sz="6" w:color="CAD2DF"/>
+              <w:insideV w:val="single" w:sz="6" w:color="CAD2DF"/>
+            </w:tcBorders>
+            <w:vAlign w:val="center"/>
+          </w:tcPr>
+          <w:p>
+            <w:pPr>
+              <w:spacing w:after="0"/>
+            </w:pPr>
+            <w:r>
+              <w:rPr>
+                <w:rFonts w:ascii="Calibri" w:hAnsi="Calibri"/>
+                <w:b w:val="0"/>
+                <w:color w:val="111216"/>
+                <w:sz w:val="16"/>
+              </w:rPr>
+              <w:t>읽기 전용</w:t>
+            </w:r>
+          </w:p>
+        </w:tc>
+        <w:tc>
+          <w:tcPr>
+            <w:tcW w:type="dxa" w:w="5760"/>
+            <w:tcBorders>
+              <w:top w:val="single" w:sz="6" w:color="CAD2DF"/>
+              <w:left w:val="single" w:sz="6" w:color="CAD2DF"/>
+              <w:bottom w:val="single" w:sz="6" w:color="CAD2DF"/>
+              <w:right w:val="single" w:sz="6" w:color="CAD2DF"/>
+              <w:insideH w:val="single" w:sz="6" w:color="CAD2DF"/>
+              <w:insideV w:val="single" w:sz="6" w:color="CAD2DF"/>
+            </w:tcBorders>
+            <w:vAlign w:val="center"/>
+          </w:tcPr>
+          <w:p>
+            <w:pPr>
+              <w:spacing w:after="0"/>
+            </w:pPr>
+            <w:r>
+              <w:rPr>
+                <w:rFonts w:ascii="Calibri" w:hAnsi="Calibri"/>
+                <w:b w:val="0"/>
+                <w:color w:val="111216"/>
+                <w:sz w:val="16"/>
+              </w:rPr>
+              <w:t>스키마와 제한된 SELECT</w:t>
+            </w:r>
+          </w:p>
+        </w:tc>
+        <w:tc>
+          <w:tcPr>
+            <w:tcW w:type="dxa" w:w="4752"/>
+            <w:tcBorders>
+              <w:top w:val="single" w:sz="6" w:color="CAD2DF"/>
+              <w:left w:val="single" w:sz="6" w:color="CAD2DF"/>
+              <w:bottom w:val="single" w:sz="6" w:color="CAD2DF"/>
+              <w:right w:val="single" w:sz="6" w:color="CAD2DF"/>
+              <w:insideH w:val="single" w:sz="6" w:color="CAD2DF"/>
+              <w:insideV w:val="single" w:sz="6" w:color="CAD2DF"/>
+            </w:tcBorders>
+            <w:vAlign w:val="center"/>
+          </w:tcPr>
+          <w:p>
+            <w:pPr>
+              <w:spacing w:after="0"/>
+            </w:pPr>
+            <w:r>
+              <w:rPr>
+                <w:rFonts w:ascii="Calibri" w:hAnsi="Calibri"/>
+                <w:b w:val="0"/>
+                <w:color w:val="111216"/>
+                <w:sz w:val="16"/>
+              </w:rPr>
+              <w:t>운영 분석, 명세서, 처음 연결한 DB</w:t>
+            </w:r>
+          </w:p>
+        </w:tc>
+      </w:tr>
+      <w:tr>
+        <w:tc>
+          <w:tcPr>
+            <w:tcW w:type="dxa" w:w="2448"/>
+            <w:tcBorders>
+              <w:top w:val="single" w:sz="6" w:color="CAD2DF"/>
+              <w:left w:val="single" w:sz="6" w:color="CAD2DF"/>
+              <w:bottom w:val="single" w:sz="6" w:color="CAD2DF"/>
+              <w:right w:val="single" w:sz="6" w:color="CAD2DF"/>
+              <w:insideH w:val="single" w:sz="6" w:color="CAD2DF"/>
+              <w:insideV w:val="single" w:sz="6" w:color="CAD2DF"/>
+            </w:tcBorders>
+            <w:vAlign w:val="center"/>
+          </w:tcPr>
+          <w:p>
+            <w:pPr>
+              <w:spacing w:after="0"/>
+            </w:pPr>
+            <w:r>
+              <w:rPr>
+                <w:rFonts w:ascii="Calibri" w:hAnsi="Calibri"/>
+                <w:b w:val="0"/>
+                <w:color w:val="111216"/>
+                <w:sz w:val="16"/>
+              </w:rPr>
+              <w:t>쓰기마다 승인</w:t>
+            </w:r>
+          </w:p>
+        </w:tc>
+        <w:tc>
+          <w:tcPr>
+            <w:tcW w:type="dxa" w:w="5760"/>
+            <w:tcBorders>
+              <w:top w:val="single" w:sz="6" w:color="CAD2DF"/>
+              <w:left w:val="single" w:sz="6" w:color="CAD2DF"/>
+              <w:bottom w:val="single" w:sz="6" w:color="CAD2DF"/>
+              <w:right w:val="single" w:sz="6" w:color="CAD2DF"/>
+              <w:insideH w:val="single" w:sz="6" w:color="CAD2DF"/>
+              <w:insideV w:val="single" w:sz="6" w:color="CAD2DF"/>
+            </w:tcBorders>
+            <w:vAlign w:val="center"/>
+          </w:tcPr>
+          <w:p>
+            <w:pPr>
+              <w:spacing w:after="0"/>
+            </w:pPr>
+            <w:r>
+              <w:rPr>
+                <w:rFonts w:ascii="Calibri" w:hAnsi="Calibri"/>
+                <w:b w:val="0"/>
+                <w:color w:val="111216"/>
+                <w:sz w:val="16"/>
+              </w:rPr>
+              <w:t>구조화된 DML을 요청별 승인</w:t>
+            </w:r>
+          </w:p>
+        </w:tc>
+        <w:tc>
+          <w:tcPr>
+            <w:tcW w:type="dxa" w:w="4752"/>
+            <w:tcBorders>
+              <w:top w:val="single" w:sz="6" w:color="CAD2DF"/>
+              <w:left w:val="single" w:sz="6" w:color="CAD2DF"/>
+              <w:bottom w:val="single" w:sz="6" w:color="CAD2DF"/>
+              <w:right w:val="single" w:sz="6" w:color="CAD2DF"/>
+              <w:insideH w:val="single" w:sz="6" w:color="CAD2DF"/>
+              <w:insideV w:val="single" w:sz="6" w:color="CAD2DF"/>
+            </w:tcBorders>
+            <w:vAlign w:val="center"/>
+          </w:tcPr>
+          <w:p>
+            <w:pPr>
+              <w:spacing w:after="0"/>
+            </w:pPr>
+            <w:r>
+              <w:rPr>
+                <w:rFonts w:ascii="Calibri" w:hAnsi="Calibri"/>
+                <w:b w:val="0"/>
+                <w:color w:val="111216"/>
+                <w:sz w:val="16"/>
+              </w:rPr>
+              <w:t>개발·테스트 데이터 수정</w:t>
+            </w:r>
+          </w:p>
+        </w:tc>
+      </w:tr>
+      <w:tr>
+        <w:tc>
+          <w:tcPr>
+            <w:tcW w:type="dxa" w:w="2448"/>
+            <w:tcBorders>
+              <w:top w:val="single" w:sz="6" w:color="CAD2DF"/>
+              <w:left w:val="single" w:sz="6" w:color="CAD2DF"/>
+              <w:bottom w:val="single" w:sz="6" w:color="CAD2DF"/>
+              <w:right w:val="single" w:sz="6" w:color="CAD2DF"/>
+              <w:insideH w:val="single" w:sz="6" w:color="CAD2DF"/>
+              <w:insideV w:val="single" w:sz="6" w:color="CAD2DF"/>
+            </w:tcBorders>
+            <w:vAlign w:val="center"/>
+          </w:tcPr>
+          <w:p>
+            <w:pPr>
+              <w:spacing w:after="0"/>
+            </w:pPr>
+            <w:r>
+              <w:rPr>
+                <w:rFonts w:ascii="Calibri" w:hAnsi="Calibri"/>
+                <w:b w:val="0"/>
+                <w:color w:val="111216"/>
+                <w:sz w:val="16"/>
+              </w:rPr>
+              <w:t>항상 쓰기 허용</w:t>
+            </w:r>
+          </w:p>
+        </w:tc>
+        <w:tc>
+          <w:tcPr>
+            <w:tcW w:type="dxa" w:w="5760"/>
+            <w:tcBorders>
+              <w:top w:val="single" w:sz="6" w:color="CAD2DF"/>
+              <w:left w:val="single" w:sz="6" w:color="CAD2DF"/>
+              <w:bottom w:val="single" w:sz="6" w:color="CAD2DF"/>
+              <w:right w:val="single" w:sz="6" w:color="CAD2DF"/>
+              <w:insideH w:val="single" w:sz="6" w:color="CAD2DF"/>
+              <w:insideV w:val="single" w:sz="6" w:color="CAD2DF"/>
+            </w:tcBorders>
+            <w:vAlign w:val="center"/>
+          </w:tcPr>
+          <w:p>
+            <w:pPr>
+              <w:spacing w:after="0"/>
+            </w:pPr>
+            <w:r>
+              <w:rPr>
+                <w:rFonts w:ascii="Calibri" w:hAnsi="Calibri"/>
+                <w:b w:val="0"/>
+                <w:color w:val="111216"/>
+                <w:sz w:val="16"/>
+              </w:rPr>
+              <w:t>동일 DB identity와 활성 프로젝트에 한해 구조화된 DML</w:t>
+            </w:r>
+          </w:p>
+        </w:tc>
+        <w:tc>
+          <w:tcPr>
+            <w:tcW w:type="dxa" w:w="4752"/>
+            <w:tcBorders>
+              <w:top w:val="single" w:sz="6" w:color="CAD2DF"/>
+              <w:left w:val="single" w:sz="6" w:color="CAD2DF"/>
+              <w:bottom w:val="single" w:sz="6" w:color="CAD2DF"/>
+              <w:right w:val="single" w:sz="6" w:color="CAD2DF"/>
+              <w:insideH w:val="single" w:sz="6" w:color="CAD2DF"/>
+              <w:insideV w:val="single" w:sz="6" w:color="CAD2DF"/>
+            </w:tcBorders>
+            <w:vAlign w:val="center"/>
+          </w:tcPr>
+          <w:p>
+            <w:pPr>
+              <w:spacing w:after="0"/>
+            </w:pPr>
+            <w:r>
+              <w:rPr>
+                <w:rFonts w:ascii="Calibri" w:hAnsi="Calibri"/>
+                <w:b w:val="0"/>
+                <w:color w:val="111216"/>
+                <w:sz w:val="16"/>
+              </w:rPr>
+              <w:t>격리된 개인 개발 DB의 반복 테스트</w:t>
+            </w:r>
+          </w:p>
+        </w:tc>
+      </w:tr>
+    </w:tbl>
+    <w:p>
+      <w:pPr>
+        <w:spacing w:after="20"/>
+      </w:pPr>
+    </w:p>
+    <w:tbl>
+      <w:tblPr>
+        <w:tblW w:type="auto" w:w="0"/>
+        <w:jc w:val="center"/>
+        <w:tblLayout w:type="fixed"/>
+        <w:tblLook w:firstColumn="1" w:firstRow="1" w:lastColumn="0" w:lastRow="0" w:noHBand="0" w:noVBand="1" w:val="04A0"/>
+      </w:tblPr>
+      <w:tblGrid>
+        <w:gridCol w:w="7524"/>
+        <w:gridCol w:w="7524"/>
+      </w:tblGrid>
+      <w:tr>
+        <w:tc>
+          <w:tcPr>
+            <w:tcW w:type="dxa" w:w="1440"/>
+            <w:tcBorders>
+              <w:top w:val="single" w:sz="8" w:color="14845B"/>
+              <w:left w:val="single" w:sz="8" w:color="14845B"/>
+              <w:bottom w:val="single" w:sz="8" w:color="14845B"/>
+              <w:right w:val="single" w:sz="8" w:color="14845B"/>
+              <w:insideH w:val="single" w:sz="8" w:color="14845B"/>
+              <w:insideV w:val="single" w:sz="8" w:color="14845B"/>
+            </w:tcBorders>
+            <w:vAlign w:val="center"/>
+            <w:shd w:fill="14845B"/>
+          </w:tcPr>
+          <w:p>
+            <w:pPr>
+              <w:jc w:val="center"/>
+            </w:pPr>
+            <w:r>
+              <w:rPr>
+                <w:rFonts w:ascii="Calibri" w:hAnsi="Calibri"/>
+                <w:b/>
+                <w:color w:val="FFFFFF"/>
+                <w:sz w:val="17"/>
+              </w:rPr>
+              <w:t>보안</w:t>
+            </w:r>
+          </w:p>
+        </w:tc>
+        <w:tc>
+          <w:tcPr>
+            <w:tcW w:type="dxa" w:w="11520"/>
+            <w:tcBorders>
+              <w:top w:val="single" w:sz="8" w:color="14845B"/>
+              <w:left w:val="single" w:sz="8" w:color="14845B"/>
+              <w:bottom w:val="single" w:sz="8" w:color="14845B"/>
+              <w:right w:val="single" w:sz="8" w:color="14845B"/>
+              <w:insideH w:val="single" w:sz="8" w:color="14845B"/>
+              <w:insideV w:val="single" w:sz="8" w:color="14845B"/>
+            </w:tcBorders>
+            <w:vAlign w:val="center"/>
+            <w:shd w:fill="F4F6FB"/>
+          </w:tcPr>
+          <w:p>
+            <w:r>
+              <w:rPr>
+                <w:rFonts w:ascii="Calibri" w:hAnsi="Calibri"/>
+                <w:b w:val="0"/>
+                <w:color w:val="111216"/>
+                <w:sz w:val="17"/>
+              </w:rPr>
+              <w:t>같은 이름으로 다른 주소의 DB를 다시 저장해도 기존 쓰기 권한은 승계되지 않습니다. DDL과 임의 SQL은 정책과 무관하게 차단되며, 운영 DB라고 자동 추정해 별도 권한을 부여하지 않습니다.</w:t>
+            </w:r>
+          </w:p>
+        </w:tc>
+      </w:tr>
+    </w:tbl>
+    <w:p>
+      <w:r>
+        <w:br w:type="page"/>
+      </w:r>
+    </w:p>
+    <w:p>
+      <w:pPr>
+        <w:spacing w:after="120"/>
+      </w:pPr>
+      <w:r>
+        <w:rPr>
+          <w:rFonts w:ascii="Calibri" w:hAnsi="Calibri"/>
+          <w:b/>
+          <w:color w:val="2E5BFF"/>
+          <w:sz w:val="17"/>
+        </w:rPr>
+        <w:t>14  /  INTERFACE SPECIFICATION</w:t>
+      </w:r>
+    </w:p>
+    <w:p>
+      <w:pPr>
+        <w:spacing w:after="160"/>
+      </w:pPr>
+      <w:r>
+        <w:rPr>
+          <w:rFonts w:ascii="Calibri" w:hAnsi="Calibri"/>
+          <w:b/>
+          <w:color w:val="1737A6"/>
+          <w:sz w:val="42"/>
+        </w:rPr>
+        <w:t>코드가 있어도, 없어도 인터페이스 명세를 만듭니다</w:t>
+      </w:r>
+    </w:p>
+    <w:p>
+      <w:pPr>
+        <w:spacing w:after="200"/>
+      </w:pPr>
+      <w:r>
+        <w:rPr>
+          <w:rFonts w:ascii="Calibri" w:hAnsi="Calibri"/>
+          <w:b w:val="0"/>
+          <w:color w:val="5D6470"/>
+          <w:sz w:val="21"/>
+        </w:rPr>
+        <w:t>두 흐름은 입력 근거가 다릅니다. 코드 기반 흐름은 실제 소스를 먼저 검증하고, 신규 설계 흐름은 최소 필드만 받은 뒤 비어 있는 요청·응답을 AI 초안으로 보완합니다.</w:t>
+      </w:r>
+    </w:p>
+    <w:tbl>
+      <w:tblPr>
+        <w:tblW w:type="auto" w:w="0"/>
+        <w:jc w:val="center"/>
+        <w:tblLayout w:type="fixed"/>
+        <w:tblLook w:firstColumn="1" w:firstRow="1" w:lastColumn="0" w:lastRow="0" w:noHBand="0" w:noVBand="1" w:val="04A0"/>
+      </w:tblPr>
+      <w:tblGrid>
+        <w:gridCol w:w="3762"/>
+        <w:gridCol w:w="3762"/>
+        <w:gridCol w:w="3762"/>
+        <w:gridCol w:w="3762"/>
+      </w:tblGrid>
+      <w:tr>
+        <w:trPr>
+          <w:tblHeader w:val="true"/>
+        </w:trPr>
+        <w:tc>
+          <w:tcPr>
+            <w:tcW w:type="dxa" w:w="1872"/>
+            <w:shd w:fill="DDE4EE"/>
+            <w:tcBorders>
+              <w:top w:val="single" w:sz="6" w:color="CAD2DF"/>
+              <w:left w:val="single" w:sz="6" w:color="CAD2DF"/>
+              <w:bottom w:val="single" w:sz="6" w:color="CAD2DF"/>
+              <w:right w:val="single" w:sz="6" w:color="CAD2DF"/>
+              <w:insideH w:val="single" w:sz="6" w:color="CAD2DF"/>
+              <w:insideV w:val="single" w:sz="6" w:color="CAD2DF"/>
+            </w:tcBorders>
+          </w:tcPr>
+          <w:p>
+            <w:pPr>
+              <w:spacing w:after="0"/>
+            </w:pPr>
+            <w:r>
+              <w:rPr>
+                <w:rFonts w:ascii="Calibri" w:hAnsi="Calibri"/>
+                <w:b/>
+                <w:color w:val="1737A6"/>
+                <w:sz w:val="17"/>
+              </w:rPr>
+              <w:t>구분</w:t>
+            </w:r>
+          </w:p>
+        </w:tc>
+        <w:tc>
+          <w:tcPr>
+            <w:tcW w:type="dxa" w:w="3600"/>
+            <w:shd w:fill="DDE4EE"/>
+            <w:tcBorders>
+              <w:top w:val="single" w:sz="6" w:color="CAD2DF"/>
+              <w:left w:val="single" w:sz="6" w:color="CAD2DF"/>
+              <w:bottom w:val="single" w:sz="6" w:color="CAD2DF"/>
+              <w:right w:val="single" w:sz="6" w:color="CAD2DF"/>
+              <w:insideH w:val="single" w:sz="6" w:color="CAD2DF"/>
+              <w:insideV w:val="single" w:sz="6" w:color="CAD2DF"/>
+            </w:tcBorders>
+          </w:tcPr>
+          <w:p>
+            <w:pPr>
+              <w:spacing w:after="0"/>
+            </w:pPr>
+            <w:r>
+              <w:rPr>
+                <w:rFonts w:ascii="Calibri" w:hAnsi="Calibri"/>
+                <w:b/>
+                <w:color w:val="1737A6"/>
+                <w:sz w:val="17"/>
+              </w:rPr>
+              <w:t>필수 입력</w:t>
+            </w:r>
+          </w:p>
+        </w:tc>
+        <w:tc>
+          <w:tcPr>
+            <w:tcW w:type="dxa" w:w="4896"/>
+            <w:shd w:fill="DDE4EE"/>
+            <w:tcBorders>
+              <w:top w:val="single" w:sz="6" w:color="CAD2DF"/>
+              <w:left w:val="single" w:sz="6" w:color="CAD2DF"/>
+              <w:bottom w:val="single" w:sz="6" w:color="CAD2DF"/>
+              <w:right w:val="single" w:sz="6" w:color="CAD2DF"/>
+              <w:insideH w:val="single" w:sz="6" w:color="CAD2DF"/>
+              <w:insideV w:val="single" w:sz="6" w:color="CAD2DF"/>
+            </w:tcBorders>
+          </w:tcPr>
+          <w:p>
+            <w:pPr>
+              <w:spacing w:after="0"/>
+            </w:pPr>
+            <w:r>
+              <w:rPr>
+                <w:rFonts w:ascii="Calibri" w:hAnsi="Calibri"/>
+                <w:b/>
+                <w:color w:val="1737A6"/>
+                <w:sz w:val="17"/>
+              </w:rPr>
+              <w:t>결정적 흐름</w:t>
+            </w:r>
+          </w:p>
+        </w:tc>
+        <w:tc>
+          <w:tcPr>
+            <w:tcW w:type="dxa" w:w="2592"/>
+            <w:shd w:fill="DDE4EE"/>
+            <w:tcBorders>
+              <w:top w:val="single" w:sz="6" w:color="CAD2DF"/>
+              <w:left w:val="single" w:sz="6" w:color="CAD2DF"/>
+              <w:bottom w:val="single" w:sz="6" w:color="CAD2DF"/>
+              <w:right w:val="single" w:sz="6" w:color="CAD2DF"/>
+              <w:insideH w:val="single" w:sz="6" w:color="CAD2DF"/>
+              <w:insideV w:val="single" w:sz="6" w:color="CAD2DF"/>
+            </w:tcBorders>
+          </w:tcPr>
+          <w:p>
+            <w:pPr>
+              <w:spacing w:after="0"/>
+            </w:pPr>
+            <w:r>
+              <w:rPr>
+                <w:rFonts w:ascii="Calibri" w:hAnsi="Calibri"/>
+                <w:b/>
+                <w:color w:val="1737A6"/>
+                <w:sz w:val="17"/>
+              </w:rPr>
+              <w:t>결과</w:t>
+            </w:r>
+          </w:p>
+        </w:tc>
+      </w:tr>
+      <w:tr>
+        <w:tc>
+          <w:tcPr>
+            <w:tcW w:type="dxa" w:w="1872"/>
+            <w:tcBorders>
+              <w:top w:val="single" w:sz="6" w:color="CAD2DF"/>
+              <w:left w:val="single" w:sz="6" w:color="CAD2DF"/>
+              <w:bottom w:val="single" w:sz="6" w:color="CAD2DF"/>
+              <w:right w:val="single" w:sz="6" w:color="CAD2DF"/>
+              <w:insideH w:val="single" w:sz="6" w:color="CAD2DF"/>
+              <w:insideV w:val="single" w:sz="6" w:color="CAD2DF"/>
+            </w:tcBorders>
+            <w:vAlign w:val="center"/>
+          </w:tcPr>
+          <w:p>
+            <w:pPr>
+              <w:spacing w:after="0"/>
+            </w:pPr>
+            <w:r>
+              <w:rPr>
+                <w:rFonts w:ascii="Calibri" w:hAnsi="Calibri"/>
+                <w:b w:val="0"/>
+                <w:color w:val="111216"/>
+                <w:sz w:val="16"/>
+              </w:rPr>
+              <w:t>코드 기반</w:t>
+            </w:r>
+          </w:p>
+        </w:tc>
+        <w:tc>
+          <w:tcPr>
+            <w:tcW w:type="dxa" w:w="3600"/>
+            <w:tcBorders>
+              <w:top w:val="single" w:sz="6" w:color="CAD2DF"/>
+              <w:left w:val="single" w:sz="6" w:color="CAD2DF"/>
+              <w:bottom w:val="single" w:sz="6" w:color="CAD2DF"/>
+              <w:right w:val="single" w:sz="6" w:color="CAD2DF"/>
+              <w:insideH w:val="single" w:sz="6" w:color="CAD2DF"/>
+              <w:insideV w:val="single" w:sz="6" w:color="CAD2DF"/>
+            </w:tcBorders>
+            <w:vAlign w:val="center"/>
+          </w:tcPr>
+          <w:p>
+            <w:pPr>
+              <w:spacing w:after="0"/>
+            </w:pPr>
+            <w:r>
+              <w:rPr>
+                <w:rFonts w:ascii="Calibri" w:hAnsi="Calibri"/>
+                <w:b w:val="0"/>
+                <w:color w:val="111216"/>
+                <w:sz w:val="16"/>
+              </w:rPr>
+              <w:t>분석 가능한 코드베이스 폴더</w:t>
+            </w:r>
+          </w:p>
+        </w:tc>
+        <w:tc>
+          <w:tcPr>
+            <w:tcW w:type="dxa" w:w="4896"/>
+            <w:tcBorders>
+              <w:top w:val="single" w:sz="6" w:color="CAD2DF"/>
+              <w:left w:val="single" w:sz="6" w:color="CAD2DF"/>
+              <w:bottom w:val="single" w:sz="6" w:color="CAD2DF"/>
+              <w:right w:val="single" w:sz="6" w:color="CAD2DF"/>
+              <w:insideH w:val="single" w:sz="6" w:color="CAD2DF"/>
+              <w:insideV w:val="single" w:sz="6" w:color="CAD2DF"/>
+            </w:tcBorders>
+            <w:vAlign w:val="center"/>
+          </w:tcPr>
+          <w:p>
+            <w:pPr>
+              <w:spacing w:after="0"/>
+            </w:pPr>
+            <w:r>
+              <w:rPr>
+                <w:rFonts w:ascii="Calibri" w:hAnsi="Calibri"/>
+                <w:b w:val="0"/>
+                <w:color w:val="111216"/>
+                <w:sz w:val="16"/>
+              </w:rPr>
+              <w:t>폴더 검증 → 옵션 → 코드 스캔 → JSON</w:t>
+            </w:r>
+          </w:p>
+        </w:tc>
+        <w:tc>
+          <w:tcPr>
+            <w:tcW w:type="dxa" w:w="2592"/>
+            <w:tcBorders>
+              <w:top w:val="single" w:sz="6" w:color="CAD2DF"/>
+              <w:left w:val="single" w:sz="6" w:color="CAD2DF"/>
+              <w:bottom w:val="single" w:sz="6" w:color="CAD2DF"/>
+              <w:right w:val="single" w:sz="6" w:color="CAD2DF"/>
+              <w:insideH w:val="single" w:sz="6" w:color="CAD2DF"/>
+              <w:insideV w:val="single" w:sz="6" w:color="CAD2DF"/>
+            </w:tcBorders>
+            <w:vAlign w:val="center"/>
+          </w:tcPr>
+          <w:p>
+            <w:pPr>
+              <w:spacing w:after="0"/>
+            </w:pPr>
+            <w:r>
+              <w:rPr>
+                <w:rFonts w:ascii="Calibri" w:hAnsi="Calibri"/>
+                <w:b w:val="0"/>
+                <w:color w:val="111216"/>
+                <w:sz w:val="16"/>
+              </w:rPr>
+              <w:t>XLSX 미리보기·export</w:t>
+            </w:r>
+          </w:p>
+        </w:tc>
+      </w:tr>
+      <w:tr>
+        <w:tc>
+          <w:tcPr>
+            <w:tcW w:type="dxa" w:w="1872"/>
+            <w:tcBorders>
+              <w:top w:val="single" w:sz="6" w:color="CAD2DF"/>
+              <w:left w:val="single" w:sz="6" w:color="CAD2DF"/>
+              <w:bottom w:val="single" w:sz="6" w:color="CAD2DF"/>
+              <w:right w:val="single" w:sz="6" w:color="CAD2DF"/>
+              <w:insideH w:val="single" w:sz="6" w:color="CAD2DF"/>
+              <w:insideV w:val="single" w:sz="6" w:color="CAD2DF"/>
+            </w:tcBorders>
+            <w:vAlign w:val="center"/>
+          </w:tcPr>
+          <w:p>
+            <w:pPr>
+              <w:spacing w:after="0"/>
+            </w:pPr>
+            <w:r>
+              <w:rPr>
+                <w:rFonts w:ascii="Calibri" w:hAnsi="Calibri"/>
+                <w:b w:val="0"/>
+                <w:color w:val="111216"/>
+                <w:sz w:val="16"/>
+              </w:rPr>
+              <w:t>신규 설계</w:t>
+            </w:r>
+          </w:p>
+        </w:tc>
+        <w:tc>
+          <w:tcPr>
+            <w:tcW w:type="dxa" w:w="3600"/>
+            <w:tcBorders>
+              <w:top w:val="single" w:sz="6" w:color="CAD2DF"/>
+              <w:left w:val="single" w:sz="6" w:color="CAD2DF"/>
+              <w:bottom w:val="single" w:sz="6" w:color="CAD2DF"/>
+              <w:right w:val="single" w:sz="6" w:color="CAD2DF"/>
+              <w:insideH w:val="single" w:sz="6" w:color="CAD2DF"/>
+              <w:insideV w:val="single" w:sz="6" w:color="CAD2DF"/>
+            </w:tcBorders>
+            <w:vAlign w:val="center"/>
+          </w:tcPr>
+          <w:p>
+            <w:pPr>
+              <w:spacing w:after="0"/>
+            </w:pPr>
+            <w:r>
+              <w:rPr>
+                <w:rFonts w:ascii="Calibri" w:hAnsi="Calibri"/>
+                <w:b w:val="0"/>
+                <w:color w:val="111216"/>
+                <w:sz w:val="16"/>
+              </w:rPr>
+              <w:t>Method·Path·Interface ID</w:t>
+            </w:r>
+          </w:p>
+        </w:tc>
+        <w:tc>
+          <w:tcPr>
+            <w:tcW w:type="dxa" w:w="4896"/>
+            <w:tcBorders>
+              <w:top w:val="single" w:sz="6" w:color="CAD2DF"/>
+              <w:left w:val="single" w:sz="6" w:color="CAD2DF"/>
+              <w:bottom w:val="single" w:sz="6" w:color="CAD2DF"/>
+              <w:right w:val="single" w:sz="6" w:color="CAD2DF"/>
+              <w:insideH w:val="single" w:sz="6" w:color="CAD2DF"/>
+              <w:insideV w:val="single" w:sz="6" w:color="CAD2DF"/>
+            </w:tcBorders>
+            <w:vAlign w:val="center"/>
+          </w:tcPr>
+          <w:p>
+            <w:pPr>
+              <w:spacing w:after="0"/>
+            </w:pPr>
+            <w:r>
+              <w:rPr>
+                <w:rFonts w:ascii="Calibri" w:hAnsi="Calibri"/>
+                <w:b w:val="0"/>
+                <w:color w:val="111216"/>
+                <w:sz w:val="16"/>
+              </w:rPr>
+              <w:t>인증·필드·크기 → AI 초안 → 사용자 검토</w:t>
+            </w:r>
+          </w:p>
+        </w:tc>
+        <w:tc>
+          <w:tcPr>
+            <w:tcW w:type="dxa" w:w="2592"/>
+            <w:tcBorders>
+              <w:top w:val="single" w:sz="6" w:color="CAD2DF"/>
+              <w:left w:val="single" w:sz="6" w:color="CAD2DF"/>
+              <w:bottom w:val="single" w:sz="6" w:color="CAD2DF"/>
+              <w:right w:val="single" w:sz="6" w:color="CAD2DF"/>
+              <w:insideH w:val="single" w:sz="6" w:color="CAD2DF"/>
+              <w:insideV w:val="single" w:sz="6" w:color="CAD2DF"/>
+            </w:tcBorders>
+            <w:vAlign w:val="center"/>
+          </w:tcPr>
+          <w:p>
+            <w:pPr>
+              <w:spacing w:after="0"/>
+            </w:pPr>
+            <w:r>
+              <w:rPr>
+                <w:rFonts w:ascii="Calibri" w:hAnsi="Calibri"/>
+                <w:b w:val="0"/>
+                <w:color w:val="111216"/>
+                <w:sz w:val="16"/>
+              </w:rPr>
+              <w:t>기본/사내 템플릿 XLSX</w:t>
+            </w:r>
+          </w:p>
+        </w:tc>
+      </w:tr>
+      <w:tr>
+        <w:tc>
+          <w:tcPr>
+            <w:tcW w:type="dxa" w:w="1872"/>
+            <w:tcBorders>
+              <w:top w:val="single" w:sz="6" w:color="CAD2DF"/>
+              <w:left w:val="single" w:sz="6" w:color="CAD2DF"/>
+              <w:bottom w:val="single" w:sz="6" w:color="CAD2DF"/>
+              <w:right w:val="single" w:sz="6" w:color="CAD2DF"/>
+              <w:insideH w:val="single" w:sz="6" w:color="CAD2DF"/>
+              <w:insideV w:val="single" w:sz="6" w:color="CAD2DF"/>
+            </w:tcBorders>
+            <w:vAlign w:val="center"/>
+          </w:tcPr>
+          <w:p>
+            <w:pPr>
+              <w:spacing w:after="0"/>
+            </w:pPr>
+            <w:r>
+              <w:rPr>
+                <w:rFonts w:ascii="Calibri" w:hAnsi="Calibri"/>
+                <w:b w:val="0"/>
+                <w:color w:val="111216"/>
+                <w:sz w:val="16"/>
+              </w:rPr>
+              <w:t>설명 질문</w:t>
+            </w:r>
+          </w:p>
+        </w:tc>
+        <w:tc>
+          <w:tcPr>
+            <w:tcW w:type="dxa" w:w="3600"/>
+            <w:tcBorders>
+              <w:top w:val="single" w:sz="6" w:color="CAD2DF"/>
+              <w:left w:val="single" w:sz="6" w:color="CAD2DF"/>
+              <w:bottom w:val="single" w:sz="6" w:color="CAD2DF"/>
+              <w:right w:val="single" w:sz="6" w:color="CAD2DF"/>
+              <w:insideH w:val="single" w:sz="6" w:color="CAD2DF"/>
+              <w:insideV w:val="single" w:sz="6" w:color="CAD2DF"/>
+            </w:tcBorders>
+            <w:vAlign w:val="center"/>
+          </w:tcPr>
+          <w:p>
+            <w:pPr>
+              <w:spacing w:after="0"/>
+            </w:pPr>
+            <w:r>
+              <w:rPr>
+                <w:rFonts w:ascii="Calibri" w:hAnsi="Calibri"/>
+                <w:b w:val="0"/>
+                <w:color w:val="111216"/>
+                <w:sz w:val="16"/>
+              </w:rPr>
+              <w:t>질문 문장</w:t>
+            </w:r>
+          </w:p>
+        </w:tc>
+        <w:tc>
+          <w:tcPr>
+            <w:tcW w:type="dxa" w:w="4896"/>
+            <w:tcBorders>
+              <w:top w:val="single" w:sz="6" w:color="CAD2DF"/>
+              <w:left w:val="single" w:sz="6" w:color="CAD2DF"/>
+              <w:bottom w:val="single" w:sz="6" w:color="CAD2DF"/>
+              <w:right w:val="single" w:sz="6" w:color="CAD2DF"/>
+              <w:insideH w:val="single" w:sz="6" w:color="CAD2DF"/>
+              <w:insideV w:val="single" w:sz="6" w:color="CAD2DF"/>
+            </w:tcBorders>
+            <w:vAlign w:val="center"/>
+          </w:tcPr>
+          <w:p>
+            <w:pPr>
+              <w:spacing w:after="0"/>
+            </w:pPr>
+            <w:r>
+              <w:rPr>
+                <w:rFonts w:ascii="Calibri" w:hAnsi="Calibri"/>
+                <w:b w:val="0"/>
+                <w:color w:val="111216"/>
+                <w:sz w:val="16"/>
+              </w:rPr>
+              <w:t>코드·DB·폼을 열지 않고 일반 설명</w:t>
+            </w:r>
+          </w:p>
+        </w:tc>
+        <w:tc>
+          <w:tcPr>
+            <w:tcW w:type="dxa" w:w="2592"/>
+            <w:tcBorders>
+              <w:top w:val="single" w:sz="6" w:color="CAD2DF"/>
+              <w:left w:val="single" w:sz="6" w:color="CAD2DF"/>
+              <w:bottom w:val="single" w:sz="6" w:color="CAD2DF"/>
+              <w:right w:val="single" w:sz="6" w:color="CAD2DF"/>
+              <w:insideH w:val="single" w:sz="6" w:color="CAD2DF"/>
+              <w:insideV w:val="single" w:sz="6" w:color="CAD2DF"/>
+            </w:tcBorders>
+            <w:vAlign w:val="center"/>
+          </w:tcPr>
+          <w:p>
+            <w:pPr>
+              <w:spacing w:after="0"/>
+            </w:pPr>
+            <w:r>
+              <w:rPr>
+                <w:rFonts w:ascii="Calibri" w:hAnsi="Calibri"/>
+                <w:b w:val="0"/>
+                <w:color w:val="111216"/>
+                <w:sz w:val="16"/>
+              </w:rPr>
+              <w:t>대화 답변</w:t>
+            </w:r>
+          </w:p>
+        </w:tc>
+      </w:tr>
+    </w:tbl>
+    <w:p>
+      <w:pPr>
+        <w:spacing w:after="20"/>
+      </w:pPr>
+    </w:p>
+    <w:tbl>
+      <w:tblPr>
+        <w:tblW w:type="auto" w:w="0"/>
+        <w:jc w:val="center"/>
+        <w:tblLayout w:type="fixed"/>
+        <w:tblLook w:firstColumn="1" w:firstRow="1" w:lastColumn="0" w:lastRow="0" w:noHBand="0" w:noVBand="1" w:val="04A0"/>
+      </w:tblPr>
+      <w:tblGrid>
+        <w:gridCol w:w="7524"/>
+        <w:gridCol w:w="7524"/>
+      </w:tblGrid>
+      <w:tr>
+        <w:tc>
+          <w:tcPr>
+            <w:tcW w:type="dxa" w:w="1440"/>
+            <w:tcBorders>
+              <w:top w:val="single" w:sz="8" w:color="2E5BFF"/>
+              <w:left w:val="single" w:sz="8" w:color="2E5BFF"/>
+              <w:bottom w:val="single" w:sz="8" w:color="2E5BFF"/>
+              <w:right w:val="single" w:sz="8" w:color="2E5BFF"/>
+              <w:insideH w:val="single" w:sz="8" w:color="2E5BFF"/>
+              <w:insideV w:val="single" w:sz="8" w:color="2E5BFF"/>
+            </w:tcBorders>
+            <w:vAlign w:val="center"/>
+            <w:shd w:fill="2E5BFF"/>
+          </w:tcPr>
+          <w:p>
+            <w:pPr>
+              <w:jc w:val="center"/>
+            </w:pPr>
+            <w:r>
+              <w:rPr>
+                <w:rFonts w:ascii="Calibri" w:hAnsi="Calibri"/>
+                <w:b/>
+                <w:color w:val="FFFFFF"/>
+                <w:sz w:val="17"/>
+              </w:rPr>
+              <w:t>요청 예시</w:t>
+            </w:r>
+          </w:p>
+        </w:tc>
+        <w:tc>
+          <w:tcPr>
+            <w:tcW w:type="dxa" w:w="11520"/>
+            <w:tcBorders>
+              <w:top w:val="single" w:sz="8" w:color="2E5BFF"/>
+              <w:left w:val="single" w:sz="8" w:color="2E5BFF"/>
+              <w:bottom w:val="single" w:sz="8" w:color="2E5BFF"/>
+              <w:right w:val="single" w:sz="8" w:color="2E5BFF"/>
+              <w:insideH w:val="single" w:sz="8" w:color="2E5BFF"/>
+              <w:insideV w:val="single" w:sz="8" w:color="2E5BFF"/>
+            </w:tcBorders>
+            <w:vAlign w:val="center"/>
+            <w:shd w:fill="F4F6FB"/>
+          </w:tcPr>
+          <w:p>
+            <w:r>
+              <w:rPr>
+                <w:rFonts w:ascii="Calibri" w:hAnsi="Calibri"/>
+                <w:b w:val="0"/>
+                <w:color w:val="111216"/>
+                <w:sz w:val="17"/>
+              </w:rPr>
+              <w:t>코드 없이 주문 생성 인터페이스 명세서를 만들어줘. POST /api/orders, IF-ORD-001, Bearer 인증. customerId와 items를 받고 orderId와 status를 응답해.</w:t>
+            </w:r>
+          </w:p>
+        </w:tc>
+      </w:tr>
+    </w:tbl>
+    <w:p>
+      <w:pPr>
+        <w:pStyle w:val="ListBullet"/>
+        <w:spacing w:after="80"/>
+      </w:pPr>
+      <w:r>
+        <w:rPr>
+          <w:rFonts w:ascii="Calibri" w:hAnsi="Calibri"/>
+          <w:b w:val="0"/>
+          <w:color w:val="111216"/>
+          <w:sz w:val="18"/>
+        </w:rPr>
+        <w:t>요청·응답 필드는 비워 둘 수 있습니다. 연결한 용어사전·템플릿·참고 문서를 우선 근거로 쓰고, 없으면 합리적 초안을 제안합니다.</w:t>
+      </w:r>
+    </w:p>
+    <w:p>
+      <w:pPr>
+        <w:pStyle w:val="ListBullet"/>
+        <w:spacing w:after="80"/>
+      </w:pPr>
+      <w:r>
+        <w:rPr>
+          <w:rFonts w:ascii="Calibri" w:hAnsi="Calibri"/>
+          <w:b w:val="0"/>
+          <w:color w:val="111216"/>
+          <w:sz w:val="18"/>
+        </w:rPr>
+        <w:t>최소·최대 크기는 처음 입력하거나 초안 이후 검토 단계에서 조정할 수 있습니다.</w:t>
+      </w:r>
+    </w:p>
+    <w:p>
+      <w:pPr>
+        <w:pStyle w:val="ListBullet"/>
+        <w:spacing w:after="80"/>
+      </w:pPr>
+      <w:r>
+        <w:rPr>
+          <w:rFonts w:ascii="Calibri" w:hAnsi="Calibri"/>
+          <w:b w:val="0"/>
+          <w:color w:val="111216"/>
+          <w:sz w:val="18"/>
+        </w:rPr>
+        <w:t>코드 기반 요청에서 작업 폴더가 없으면 옵션 폼·코드 스캔·빈 명세 생성을 시작하지 않습니다.</w:t>
+      </w:r>
+    </w:p>
+    <w:p>
+      <w:r>
+        <w:br w:type="page"/>
+      </w:r>
+    </w:p>
+    <w:p>
+      <w:pPr>
+        <w:spacing w:after="120"/>
+      </w:pPr>
+      <w:r>
+        <w:rPr>
+          <w:rFonts w:ascii="Calibri" w:hAnsi="Calibri"/>
+          <w:b/>
+          <w:color w:val="2E5BFF"/>
+          <w:sz w:val="17"/>
+        </w:rPr>
+        <w:t>15  /  SCREEN SPECIFICATION</w:t>
+      </w:r>
+    </w:p>
+    <w:p>
+      <w:pPr>
+        <w:spacing w:after="160"/>
+      </w:pPr>
+      <w:r>
+        <w:rPr>
+          <w:rFonts w:ascii="Calibri" w:hAnsi="Calibri"/>
+          <w:b/>
+          <w:color w:val="1737A6"/>
+          <w:sz w:val="42"/>
+        </w:rPr>
+        <w:t>실제 화면을 근거로 화면명세서를 만듭니다</w:t>
+      </w:r>
+    </w:p>
+    <w:p>
+      <w:pPr>
+        <w:spacing w:after="200"/>
+      </w:pPr>
+      <w:r>
+        <w:rPr>
+          <w:rFonts w:ascii="Calibri" w:hAnsi="Calibri"/>
+          <w:b w:val="0"/>
+          <w:color w:val="5D6470"/>
+          <w:sz w:val="21"/>
+        </w:rPr>
+        <w:t>업로드 이미지, 브라우저 캡처, 코드와 용어사전을 함께 연결할 수 있습니다. 화면마다 Description과 Check Point를 검토한 뒤 XLSX 또는 PPTX로 내보냅니다.</w:t>
+      </w:r>
+    </w:p>
+    <w:tbl>
+      <w:tblPr>
+        <w:tblW w:type="auto" w:w="0"/>
+        <w:jc w:val="center"/>
+        <w:tblLayout w:type="fixed"/>
+        <w:tblLook w:firstColumn="1" w:firstRow="1" w:lastColumn="0" w:lastRow="0" w:noHBand="0" w:noVBand="1" w:val="04A0"/>
+      </w:tblPr>
+      <w:tblGrid>
+        <w:gridCol w:w="3762"/>
+        <w:gridCol w:w="3762"/>
+        <w:gridCol w:w="3762"/>
+        <w:gridCol w:w="3762"/>
+      </w:tblGrid>
+      <w:tr>
+        <w:tc>
+          <w:tcPr>
+            <w:tcW w:type="dxa" w:w="3139"/>
+            <w:vAlign w:val="center"/>
+            <w:shd w:fill="EEF1F6"/>
+            <w:tcBorders>
+              <w:top w:val="single" w:sz="4" w:color="D7DEE9"/>
+              <w:left w:val="single" w:sz="4" w:color="D7DEE9"/>
+              <w:bottom w:val="single" w:sz="4" w:color="D7DEE9"/>
+              <w:right w:val="single" w:sz="4" w:color="D7DEE9"/>
+              <w:insideH w:val="single" w:sz="4" w:color="D7DEE9"/>
+              <w:insideV w:val="single" w:sz="4" w:color="D7DEE9"/>
+            </w:tcBorders>
+          </w:tcPr>
+          <w:p>
+            <w:pPr>
+              <w:spacing w:after="80"/>
+            </w:pPr>
+            <w:r>
+              <w:rPr>
+                <w:rFonts w:ascii="Calibri" w:hAnsi="Calibri"/>
+                <w:b/>
+                <w:color w:val="1737A6"/>
+                <w:sz w:val="17"/>
+              </w:rPr>
+              <w:t>01  수집</w:t>
+            </w:r>
+          </w:p>
+          <w:p>
+            <w:r>
+              <w:rPr>
+                <w:rFonts w:ascii="Calibri" w:hAnsi="Calibri"/>
+                <w:b w:val="0"/>
+                <w:color w:val="5D6470"/>
+                <w:sz w:val="17"/>
+              </w:rPr>
+              <w:t>화면 업로드·브라우저 캡처·DOM 표시</w:t>
+            </w:r>
+          </w:p>
+        </w:tc>
+        <w:tc>
+          <w:tcPr>
+            <w:tcW w:type="dxa" w:w="3139"/>
+            <w:vAlign w:val="center"/>
+            <w:shd w:fill="EEF1F6"/>
+            <w:tcBorders>
+              <w:top w:val="single" w:sz="4" w:color="D7DEE9"/>
+              <w:left w:val="single" w:sz="4" w:color="D7DEE9"/>
+              <w:bottom w:val="single" w:sz="4" w:color="D7DEE9"/>
+              <w:right w:val="single" w:sz="4" w:color="D7DEE9"/>
+              <w:insideH w:val="single" w:sz="4" w:color="D7DEE9"/>
+              <w:insideV w:val="single" w:sz="4" w:color="D7DEE9"/>
+            </w:tcBorders>
+          </w:tcPr>
+          <w:p>
+            <w:pPr>
+              <w:spacing w:after="80"/>
+            </w:pPr>
+            <w:r>
+              <w:rPr>
+                <w:rFonts w:ascii="Calibri" w:hAnsi="Calibri"/>
+                <w:b/>
+                <w:color w:val="1737A6"/>
+                <w:sz w:val="17"/>
+              </w:rPr>
+              <w:t>02  구조화</w:t>
+            </w:r>
+          </w:p>
+          <w:p>
+            <w:r>
+              <w:rPr>
+                <w:rFonts w:ascii="Calibri" w:hAnsi="Calibri"/>
+                <w:b w:val="0"/>
+                <w:color w:val="5D6470"/>
+                <w:sz w:val="17"/>
+              </w:rPr>
+              <w:t>화면 ID·설명·체크포인트·전환 정의</w:t>
+            </w:r>
+          </w:p>
+        </w:tc>
+        <w:tc>
+          <w:tcPr>
+            <w:tcW w:type="dxa" w:w="3139"/>
+            <w:vAlign w:val="center"/>
+            <w:shd w:fill="EEF1F6"/>
+            <w:tcBorders>
+              <w:top w:val="single" w:sz="4" w:color="D7DEE9"/>
+              <w:left w:val="single" w:sz="4" w:color="D7DEE9"/>
+              <w:bottom w:val="single" w:sz="4" w:color="D7DEE9"/>
+              <w:right w:val="single" w:sz="4" w:color="D7DEE9"/>
+              <w:insideH w:val="single" w:sz="4" w:color="D7DEE9"/>
+              <w:insideV w:val="single" w:sz="4" w:color="D7DEE9"/>
+            </w:tcBorders>
+          </w:tcPr>
+          <w:p>
+            <w:pPr>
+              <w:spacing w:after="80"/>
+            </w:pPr>
+            <w:r>
+              <w:rPr>
+                <w:rFonts w:ascii="Calibri" w:hAnsi="Calibri"/>
+                <w:b/>
+                <w:color w:val="1737A6"/>
+                <w:sz w:val="17"/>
+              </w:rPr>
+              <w:t>03  검토</w:t>
+            </w:r>
+          </w:p>
+          <w:p>
+            <w:r>
+              <w:rPr>
+                <w:rFonts w:ascii="Calibri" w:hAnsi="Calibri"/>
+                <w:b w:val="0"/>
+                <w:color w:val="5D6470"/>
+                <w:sz w:val="17"/>
+              </w:rPr>
+              <w:t>미리보기에서 표시·그리기·편집·댓글</w:t>
+            </w:r>
+          </w:p>
+        </w:tc>
+        <w:tc>
+          <w:tcPr>
+            <w:tcW w:type="dxa" w:w="3139"/>
+            <w:vAlign w:val="center"/>
+            <w:shd w:fill="EEF1F6"/>
+            <w:tcBorders>
+              <w:top w:val="single" w:sz="4" w:color="D7DEE9"/>
+              <w:left w:val="single" w:sz="4" w:color="D7DEE9"/>
+              <w:bottom w:val="single" w:sz="4" w:color="D7DEE9"/>
+              <w:right w:val="single" w:sz="4" w:color="D7DEE9"/>
+              <w:insideH w:val="single" w:sz="4" w:color="D7DEE9"/>
+              <w:insideV w:val="single" w:sz="4" w:color="D7DEE9"/>
+            </w:tcBorders>
+          </w:tcPr>
+          <w:p>
+            <w:pPr>
+              <w:spacing w:after="80"/>
+            </w:pPr>
+            <w:r>
+              <w:rPr>
+                <w:rFonts w:ascii="Calibri" w:hAnsi="Calibri"/>
+                <w:b/>
+                <w:color w:val="1737A6"/>
+                <w:sz w:val="17"/>
+              </w:rPr>
+              <w:t>04  납품</w:t>
+            </w:r>
+          </w:p>
+          <w:p>
+            <w:r>
+              <w:rPr>
+                <w:rFonts w:ascii="Calibri" w:hAnsi="Calibri"/>
+                <w:b w:val="0"/>
+                <w:color w:val="5D6470"/>
+                <w:sz w:val="17"/>
+              </w:rPr>
+              <w:t>검증 후 XLSX·PPTX export</w:t>
+            </w:r>
+          </w:p>
+        </w:tc>
+      </w:tr>
+    </w:tbl>
+    <w:p>
+      <w:pPr>
+        <w:spacing w:after="20"/>
+      </w:pPr>
+    </w:p>
+    <w:tbl>
+      <w:tblPr>
+        <w:tblW w:type="auto" w:w="0"/>
+        <w:jc w:val="center"/>
+        <w:tblLayout w:type="fixed"/>
+        <w:tblLook w:firstColumn="1" w:firstRow="1" w:lastColumn="0" w:lastRow="0" w:noHBand="0" w:noVBand="1" w:val="04A0"/>
+      </w:tblPr>
+      <w:tblGrid>
+        <w:gridCol w:w="5016"/>
+        <w:gridCol w:w="5016"/>
+        <w:gridCol w:w="5016"/>
+      </w:tblGrid>
+      <w:tr>
+        <w:trPr>
+          <w:tblHeader w:val="true"/>
+        </w:trPr>
+        <w:tc>
+          <w:tcPr>
+            <w:tcW w:type="dxa" w:w="2016"/>
+            <w:shd w:fill="DDE4EE"/>
+            <w:tcBorders>
+              <w:top w:val="single" w:sz="6" w:color="CAD2DF"/>
+              <w:left w:val="single" w:sz="6" w:color="CAD2DF"/>
+              <w:bottom w:val="single" w:sz="6" w:color="CAD2DF"/>
+              <w:right w:val="single" w:sz="6" w:color="CAD2DF"/>
+              <w:insideH w:val="single" w:sz="6" w:color="CAD2DF"/>
+              <w:insideV w:val="single" w:sz="6" w:color="CAD2DF"/>
+            </w:tcBorders>
+          </w:tcPr>
+          <w:p>
+            <w:pPr>
+              <w:spacing w:after="0"/>
+            </w:pPr>
+            <w:r>
+              <w:rPr>
+                <w:rFonts w:ascii="Calibri" w:hAnsi="Calibri"/>
+                <w:b/>
+                <w:color w:val="1737A6"/>
+                <w:sz w:val="17"/>
+              </w:rPr>
+              <w:t>기능</w:t>
+            </w:r>
+          </w:p>
+        </w:tc>
+        <w:tc>
+          <w:tcPr>
+            <w:tcW w:type="dxa" w:w="5760"/>
+            <w:shd w:fill="DDE4EE"/>
+            <w:tcBorders>
+              <w:top w:val="single" w:sz="6" w:color="CAD2DF"/>
+              <w:left w:val="single" w:sz="6" w:color="CAD2DF"/>
+              <w:bottom w:val="single" w:sz="6" w:color="CAD2DF"/>
+              <w:right w:val="single" w:sz="6" w:color="CAD2DF"/>
+              <w:insideH w:val="single" w:sz="6" w:color="CAD2DF"/>
+              <w:insideV w:val="single" w:sz="6" w:color="CAD2DF"/>
+            </w:tcBorders>
+          </w:tcPr>
+          <w:p>
+            <w:pPr>
+              <w:spacing w:after="0"/>
+            </w:pPr>
+            <w:r>
+              <w:rPr>
+                <w:rFonts w:ascii="Calibri" w:hAnsi="Calibri"/>
+                <w:b/>
+                <w:color w:val="1737A6"/>
+                <w:sz w:val="17"/>
+              </w:rPr>
+              <w:t>언제 쓰나</w:t>
+            </w:r>
+          </w:p>
+        </w:tc>
+        <w:tc>
+          <w:tcPr>
+            <w:tcW w:type="dxa" w:w="5184"/>
+            <w:shd w:fill="DDE4EE"/>
+            <w:tcBorders>
+              <w:top w:val="single" w:sz="6" w:color="CAD2DF"/>
+              <w:left w:val="single" w:sz="6" w:color="CAD2DF"/>
+              <w:bottom w:val="single" w:sz="6" w:color="CAD2DF"/>
+              <w:right w:val="single" w:sz="6" w:color="CAD2DF"/>
+              <w:insideH w:val="single" w:sz="6" w:color="CAD2DF"/>
+              <w:insideV w:val="single" w:sz="6" w:color="CAD2DF"/>
+            </w:tcBorders>
+          </w:tcPr>
+          <w:p>
+            <w:pPr>
+              <w:spacing w:after="0"/>
+            </w:pPr>
+            <w:r>
+              <w:rPr>
+                <w:rFonts w:ascii="Calibri" w:hAnsi="Calibri"/>
+                <w:b/>
+                <w:color w:val="1737A6"/>
+                <w:sz w:val="17"/>
+              </w:rPr>
+              <w:t>결과</w:t>
+            </w:r>
+          </w:p>
+        </w:tc>
+      </w:tr>
+      <w:tr>
+        <w:tc>
+          <w:tcPr>
+            <w:tcW w:type="dxa" w:w="2016"/>
+            <w:tcBorders>
+              <w:top w:val="single" w:sz="6" w:color="CAD2DF"/>
+              <w:left w:val="single" w:sz="6" w:color="CAD2DF"/>
+              <w:bottom w:val="single" w:sz="6" w:color="CAD2DF"/>
+              <w:right w:val="single" w:sz="6" w:color="CAD2DF"/>
+              <w:insideH w:val="single" w:sz="6" w:color="CAD2DF"/>
+              <w:insideV w:val="single" w:sz="6" w:color="CAD2DF"/>
+            </w:tcBorders>
+            <w:vAlign w:val="center"/>
+          </w:tcPr>
+          <w:p>
+            <w:pPr>
+              <w:spacing w:after="0"/>
+            </w:pPr>
+            <w:r>
+              <w:rPr>
+                <w:rFonts w:ascii="Calibri" w:hAnsi="Calibri"/>
+                <w:b w:val="0"/>
+                <w:color w:val="111216"/>
+                <w:sz w:val="16"/>
+              </w:rPr>
+              <w:t>표시</w:t>
+            </w:r>
+          </w:p>
+        </w:tc>
+        <w:tc>
+          <w:tcPr>
+            <w:tcW w:type="dxa" w:w="5760"/>
+            <w:tcBorders>
+              <w:top w:val="single" w:sz="6" w:color="CAD2DF"/>
+              <w:left w:val="single" w:sz="6" w:color="CAD2DF"/>
+              <w:bottom w:val="single" w:sz="6" w:color="CAD2DF"/>
+              <w:right w:val="single" w:sz="6" w:color="CAD2DF"/>
+              <w:insideH w:val="single" w:sz="6" w:color="CAD2DF"/>
+              <w:insideV w:val="single" w:sz="6" w:color="CAD2DF"/>
+            </w:tcBorders>
+            <w:vAlign w:val="center"/>
+          </w:tcPr>
+          <w:p>
+            <w:pPr>
+              <w:spacing w:after="0"/>
+            </w:pPr>
+            <w:r>
+              <w:rPr>
+                <w:rFonts w:ascii="Calibri" w:hAnsi="Calibri"/>
+                <w:b w:val="0"/>
+                <w:color w:val="111216"/>
+                <w:sz w:val="16"/>
+              </w:rPr>
+              <w:t>버튼·문구처럼 DOM으로 식별 가능한 요소</w:t>
+            </w:r>
+          </w:p>
+        </w:tc>
+        <w:tc>
+          <w:tcPr>
+            <w:tcW w:type="dxa" w:w="5184"/>
+            <w:tcBorders>
+              <w:top w:val="single" w:sz="6" w:color="CAD2DF"/>
+              <w:left w:val="single" w:sz="6" w:color="CAD2DF"/>
+              <w:bottom w:val="single" w:sz="6" w:color="CAD2DF"/>
+              <w:right w:val="single" w:sz="6" w:color="CAD2DF"/>
+              <w:insideH w:val="single" w:sz="6" w:color="CAD2DF"/>
+              <w:insideV w:val="single" w:sz="6" w:color="CAD2DF"/>
+            </w:tcBorders>
+            <w:vAlign w:val="center"/>
+          </w:tcPr>
+          <w:p>
+            <w:pPr>
+              <w:spacing w:after="0"/>
+            </w:pPr>
+            <w:r>
+              <w:rPr>
+                <w:rFonts w:ascii="Calibri" w:hAnsi="Calibri"/>
+                <w:b w:val="0"/>
+                <w:color w:val="111216"/>
+                <w:sz w:val="16"/>
+              </w:rPr>
+              <w:t>선택자와 화면 위치가 수정 요청에 연결</w:t>
+            </w:r>
+          </w:p>
+        </w:tc>
+      </w:tr>
+      <w:tr>
+        <w:tc>
+          <w:tcPr>
+            <w:tcW w:type="dxa" w:w="2016"/>
+            <w:tcBorders>
+              <w:top w:val="single" w:sz="6" w:color="CAD2DF"/>
+              <w:left w:val="single" w:sz="6" w:color="CAD2DF"/>
+              <w:bottom w:val="single" w:sz="6" w:color="CAD2DF"/>
+              <w:right w:val="single" w:sz="6" w:color="CAD2DF"/>
+              <w:insideH w:val="single" w:sz="6" w:color="CAD2DF"/>
+              <w:insideV w:val="single" w:sz="6" w:color="CAD2DF"/>
+            </w:tcBorders>
+            <w:vAlign w:val="center"/>
+          </w:tcPr>
+          <w:p>
+            <w:pPr>
+              <w:spacing w:after="0"/>
+            </w:pPr>
+            <w:r>
+              <w:rPr>
+                <w:rFonts w:ascii="Calibri" w:hAnsi="Calibri"/>
+                <w:b w:val="0"/>
+                <w:color w:val="111216"/>
+                <w:sz w:val="16"/>
+              </w:rPr>
+              <w:t>화면에 그리기</w:t>
+            </w:r>
+          </w:p>
+        </w:tc>
+        <w:tc>
+          <w:tcPr>
+            <w:tcW w:type="dxa" w:w="5760"/>
+            <w:tcBorders>
+              <w:top w:val="single" w:sz="6" w:color="CAD2DF"/>
+              <w:left w:val="single" w:sz="6" w:color="CAD2DF"/>
+              <w:bottom w:val="single" w:sz="6" w:color="CAD2DF"/>
+              <w:right w:val="single" w:sz="6" w:color="CAD2DF"/>
+              <w:insideH w:val="single" w:sz="6" w:color="CAD2DF"/>
+              <w:insideV w:val="single" w:sz="6" w:color="CAD2DF"/>
+            </w:tcBorders>
+            <w:vAlign w:val="center"/>
+          </w:tcPr>
+          <w:p>
+            <w:pPr>
+              <w:spacing w:after="0"/>
+            </w:pPr>
+            <w:r>
+              <w:rPr>
+                <w:rFonts w:ascii="Calibri" w:hAnsi="Calibri"/>
+                <w:b w:val="0"/>
+                <w:color w:val="111216"/>
+                <w:sz w:val="16"/>
+              </w:rPr>
+              <w:t>레이아웃 간격·영역처럼 시각적으로 설명할 부분</w:t>
+            </w:r>
+          </w:p>
+        </w:tc>
+        <w:tc>
+          <w:tcPr>
+            <w:tcW w:type="dxa" w:w="5184"/>
+            <w:tcBorders>
+              <w:top w:val="single" w:sz="6" w:color="CAD2DF"/>
+              <w:left w:val="single" w:sz="6" w:color="CAD2DF"/>
+              <w:bottom w:val="single" w:sz="6" w:color="CAD2DF"/>
+              <w:right w:val="single" w:sz="6" w:color="CAD2DF"/>
+              <w:insideH w:val="single" w:sz="6" w:color="CAD2DF"/>
+              <w:insideV w:val="single" w:sz="6" w:color="CAD2DF"/>
+            </w:tcBorders>
+            <w:vAlign w:val="center"/>
+          </w:tcPr>
+          <w:p>
+            <w:pPr>
+              <w:spacing w:after="0"/>
+            </w:pPr>
+            <w:r>
+              <w:rPr>
+                <w:rFonts w:ascii="Calibri" w:hAnsi="Calibri"/>
+                <w:b w:val="0"/>
+                <w:color w:val="111216"/>
+                <w:sz w:val="16"/>
+              </w:rPr>
+              <w:t>영역 캡처와 메모가 하나의 검토 항목으로 저장</w:t>
+            </w:r>
+          </w:p>
+        </w:tc>
+      </w:tr>
+      <w:tr>
+        <w:tc>
+          <w:tcPr>
+            <w:tcW w:type="dxa" w:w="2016"/>
+            <w:tcBorders>
+              <w:top w:val="single" w:sz="6" w:color="CAD2DF"/>
+              <w:left w:val="single" w:sz="6" w:color="CAD2DF"/>
+              <w:bottom w:val="single" w:sz="6" w:color="CAD2DF"/>
+              <w:right w:val="single" w:sz="6" w:color="CAD2DF"/>
+              <w:insideH w:val="single" w:sz="6" w:color="CAD2DF"/>
+              <w:insideV w:val="single" w:sz="6" w:color="CAD2DF"/>
+            </w:tcBorders>
+            <w:vAlign w:val="center"/>
+          </w:tcPr>
+          <w:p>
+            <w:pPr>
+              <w:spacing w:after="0"/>
+            </w:pPr>
+            <w:r>
+              <w:rPr>
+                <w:rFonts w:ascii="Calibri" w:hAnsi="Calibri"/>
+                <w:b w:val="0"/>
+                <w:color w:val="111216"/>
+                <w:sz w:val="16"/>
+              </w:rPr>
+              <w:t>검사</w:t>
+            </w:r>
+          </w:p>
+        </w:tc>
+        <w:tc>
+          <w:tcPr>
+            <w:tcW w:type="dxa" w:w="5760"/>
+            <w:tcBorders>
+              <w:top w:val="single" w:sz="6" w:color="CAD2DF"/>
+              <w:left w:val="single" w:sz="6" w:color="CAD2DF"/>
+              <w:bottom w:val="single" w:sz="6" w:color="CAD2DF"/>
+              <w:right w:val="single" w:sz="6" w:color="CAD2DF"/>
+              <w:insideH w:val="single" w:sz="6" w:color="CAD2DF"/>
+              <w:insideV w:val="single" w:sz="6" w:color="CAD2DF"/>
+            </w:tcBorders>
+            <w:vAlign w:val="center"/>
+          </w:tcPr>
+          <w:p>
+            <w:pPr>
+              <w:spacing w:after="0"/>
+            </w:pPr>
+            <w:r>
+              <w:rPr>
+                <w:rFonts w:ascii="Calibri" w:hAnsi="Calibri"/>
+                <w:b w:val="0"/>
+                <w:color w:val="111216"/>
+                <w:sz w:val="16"/>
+              </w:rPr>
+              <w:t>구조·스타일·접근성 근거가 필요한 경우</w:t>
+            </w:r>
+          </w:p>
+        </w:tc>
+        <w:tc>
+          <w:tcPr>
+            <w:tcW w:type="dxa" w:w="5184"/>
+            <w:tcBorders>
+              <w:top w:val="single" w:sz="6" w:color="CAD2DF"/>
+              <w:left w:val="single" w:sz="6" w:color="CAD2DF"/>
+              <w:bottom w:val="single" w:sz="6" w:color="CAD2DF"/>
+              <w:right w:val="single" w:sz="6" w:color="CAD2DF"/>
+              <w:insideH w:val="single" w:sz="6" w:color="CAD2DF"/>
+              <w:insideV w:val="single" w:sz="6" w:color="CAD2DF"/>
+            </w:tcBorders>
+            <w:vAlign w:val="center"/>
+          </w:tcPr>
+          <w:p>
+            <w:pPr>
+              <w:spacing w:after="0"/>
+            </w:pPr>
+            <w:r>
+              <w:rPr>
+                <w:rFonts w:ascii="Calibri" w:hAnsi="Calibri"/>
+                <w:b w:val="0"/>
+                <w:color w:val="111216"/>
+                <w:sz w:val="16"/>
+              </w:rPr>
+              <w:t>DOM 정보와 현재 스타일을 함께 전달</w:t>
+            </w:r>
+          </w:p>
+        </w:tc>
+      </w:tr>
+      <w:tr>
+        <w:tc>
+          <w:tcPr>
+            <w:tcW w:type="dxa" w:w="2016"/>
+            <w:tcBorders>
+              <w:top w:val="single" w:sz="6" w:color="CAD2DF"/>
+              <w:left w:val="single" w:sz="6" w:color="CAD2DF"/>
+              <w:bottom w:val="single" w:sz="6" w:color="CAD2DF"/>
+              <w:right w:val="single" w:sz="6" w:color="CAD2DF"/>
+              <w:insideH w:val="single" w:sz="6" w:color="CAD2DF"/>
+              <w:insideV w:val="single" w:sz="6" w:color="CAD2DF"/>
+            </w:tcBorders>
+            <w:vAlign w:val="center"/>
+          </w:tcPr>
+          <w:p>
+            <w:pPr>
+              <w:spacing w:after="0"/>
+            </w:pPr>
+            <w:r>
+              <w:rPr>
+                <w:rFonts w:ascii="Calibri" w:hAnsi="Calibri"/>
+                <w:b w:val="0"/>
+                <w:color w:val="111216"/>
+                <w:sz w:val="16"/>
+              </w:rPr>
+              <w:t>조정</w:t>
+            </w:r>
+          </w:p>
+        </w:tc>
+        <w:tc>
+          <w:tcPr>
+            <w:tcW w:type="dxa" w:w="5760"/>
+            <w:tcBorders>
+              <w:top w:val="single" w:sz="6" w:color="CAD2DF"/>
+              <w:left w:val="single" w:sz="6" w:color="CAD2DF"/>
+              <w:bottom w:val="single" w:sz="6" w:color="CAD2DF"/>
+              <w:right w:val="single" w:sz="6" w:color="CAD2DF"/>
+              <w:insideH w:val="single" w:sz="6" w:color="CAD2DF"/>
+              <w:insideV w:val="single" w:sz="6" w:color="CAD2DF"/>
+            </w:tcBorders>
+            <w:vAlign w:val="center"/>
+          </w:tcPr>
+          <w:p>
+            <w:pPr>
+              <w:spacing w:after="0"/>
+            </w:pPr>
+            <w:r>
+              <w:rPr>
+                <w:rFonts w:ascii="Calibri" w:hAnsi="Calibri"/>
+                <w:b w:val="0"/>
+                <w:color w:val="111216"/>
+                <w:sz w:val="16"/>
+              </w:rPr>
+              <w:t>32px→28px처럼 구체적인 변경안을 남길 때</w:t>
+            </w:r>
+          </w:p>
+        </w:tc>
+        <w:tc>
+          <w:tcPr>
+            <w:tcW w:type="dxa" w:w="5184"/>
+            <w:tcBorders>
+              <w:top w:val="single" w:sz="6" w:color="CAD2DF"/>
+              <w:left w:val="single" w:sz="6" w:color="CAD2DF"/>
+              <w:bottom w:val="single" w:sz="6" w:color="CAD2DF"/>
+              <w:right w:val="single" w:sz="6" w:color="CAD2DF"/>
+              <w:insideH w:val="single" w:sz="6" w:color="CAD2DF"/>
+              <w:insideV w:val="single" w:sz="6" w:color="CAD2DF"/>
+            </w:tcBorders>
+            <w:vAlign w:val="center"/>
+          </w:tcPr>
+          <w:p>
+            <w:pPr>
+              <w:spacing w:after="0"/>
+            </w:pPr>
+            <w:r>
+              <w:rPr>
+                <w:rFonts w:ascii="Calibri" w:hAnsi="Calibri"/>
+                <w:b w:val="0"/>
+                <w:color w:val="111216"/>
+                <w:sz w:val="16"/>
+              </w:rPr>
+              <w:t>다른 항목과 순번을 공유해 일괄 요청</w:t>
+            </w:r>
+          </w:p>
+        </w:tc>
+      </w:tr>
+    </w:tbl>
+    <w:p>
+      <w:pPr>
+        <w:spacing w:after="20"/>
+      </w:pPr>
+    </w:p>
+    <w:tbl>
+      <w:tblPr>
+        <w:tblW w:type="auto" w:w="0"/>
+        <w:jc w:val="center"/>
+        <w:tblLayout w:type="fixed"/>
+        <w:tblLook w:firstColumn="1" w:firstRow="1" w:lastColumn="0" w:lastRow="0" w:noHBand="0" w:noVBand="1" w:val="04A0"/>
+      </w:tblPr>
+      <w:tblGrid>
+        <w:gridCol w:w="7524"/>
+        <w:gridCol w:w="7524"/>
+      </w:tblGrid>
+      <w:tr>
+        <w:tc>
+          <w:tcPr>
+            <w:tcW w:type="dxa" w:w="1440"/>
+            <w:tcBorders>
+              <w:top w:val="single" w:sz="8" w:color="14845B"/>
+              <w:left w:val="single" w:sz="8" w:color="14845B"/>
+              <w:bottom w:val="single" w:sz="8" w:color="14845B"/>
+              <w:right w:val="single" w:sz="8" w:color="14845B"/>
+              <w:insideH w:val="single" w:sz="8" w:color="14845B"/>
+              <w:insideV w:val="single" w:sz="8" w:color="14845B"/>
+            </w:tcBorders>
+            <w:vAlign w:val="center"/>
+            <w:shd w:fill="14845B"/>
+          </w:tcPr>
+          <w:p>
+            <w:pPr>
+              <w:jc w:val="center"/>
+            </w:pPr>
+            <w:r>
+              <w:rPr>
+                <w:rFonts w:ascii="Calibri" w:hAnsi="Calibri"/>
+                <w:b/>
+                <w:color w:val="FFFFFF"/>
+                <w:sz w:val="17"/>
+              </w:rPr>
+              <w:t>파일 안전</w:t>
+            </w:r>
+          </w:p>
+        </w:tc>
+        <w:tc>
+          <w:tcPr>
+            <w:tcW w:type="dxa" w:w="11520"/>
+            <w:tcBorders>
+              <w:top w:val="single" w:sz="8" w:color="14845B"/>
+              <w:left w:val="single" w:sz="8" w:color="14845B"/>
+              <w:bottom w:val="single" w:sz="8" w:color="14845B"/>
+              <w:right w:val="single" w:sz="8" w:color="14845B"/>
+              <w:insideH w:val="single" w:sz="8" w:color="14845B"/>
+              <w:insideV w:val="single" w:sz="8" w:color="14845B"/>
+            </w:tcBorders>
+            <w:vAlign w:val="center"/>
+            <w:shd w:fill="F4F6FB"/>
+          </w:tcPr>
+          <w:p>
+            <w:r>
+              <w:rPr>
+                <w:rFonts w:ascii="Calibri" w:hAnsi="Calibri"/>
+                <w:b w:val="0"/>
+                <w:color w:val="111216"/>
+                <w:sz w:val="17"/>
+              </w:rPr>
+              <w:t>화면 이미지 참조는 프로젝트 안의 일반 PNG·JPEG·WebP만 허용하며, 실제 MIME과 확장자를 확인하고 20MiB를 넘는 파일과 심볼릭 링크 경로 탈출을 차단합니다.</w:t>
+            </w:r>
+          </w:p>
+        </w:tc>
+      </w:tr>
+    </w:tbl>
+    <w:p>
+      <w:r>
+        <w:br w:type="page"/>
+      </w:r>
+    </w:p>
+    <w:p>
+      <w:pPr>
+        <w:spacing w:after="120"/>
+      </w:pPr>
+      <w:r>
+        <w:rPr>
+          <w:rFonts w:ascii="Calibri" w:hAnsi="Calibri"/>
+          <w:b/>
+          <w:color w:val="2E5BFF"/>
+          <w:sz w:val="17"/>
+        </w:rPr>
+        <w:t>16  /  USAGE &amp; RUNTIME</w:t>
+      </w:r>
+    </w:p>
+    <w:p>
+      <w:pPr>
+        <w:spacing w:after="160"/>
+      </w:pPr>
+      <w:r>
+        <w:rPr>
+          <w:rFonts w:ascii="Calibri" w:hAnsi="Calibri"/>
+          <w:b/>
+          <w:color w:val="1737A6"/>
+          <w:sz w:val="42"/>
+        </w:rPr>
+        <w:t>토큰은 마지막 문장 길이가 아니라 전체 모델 문맥입니다</w:t>
+      </w:r>
+    </w:p>
+    <w:p>
+      <w:pPr>
+        <w:spacing w:after="200"/>
+      </w:pPr>
+      <w:r>
+        <w:rPr>
+          <w:rFonts w:ascii="Calibri" w:hAnsi="Calibri"/>
+          <w:b w:val="0"/>
+          <w:color w:val="5D6470"/>
+          <w:sz w:val="21"/>
+        </w:rPr>
+        <w:t>사용량 패널의 입력은 CLI 또는 모델 공급자가 이번 응답에 보고한 시스템 지침·도구 정의·대화 기록·선택된 프로젝트 문맥의 합계입니다. MonoField가 별도로 같은 토큰을 한 번 더 청구한다는 뜻이 아닙니다.</w:t>
+      </w:r>
+    </w:p>
+    <w:tbl>
+      <w:tblPr>
+        <w:tblW w:type="auto" w:w="0"/>
+        <w:jc w:val="center"/>
+        <w:tblLayout w:type="fixed"/>
+        <w:tblLook w:firstColumn="1" w:firstRow="1" w:lastColumn="0" w:lastRow="0" w:noHBand="0" w:noVBand="1" w:val="04A0"/>
+      </w:tblPr>
+      <w:tblGrid>
+        <w:gridCol w:w="5016"/>
+        <w:gridCol w:w="5016"/>
+        <w:gridCol w:w="5016"/>
+      </w:tblGrid>
+      <w:tr>
+        <w:trPr>
+          <w:tblHeader w:val="true"/>
+        </w:trPr>
+        <w:tc>
+          <w:tcPr>
+            <w:tcW w:type="dxa" w:w="2160"/>
+            <w:shd w:fill="DDE4EE"/>
+            <w:tcBorders>
+              <w:top w:val="single" w:sz="6" w:color="CAD2DF"/>
+              <w:left w:val="single" w:sz="6" w:color="CAD2DF"/>
+              <w:bottom w:val="single" w:sz="6" w:color="CAD2DF"/>
+              <w:right w:val="single" w:sz="6" w:color="CAD2DF"/>
+              <w:insideH w:val="single" w:sz="6" w:color="CAD2DF"/>
+              <w:insideV w:val="single" w:sz="6" w:color="CAD2DF"/>
+            </w:tcBorders>
+          </w:tcPr>
+          <w:p>
+            <w:pPr>
+              <w:spacing w:after="0"/>
+            </w:pPr>
+            <w:r>
+              <w:rPr>
+                <w:rFonts w:ascii="Calibri" w:hAnsi="Calibri"/>
+                <w:b/>
+                <w:color w:val="1737A6"/>
+                <w:sz w:val="17"/>
+              </w:rPr>
+              <w:t>항목</w:t>
+            </w:r>
+          </w:p>
+        </w:tc>
+        <w:tc>
+          <w:tcPr>
+            <w:tcW w:type="dxa" w:w="5184"/>
+            <w:shd w:fill="DDE4EE"/>
+            <w:tcBorders>
+              <w:top w:val="single" w:sz="6" w:color="CAD2DF"/>
+              <w:left w:val="single" w:sz="6" w:color="CAD2DF"/>
+              <w:bottom w:val="single" w:sz="6" w:color="CAD2DF"/>
+              <w:right w:val="single" w:sz="6" w:color="CAD2DF"/>
+              <w:insideH w:val="single" w:sz="6" w:color="CAD2DF"/>
+              <w:insideV w:val="single" w:sz="6" w:color="CAD2DF"/>
+            </w:tcBorders>
+          </w:tcPr>
+          <w:p>
+            <w:pPr>
+              <w:spacing w:after="0"/>
+            </w:pPr>
+            <w:r>
+              <w:rPr>
+                <w:rFonts w:ascii="Calibri" w:hAnsi="Calibri"/>
+                <w:b/>
+                <w:color w:val="1737A6"/>
+                <w:sz w:val="17"/>
+              </w:rPr>
+              <w:t>뜻</w:t>
+            </w:r>
+          </w:p>
+        </w:tc>
+        <w:tc>
+          <w:tcPr>
+            <w:tcW w:type="dxa" w:w="5616"/>
+            <w:shd w:fill="DDE4EE"/>
+            <w:tcBorders>
+              <w:top w:val="single" w:sz="6" w:color="CAD2DF"/>
+              <w:left w:val="single" w:sz="6" w:color="CAD2DF"/>
+              <w:bottom w:val="single" w:sz="6" w:color="CAD2DF"/>
+              <w:right w:val="single" w:sz="6" w:color="CAD2DF"/>
+              <w:insideH w:val="single" w:sz="6" w:color="CAD2DF"/>
+              <w:insideV w:val="single" w:sz="6" w:color="CAD2DF"/>
+            </w:tcBorders>
+          </w:tcPr>
+          <w:p>
+            <w:pPr>
+              <w:spacing w:after="0"/>
+            </w:pPr>
+            <w:r>
+              <w:rPr>
+                <w:rFonts w:ascii="Calibri" w:hAnsi="Calibri"/>
+                <w:b/>
+                <w:color w:val="1737A6"/>
+                <w:sz w:val="17"/>
+              </w:rPr>
+              <w:t>해석</w:t>
+            </w:r>
+          </w:p>
+        </w:tc>
+      </w:tr>
+      <w:tr>
+        <w:tc>
+          <w:tcPr>
+            <w:tcW w:type="dxa" w:w="2160"/>
+            <w:tcBorders>
+              <w:top w:val="single" w:sz="6" w:color="CAD2DF"/>
+              <w:left w:val="single" w:sz="6" w:color="CAD2DF"/>
+              <w:bottom w:val="single" w:sz="6" w:color="CAD2DF"/>
+              <w:right w:val="single" w:sz="6" w:color="CAD2DF"/>
+              <w:insideH w:val="single" w:sz="6" w:color="CAD2DF"/>
+              <w:insideV w:val="single" w:sz="6" w:color="CAD2DF"/>
+            </w:tcBorders>
+            <w:vAlign w:val="center"/>
+          </w:tcPr>
+          <w:p>
+            <w:pPr>
+              <w:spacing w:after="0"/>
+            </w:pPr>
+            <w:r>
+              <w:rPr>
+                <w:rFonts w:ascii="Calibri" w:hAnsi="Calibri"/>
+                <w:b w:val="0"/>
+                <w:color w:val="111216"/>
+                <w:sz w:val="16"/>
+              </w:rPr>
+              <w:t>새 입력</w:t>
+            </w:r>
+          </w:p>
+        </w:tc>
+        <w:tc>
+          <w:tcPr>
+            <w:tcW w:type="dxa" w:w="5184"/>
+            <w:tcBorders>
+              <w:top w:val="single" w:sz="6" w:color="CAD2DF"/>
+              <w:left w:val="single" w:sz="6" w:color="CAD2DF"/>
+              <w:bottom w:val="single" w:sz="6" w:color="CAD2DF"/>
+              <w:right w:val="single" w:sz="6" w:color="CAD2DF"/>
+              <w:insideH w:val="single" w:sz="6" w:color="CAD2DF"/>
+              <w:insideV w:val="single" w:sz="6" w:color="CAD2DF"/>
+            </w:tcBorders>
+            <w:vAlign w:val="center"/>
+          </w:tcPr>
+          <w:p>
+            <w:pPr>
+              <w:spacing w:after="0"/>
+            </w:pPr>
+            <w:r>
+              <w:rPr>
+                <w:rFonts w:ascii="Calibri" w:hAnsi="Calibri"/>
+                <w:b w:val="0"/>
+                <w:color w:val="111216"/>
+                <w:sz w:val="16"/>
+              </w:rPr>
+              <w:t>이번 호출에서 새로 처리한 입력</w:t>
+            </w:r>
+          </w:p>
+        </w:tc>
+        <w:tc>
+          <w:tcPr>
+            <w:tcW w:type="dxa" w:w="5616"/>
+            <w:tcBorders>
+              <w:top w:val="single" w:sz="6" w:color="CAD2DF"/>
+              <w:left w:val="single" w:sz="6" w:color="CAD2DF"/>
+              <w:bottom w:val="single" w:sz="6" w:color="CAD2DF"/>
+              <w:right w:val="single" w:sz="6" w:color="CAD2DF"/>
+              <w:insideH w:val="single" w:sz="6" w:color="CAD2DF"/>
+              <w:insideV w:val="single" w:sz="6" w:color="CAD2DF"/>
+            </w:tcBorders>
+            <w:vAlign w:val="center"/>
+          </w:tcPr>
+          <w:p>
+            <w:pPr>
+              <w:spacing w:after="0"/>
+            </w:pPr>
+            <w:r>
+              <w:rPr>
+                <w:rFonts w:ascii="Calibri" w:hAnsi="Calibri"/>
+                <w:b w:val="0"/>
+                <w:color w:val="111216"/>
+                <w:sz w:val="16"/>
+              </w:rPr>
+              <w:t>사용자 문장 외 시스템·도구·대화 문맥 포함</w:t>
+            </w:r>
+          </w:p>
+        </w:tc>
+      </w:tr>
+      <w:tr>
+        <w:tc>
+          <w:tcPr>
+            <w:tcW w:type="dxa" w:w="2160"/>
+            <w:tcBorders>
+              <w:top w:val="single" w:sz="6" w:color="CAD2DF"/>
+              <w:left w:val="single" w:sz="6" w:color="CAD2DF"/>
+              <w:bottom w:val="single" w:sz="6" w:color="CAD2DF"/>
+              <w:right w:val="single" w:sz="6" w:color="CAD2DF"/>
+              <w:insideH w:val="single" w:sz="6" w:color="CAD2DF"/>
+              <w:insideV w:val="single" w:sz="6" w:color="CAD2DF"/>
+            </w:tcBorders>
+            <w:vAlign w:val="center"/>
+          </w:tcPr>
+          <w:p>
+            <w:pPr>
+              <w:spacing w:after="0"/>
+            </w:pPr>
+            <w:r>
+              <w:rPr>
+                <w:rFonts w:ascii="Calibri" w:hAnsi="Calibri"/>
+                <w:b w:val="0"/>
+                <w:color w:val="111216"/>
+                <w:sz w:val="16"/>
+              </w:rPr>
+              <w:t>캐시 재사용</w:t>
+            </w:r>
+          </w:p>
+        </w:tc>
+        <w:tc>
+          <w:tcPr>
+            <w:tcW w:type="dxa" w:w="5184"/>
+            <w:tcBorders>
+              <w:top w:val="single" w:sz="6" w:color="CAD2DF"/>
+              <w:left w:val="single" w:sz="6" w:color="CAD2DF"/>
+              <w:bottom w:val="single" w:sz="6" w:color="CAD2DF"/>
+              <w:right w:val="single" w:sz="6" w:color="CAD2DF"/>
+              <w:insideH w:val="single" w:sz="6" w:color="CAD2DF"/>
+              <w:insideV w:val="single" w:sz="6" w:color="CAD2DF"/>
+            </w:tcBorders>
+            <w:vAlign w:val="center"/>
+          </w:tcPr>
+          <w:p>
+            <w:pPr>
+              <w:spacing w:after="0"/>
+            </w:pPr>
+            <w:r>
+              <w:rPr>
+                <w:rFonts w:ascii="Calibri" w:hAnsi="Calibri"/>
+                <w:b w:val="0"/>
+                <w:color w:val="111216"/>
+                <w:sz w:val="16"/>
+              </w:rPr>
+              <w:t>공급자가 이전 입력 prefix를 재사용한 양</w:t>
+            </w:r>
+          </w:p>
+        </w:tc>
+        <w:tc>
+          <w:tcPr>
+            <w:tcW w:type="dxa" w:w="5616"/>
+            <w:tcBorders>
+              <w:top w:val="single" w:sz="6" w:color="CAD2DF"/>
+              <w:left w:val="single" w:sz="6" w:color="CAD2DF"/>
+              <w:bottom w:val="single" w:sz="6" w:color="CAD2DF"/>
+              <w:right w:val="single" w:sz="6" w:color="CAD2DF"/>
+              <w:insideH w:val="single" w:sz="6" w:color="CAD2DF"/>
+              <w:insideV w:val="single" w:sz="6" w:color="CAD2DF"/>
+            </w:tcBorders>
+            <w:vAlign w:val="center"/>
+          </w:tcPr>
+          <w:p>
+            <w:pPr>
+              <w:spacing w:after="0"/>
+            </w:pPr>
+            <w:r>
+              <w:rPr>
+                <w:rFonts w:ascii="Calibri" w:hAnsi="Calibri"/>
+                <w:b w:val="0"/>
+                <w:color w:val="111216"/>
+                <w:sz w:val="16"/>
+              </w:rPr>
+              <w:t>중복 전송처럼 보여도 공급자 캐시 지표이며 보통 새 입력보다 효율적</w:t>
+            </w:r>
+          </w:p>
+        </w:tc>
+      </w:tr>
+      <w:tr>
+        <w:tc>
+          <w:tcPr>
+            <w:tcW w:type="dxa" w:w="2160"/>
+            <w:tcBorders>
+              <w:top w:val="single" w:sz="6" w:color="CAD2DF"/>
+              <w:left w:val="single" w:sz="6" w:color="CAD2DF"/>
+              <w:bottom w:val="single" w:sz="6" w:color="CAD2DF"/>
+              <w:right w:val="single" w:sz="6" w:color="CAD2DF"/>
+              <w:insideH w:val="single" w:sz="6" w:color="CAD2DF"/>
+              <w:insideV w:val="single" w:sz="6" w:color="CAD2DF"/>
+            </w:tcBorders>
+            <w:vAlign w:val="center"/>
+          </w:tcPr>
+          <w:p>
+            <w:pPr>
+              <w:spacing w:after="0"/>
+            </w:pPr>
+            <w:r>
+              <w:rPr>
+                <w:rFonts w:ascii="Calibri" w:hAnsi="Calibri"/>
+                <w:b w:val="0"/>
+                <w:color w:val="111216"/>
+                <w:sz w:val="16"/>
+              </w:rPr>
+              <w:t>출력·추론</w:t>
+            </w:r>
+          </w:p>
+        </w:tc>
+        <w:tc>
+          <w:tcPr>
+            <w:tcW w:type="dxa" w:w="5184"/>
+            <w:tcBorders>
+              <w:top w:val="single" w:sz="6" w:color="CAD2DF"/>
+              <w:left w:val="single" w:sz="6" w:color="CAD2DF"/>
+              <w:bottom w:val="single" w:sz="6" w:color="CAD2DF"/>
+              <w:right w:val="single" w:sz="6" w:color="CAD2DF"/>
+              <w:insideH w:val="single" w:sz="6" w:color="CAD2DF"/>
+              <w:insideV w:val="single" w:sz="6" w:color="CAD2DF"/>
+            </w:tcBorders>
+            <w:vAlign w:val="center"/>
+          </w:tcPr>
+          <w:p>
+            <w:pPr>
+              <w:spacing w:after="0"/>
+            </w:pPr>
+            <w:r>
+              <w:rPr>
+                <w:rFonts w:ascii="Calibri" w:hAnsi="Calibri"/>
+                <w:b w:val="0"/>
+                <w:color w:val="111216"/>
+                <w:sz w:val="16"/>
+              </w:rPr>
+              <w:t>응답과 내부 추론에 보고된 양</w:t>
+            </w:r>
+          </w:p>
+        </w:tc>
+        <w:tc>
+          <w:tcPr>
+            <w:tcW w:type="dxa" w:w="5616"/>
+            <w:tcBorders>
+              <w:top w:val="single" w:sz="6" w:color="CAD2DF"/>
+              <w:left w:val="single" w:sz="6" w:color="CAD2DF"/>
+              <w:bottom w:val="single" w:sz="6" w:color="CAD2DF"/>
+              <w:right w:val="single" w:sz="6" w:color="CAD2DF"/>
+              <w:insideH w:val="single" w:sz="6" w:color="CAD2DF"/>
+              <w:insideV w:val="single" w:sz="6" w:color="CAD2DF"/>
+            </w:tcBorders>
+            <w:vAlign w:val="center"/>
+          </w:tcPr>
+          <w:p>
+            <w:pPr>
+              <w:spacing w:after="0"/>
+            </w:pPr>
+            <w:r>
+              <w:rPr>
+                <w:rFonts w:ascii="Calibri" w:hAnsi="Calibri"/>
+                <w:b w:val="0"/>
+                <w:color w:val="111216"/>
+                <w:sz w:val="16"/>
+              </w:rPr>
+              <w:t>런타임이 구분해 주지 않으면 측정 불가로 표시</w:t>
+            </w:r>
+          </w:p>
+        </w:tc>
+      </w:tr>
+      <w:tr>
+        <w:tc>
+          <w:tcPr>
+            <w:tcW w:type="dxa" w:w="2160"/>
+            <w:tcBorders>
+              <w:top w:val="single" w:sz="6" w:color="CAD2DF"/>
+              <w:left w:val="single" w:sz="6" w:color="CAD2DF"/>
+              <w:bottom w:val="single" w:sz="6" w:color="CAD2DF"/>
+              <w:right w:val="single" w:sz="6" w:color="CAD2DF"/>
+              <w:insideH w:val="single" w:sz="6" w:color="CAD2DF"/>
+              <w:insideV w:val="single" w:sz="6" w:color="CAD2DF"/>
+            </w:tcBorders>
+            <w:vAlign w:val="center"/>
+          </w:tcPr>
+          <w:p>
+            <w:pPr>
+              <w:spacing w:after="0"/>
+            </w:pPr>
+            <w:r>
+              <w:rPr>
+                <w:rFonts w:ascii="Calibri" w:hAnsi="Calibri"/>
+                <w:b w:val="0"/>
+                <w:color w:val="111216"/>
+                <w:sz w:val="16"/>
+              </w:rPr>
+              <w:t>비용</w:t>
+            </w:r>
+          </w:p>
+        </w:tc>
+        <w:tc>
+          <w:tcPr>
+            <w:tcW w:type="dxa" w:w="5184"/>
+            <w:tcBorders>
+              <w:top w:val="single" w:sz="6" w:color="CAD2DF"/>
+              <w:left w:val="single" w:sz="6" w:color="CAD2DF"/>
+              <w:bottom w:val="single" w:sz="6" w:color="CAD2DF"/>
+              <w:right w:val="single" w:sz="6" w:color="CAD2DF"/>
+              <w:insideH w:val="single" w:sz="6" w:color="CAD2DF"/>
+              <w:insideV w:val="single" w:sz="6" w:color="CAD2DF"/>
+            </w:tcBorders>
+            <w:vAlign w:val="center"/>
+          </w:tcPr>
+          <w:p>
+            <w:pPr>
+              <w:spacing w:after="0"/>
+            </w:pPr>
+            <w:r>
+              <w:rPr>
+                <w:rFonts w:ascii="Calibri" w:hAnsi="Calibri"/>
+                <w:b w:val="0"/>
+                <w:color w:val="111216"/>
+                <w:sz w:val="16"/>
+              </w:rPr>
+              <w:t>공급자가 직접 반환한 USD</w:t>
+            </w:r>
+          </w:p>
+        </w:tc>
+        <w:tc>
+          <w:tcPr>
+            <w:tcW w:type="dxa" w:w="5616"/>
+            <w:tcBorders>
+              <w:top w:val="single" w:sz="6" w:color="CAD2DF"/>
+              <w:left w:val="single" w:sz="6" w:color="CAD2DF"/>
+              <w:bottom w:val="single" w:sz="6" w:color="CAD2DF"/>
+              <w:right w:val="single" w:sz="6" w:color="CAD2DF"/>
+              <w:insideH w:val="single" w:sz="6" w:color="CAD2DF"/>
+              <w:insideV w:val="single" w:sz="6" w:color="CAD2DF"/>
+            </w:tcBorders>
+            <w:vAlign w:val="center"/>
+          </w:tcPr>
+          <w:p>
+            <w:pPr>
+              <w:spacing w:after="0"/>
+            </w:pPr>
+            <w:r>
+              <w:rPr>
+                <w:rFonts w:ascii="Calibri" w:hAnsi="Calibri"/>
+                <w:b w:val="0"/>
+                <w:color w:val="111216"/>
+                <w:sz w:val="16"/>
+              </w:rPr>
+              <w:t>CLI가 금액을 주지 않으면 MonoField가 임의 환산하지 않음</w:t>
+            </w:r>
+          </w:p>
+        </w:tc>
+      </w:tr>
+    </w:tbl>
+    <w:p>
+      <w:pPr>
+        <w:spacing w:after="20"/>
+      </w:pPr>
+    </w:p>
+    <w:tbl>
+      <w:tblPr>
+        <w:tblW w:type="auto" w:w="0"/>
+        <w:jc w:val="center"/>
+        <w:tblLayout w:type="fixed"/>
+        <w:tblLook w:firstColumn="1" w:firstRow="1" w:lastColumn="0" w:lastRow="0" w:noHBand="0" w:noVBand="1" w:val="04A0"/>
+      </w:tblPr>
+      <w:tblGrid>
+        <w:gridCol w:w="7524"/>
+        <w:gridCol w:w="7524"/>
+      </w:tblGrid>
+      <w:tr>
+        <w:tc>
+          <w:tcPr>
+            <w:tcW w:type="dxa" w:w="1440"/>
+            <w:tcBorders>
+              <w:top w:val="single" w:sz="8" w:color="2E5BFF"/>
+              <w:left w:val="single" w:sz="8" w:color="2E5BFF"/>
+              <w:bottom w:val="single" w:sz="8" w:color="2E5BFF"/>
+              <w:right w:val="single" w:sz="8" w:color="2E5BFF"/>
+              <w:insideH w:val="single" w:sz="8" w:color="2E5BFF"/>
+              <w:insideV w:val="single" w:sz="8" w:color="2E5BFF"/>
+            </w:tcBorders>
+            <w:vAlign w:val="center"/>
+            <w:shd w:fill="2E5BFF"/>
+          </w:tcPr>
+          <w:p>
+            <w:pPr>
+              <w:jc w:val="center"/>
+            </w:pPr>
+            <w:r>
+              <w:rPr>
+                <w:rFonts w:ascii="Calibri" w:hAnsi="Calibri"/>
+                <w:b/>
+                <w:color w:val="FFFFFF"/>
+                <w:sz w:val="17"/>
+              </w:rPr>
+              <w:t>도구 차이</w:t>
+            </w:r>
+          </w:p>
+        </w:tc>
+        <w:tc>
+          <w:tcPr>
+            <w:tcW w:type="dxa" w:w="11520"/>
+            <w:tcBorders>
+              <w:top w:val="single" w:sz="8" w:color="2E5BFF"/>
+              <w:left w:val="single" w:sz="8" w:color="2E5BFF"/>
+              <w:bottom w:val="single" w:sz="8" w:color="2E5BFF"/>
+              <w:right w:val="single" w:sz="8" w:color="2E5BFF"/>
+              <w:insideH w:val="single" w:sz="8" w:color="2E5BFF"/>
+              <w:insideV w:val="single" w:sz="8" w:color="2E5BFF"/>
+            </w:tcBorders>
+            <w:vAlign w:val="center"/>
+            <w:shd w:fill="F4F6FB"/>
+          </w:tcPr>
+          <w:p>
+            <w:r>
+              <w:rPr>
+                <w:rFonts w:ascii="Calibri" w:hAnsi="Calibri"/>
+                <w:b w:val="0"/>
+                <w:color w:val="111216"/>
+                <w:sz w:val="17"/>
+              </w:rPr>
+              <w:t>로컬 코드-agent CLI는 파일·터미널·DB broker·브라우저 검증과 함께 사용합니다. 일반 BYOK endpoint는 대화와 문서 생성에 적합하며, 공급자 API만 연결했다고 로컬 개발 도구 권한이 자동으로 생기지는 않습니다.</w:t>
+            </w:r>
+          </w:p>
+        </w:tc>
+      </w:tr>
+    </w:tbl>
+    <w:p>
+      <w:pPr>
+        <w:pStyle w:val="ListBullet"/>
+        <w:spacing w:after="80"/>
+      </w:pPr>
+      <w:r>
+        <w:rPr>
+          <w:rFonts w:ascii="Calibri" w:hAnsi="Calibri"/>
+          <w:b w:val="0"/>
+          <w:color w:val="111216"/>
+          <w:sz w:val="18"/>
+        </w:rPr>
+        <w:t>문서 모드의 긴 지침은 실제 문서 생성·검증 작업에서만 지연 주입합니다.</w:t>
+      </w:r>
+    </w:p>
+    <w:p>
+      <w:pPr>
+        <w:pStyle w:val="ListBullet"/>
+        <w:spacing w:after="80"/>
+      </w:pPr>
+      <w:r>
+        <w:rPr>
+          <w:rFonts w:ascii="Calibri" w:hAnsi="Calibri"/>
+          <w:b w:val="0"/>
+          <w:color w:val="111216"/>
+          <w:sz w:val="18"/>
+        </w:rPr>
+        <w:t>선택한 CLI의 준비 상태를 먼저 표시하고, 다른 에이전트 전체 스캔은 뒤에서 진행합니다.</w:t>
+      </w:r>
+    </w:p>
+    <w:p>
+      <w:pPr>
+        <w:pStyle w:val="ListBullet"/>
+        <w:spacing w:after="80"/>
+      </w:pPr>
+      <w:r>
+        <w:rPr>
+          <w:rFonts w:ascii="Calibri" w:hAnsi="Calibri"/>
+          <w:b w:val="0"/>
+          <w:color w:val="111216"/>
+          <w:sz w:val="18"/>
+        </w:rPr>
+        <w:t>모델 목록은 설치된 CLI의 실시간 결과를 우선하고 알려진 목록은 오프라인 폴백으로만 사용합니다.</w:t>
+      </w:r>
+    </w:p>
+    <w:p>
+      <w:r>
+        <w:br w:type="page"/>
+      </w:r>
+    </w:p>
+    <w:p>
+      <w:pPr>
+        <w:spacing w:after="120"/>
+      </w:pPr>
+      <w:r>
+        <w:rPr>
+          <w:rFonts w:ascii="Calibri" w:hAnsi="Calibri"/>
+          <w:b/>
+          <w:color w:val="2E5BFF"/>
+          <w:sz w:val="17"/>
+        </w:rPr>
+        <w:t>17  /  RECOVERY</w:t>
+      </w:r>
+    </w:p>
+    <w:p>
+      <w:pPr>
+        <w:spacing w:after="160"/>
+      </w:pPr>
+      <w:r>
+        <w:rPr>
+          <w:rFonts w:ascii="Calibri" w:hAnsi="Calibri"/>
+          <w:b/>
+          <w:color w:val="1737A6"/>
+          <w:sz w:val="42"/>
+        </w:rPr>
+        <w:t>막혔을 때는 현재 프로젝트의 상태부터 확인하세요</w:t>
+      </w:r>
+    </w:p>
+    <w:p>
+      <w:pPr>
+        <w:spacing w:after="200"/>
+      </w:pPr>
+      <w:r>
+        <w:rPr>
+          <w:rFonts w:ascii="Calibri" w:hAnsi="Calibri"/>
+          <w:b w:val="0"/>
+          <w:color w:val="5D6470"/>
+          <w:sz w:val="21"/>
+        </w:rPr>
+        <w:t>오류를 숨기고 다른 프로젝트를 임의로 실행하지 않습니다. 실행 로그와 현재 선택값을 기준으로 한 단계씩 복구합니다.</w:t>
+      </w:r>
+    </w:p>
+    <w:tbl>
+      <w:tblPr>
+        <w:tblW w:type="auto" w:w="0"/>
+        <w:jc w:val="center"/>
+        <w:tblLayout w:type="fixed"/>
+        <w:tblLook w:firstColumn="1" w:firstRow="1" w:lastColumn="0" w:lastRow="0" w:noHBand="0" w:noVBand="1" w:val="04A0"/>
+      </w:tblPr>
+      <w:tblGrid>
+        <w:gridCol w:w="5016"/>
+        <w:gridCol w:w="5016"/>
+        <w:gridCol w:w="5016"/>
+      </w:tblGrid>
+      <w:tr>
+        <w:trPr>
+          <w:tblHeader w:val="true"/>
+        </w:trPr>
+        <w:tc>
+          <w:tcPr>
+            <w:tcW w:type="dxa" w:w="2880"/>
+            <w:shd w:fill="DDE4EE"/>
+            <w:tcBorders>
+              <w:top w:val="single" w:sz="6" w:color="CAD2DF"/>
+              <w:left w:val="single" w:sz="6" w:color="CAD2DF"/>
+              <w:bottom w:val="single" w:sz="6" w:color="CAD2DF"/>
+              <w:right w:val="single" w:sz="6" w:color="CAD2DF"/>
+              <w:insideH w:val="single" w:sz="6" w:color="CAD2DF"/>
+              <w:insideV w:val="single" w:sz="6" w:color="CAD2DF"/>
+            </w:tcBorders>
+          </w:tcPr>
+          <w:p>
+            <w:pPr>
+              <w:spacing w:after="0"/>
+            </w:pPr>
+            <w:r>
+              <w:rPr>
+                <w:rFonts w:ascii="Calibri" w:hAnsi="Calibri"/>
+                <w:b/>
+                <w:color w:val="1737A6"/>
+                <w:sz w:val="17"/>
+              </w:rPr>
+              <w:t>증상</w:t>
+            </w:r>
+          </w:p>
+        </w:tc>
+        <w:tc>
+          <w:tcPr>
+            <w:tcW w:type="dxa" w:w="4608"/>
+            <w:shd w:fill="DDE4EE"/>
+            <w:tcBorders>
+              <w:top w:val="single" w:sz="6" w:color="CAD2DF"/>
+              <w:left w:val="single" w:sz="6" w:color="CAD2DF"/>
+              <w:bottom w:val="single" w:sz="6" w:color="CAD2DF"/>
+              <w:right w:val="single" w:sz="6" w:color="CAD2DF"/>
+              <w:insideH w:val="single" w:sz="6" w:color="CAD2DF"/>
+              <w:insideV w:val="single" w:sz="6" w:color="CAD2DF"/>
+            </w:tcBorders>
+          </w:tcPr>
+          <w:p>
+            <w:pPr>
+              <w:spacing w:after="0"/>
+            </w:pPr>
+            <w:r>
+              <w:rPr>
+                <w:rFonts w:ascii="Calibri" w:hAnsi="Calibri"/>
+                <w:b/>
+                <w:color w:val="1737A6"/>
+                <w:sz w:val="17"/>
+              </w:rPr>
+              <w:t>확인</w:t>
+            </w:r>
+          </w:p>
+        </w:tc>
+        <w:tc>
+          <w:tcPr>
+            <w:tcW w:type="dxa" w:w="5472"/>
+            <w:shd w:fill="DDE4EE"/>
+            <w:tcBorders>
+              <w:top w:val="single" w:sz="6" w:color="CAD2DF"/>
+              <w:left w:val="single" w:sz="6" w:color="CAD2DF"/>
+              <w:bottom w:val="single" w:sz="6" w:color="CAD2DF"/>
+              <w:right w:val="single" w:sz="6" w:color="CAD2DF"/>
+              <w:insideH w:val="single" w:sz="6" w:color="CAD2DF"/>
+              <w:insideV w:val="single" w:sz="6" w:color="CAD2DF"/>
+            </w:tcBorders>
+          </w:tcPr>
+          <w:p>
+            <w:pPr>
+              <w:spacing w:after="0"/>
+            </w:pPr>
+            <w:r>
+              <w:rPr>
+                <w:rFonts w:ascii="Calibri" w:hAnsi="Calibri"/>
+                <w:b/>
+                <w:color w:val="1737A6"/>
+                <w:sz w:val="17"/>
+              </w:rPr>
+              <w:t>조치</w:t>
+            </w:r>
+          </w:p>
+        </w:tc>
+      </w:tr>
+      <w:tr>
+        <w:tc>
+          <w:tcPr>
+            <w:tcW w:type="dxa" w:w="2880"/>
+            <w:tcBorders>
+              <w:top w:val="single" w:sz="6" w:color="CAD2DF"/>
+              <w:left w:val="single" w:sz="6" w:color="CAD2DF"/>
+              <w:bottom w:val="single" w:sz="6" w:color="CAD2DF"/>
+              <w:right w:val="single" w:sz="6" w:color="CAD2DF"/>
+              <w:insideH w:val="single" w:sz="6" w:color="CAD2DF"/>
+              <w:insideV w:val="single" w:sz="6" w:color="CAD2DF"/>
+            </w:tcBorders>
+            <w:vAlign w:val="center"/>
+          </w:tcPr>
+          <w:p>
+            <w:pPr>
+              <w:spacing w:after="0"/>
+            </w:pPr>
+            <w:r>
+              <w:rPr>
+                <w:rFonts w:ascii="Calibri" w:hAnsi="Calibri"/>
+                <w:b w:val="0"/>
+                <w:color w:val="111216"/>
+                <w:sz w:val="16"/>
+              </w:rPr>
+              <w:t>Port already in use</w:t>
+            </w:r>
+          </w:p>
+        </w:tc>
+        <w:tc>
+          <w:tcPr>
+            <w:tcW w:type="dxa" w:w="4608"/>
+            <w:tcBorders>
+              <w:top w:val="single" w:sz="6" w:color="CAD2DF"/>
+              <w:left w:val="single" w:sz="6" w:color="CAD2DF"/>
+              <w:bottom w:val="single" w:sz="6" w:color="CAD2DF"/>
+              <w:right w:val="single" w:sz="6" w:color="CAD2DF"/>
+              <w:insideH w:val="single" w:sz="6" w:color="CAD2DF"/>
+              <w:insideV w:val="single" w:sz="6" w:color="CAD2DF"/>
+            </w:tcBorders>
+            <w:vAlign w:val="center"/>
+          </w:tcPr>
+          <w:p>
+            <w:pPr>
+              <w:spacing w:after="0"/>
+            </w:pPr>
+            <w:r>
+              <w:rPr>
+                <w:rFonts w:ascii="Calibri" w:hAnsi="Calibri"/>
+                <w:b w:val="0"/>
+                <w:color w:val="111216"/>
+                <w:sz w:val="16"/>
+              </w:rPr>
+              <w:t>실행 로그의 전체 포트 충돌 메시지</w:t>
+            </w:r>
+          </w:p>
+        </w:tc>
+        <w:tc>
+          <w:tcPr>
+            <w:tcW w:type="dxa" w:w="5472"/>
+            <w:tcBorders>
+              <w:top w:val="single" w:sz="6" w:color="CAD2DF"/>
+              <w:left w:val="single" w:sz="6" w:color="CAD2DF"/>
+              <w:bottom w:val="single" w:sz="6" w:color="CAD2DF"/>
+              <w:right w:val="single" w:sz="6" w:color="CAD2DF"/>
+              <w:insideH w:val="single" w:sz="6" w:color="CAD2DF"/>
+              <w:insideV w:val="single" w:sz="6" w:color="CAD2DF"/>
+            </w:tcBorders>
+            <w:vAlign w:val="center"/>
+          </w:tcPr>
+          <w:p>
+            <w:pPr>
+              <w:spacing w:after="0"/>
+            </w:pPr>
+            <w:r>
+              <w:rPr>
+                <w:rFonts w:ascii="Calibri" w:hAnsi="Calibri"/>
+                <w:b w:val="0"/>
+                <w:color w:val="111216"/>
+                <w:sz w:val="16"/>
+              </w:rPr>
+              <w:t>포트 인자를 바꾸거나 해당 포트 프로세스를 명시적으로 중지</w:t>
+            </w:r>
+          </w:p>
+        </w:tc>
+      </w:tr>
+      <w:tr>
+        <w:tc>
+          <w:tcPr>
+            <w:tcW w:type="dxa" w:w="2880"/>
+            <w:tcBorders>
+              <w:top w:val="single" w:sz="6" w:color="CAD2DF"/>
+              <w:left w:val="single" w:sz="6" w:color="CAD2DF"/>
+              <w:bottom w:val="single" w:sz="6" w:color="CAD2DF"/>
+              <w:right w:val="single" w:sz="6" w:color="CAD2DF"/>
+              <w:insideH w:val="single" w:sz="6" w:color="CAD2DF"/>
+              <w:insideV w:val="single" w:sz="6" w:color="CAD2DF"/>
+            </w:tcBorders>
+            <w:vAlign w:val="center"/>
+          </w:tcPr>
+          <w:p>
+            <w:pPr>
+              <w:spacing w:after="0"/>
+            </w:pPr>
+            <w:r>
+              <w:rPr>
+                <w:rFonts w:ascii="Calibri" w:hAnsi="Calibri"/>
+                <w:b w:val="0"/>
+                <w:color w:val="111216"/>
+                <w:sz w:val="16"/>
+              </w:rPr>
+              <w:t>다른 서버가 열림</w:t>
+            </w:r>
+          </w:p>
+        </w:tc>
+        <w:tc>
+          <w:tcPr>
+            <w:tcW w:type="dxa" w:w="4608"/>
+            <w:tcBorders>
+              <w:top w:val="single" w:sz="6" w:color="CAD2DF"/>
+              <w:left w:val="single" w:sz="6" w:color="CAD2DF"/>
+              <w:bottom w:val="single" w:sz="6" w:color="CAD2DF"/>
+              <w:right w:val="single" w:sz="6" w:color="CAD2DF"/>
+              <w:insideH w:val="single" w:sz="6" w:color="CAD2DF"/>
+              <w:insideV w:val="single" w:sz="6" w:color="CAD2DF"/>
+            </w:tcBorders>
+            <w:vAlign w:val="center"/>
+          </w:tcPr>
+          <w:p>
+            <w:pPr>
+              <w:spacing w:after="0"/>
+            </w:pPr>
+            <w:r>
+              <w:rPr>
+                <w:rFonts w:ascii="Calibri" w:hAnsi="Calibri"/>
+                <w:b w:val="0"/>
+                <w:color w:val="111216"/>
+                <w:sz w:val="16"/>
+              </w:rPr>
+              <w:t>활성 프로젝트·절대 작업 경로·프로필·URL</w:t>
+            </w:r>
+          </w:p>
+        </w:tc>
+        <w:tc>
+          <w:tcPr>
+            <w:tcW w:type="dxa" w:w="5472"/>
+            <w:tcBorders>
+              <w:top w:val="single" w:sz="6" w:color="CAD2DF"/>
+              <w:left w:val="single" w:sz="6" w:color="CAD2DF"/>
+              <w:bottom w:val="single" w:sz="6" w:color="CAD2DF"/>
+              <w:right w:val="single" w:sz="6" w:color="CAD2DF"/>
+              <w:insideH w:val="single" w:sz="6" w:color="CAD2DF"/>
+              <w:insideV w:val="single" w:sz="6" w:color="CAD2DF"/>
+            </w:tcBorders>
+            <w:vAlign w:val="center"/>
+          </w:tcPr>
+          <w:p>
+            <w:pPr>
+              <w:spacing w:after="0"/>
+            </w:pPr>
+            <w:r>
+              <w:rPr>
+                <w:rFonts w:ascii="Calibri" w:hAnsi="Calibri"/>
+                <w:b w:val="0"/>
+                <w:color w:val="111216"/>
+                <w:sz w:val="16"/>
+              </w:rPr>
+              <w:t>올바른 모듈 선택 후 실행 구성 다시 찾기</w:t>
+            </w:r>
+          </w:p>
+        </w:tc>
+      </w:tr>
+      <w:tr>
+        <w:tc>
+          <w:tcPr>
+            <w:tcW w:type="dxa" w:w="2880"/>
+            <w:tcBorders>
+              <w:top w:val="single" w:sz="6" w:color="CAD2DF"/>
+              <w:left w:val="single" w:sz="6" w:color="CAD2DF"/>
+              <w:bottom w:val="single" w:sz="6" w:color="CAD2DF"/>
+              <w:right w:val="single" w:sz="6" w:color="CAD2DF"/>
+              <w:insideH w:val="single" w:sz="6" w:color="CAD2DF"/>
+              <w:insideV w:val="single" w:sz="6" w:color="CAD2DF"/>
+            </w:tcBorders>
+            <w:vAlign w:val="center"/>
+          </w:tcPr>
+          <w:p>
+            <w:pPr>
+              <w:spacing w:after="0"/>
+            </w:pPr>
+            <w:r>
+              <w:rPr>
+                <w:rFonts w:ascii="Calibri" w:hAnsi="Calibri"/>
+                <w:b w:val="0"/>
+                <w:color w:val="111216"/>
+                <w:sz w:val="16"/>
+              </w:rPr>
+              <w:t>UNC 폴더 쓰기 실패</w:t>
+            </w:r>
+          </w:p>
+        </w:tc>
+        <w:tc>
+          <w:tcPr>
+            <w:tcW w:type="dxa" w:w="4608"/>
+            <w:tcBorders>
+              <w:top w:val="single" w:sz="6" w:color="CAD2DF"/>
+              <w:left w:val="single" w:sz="6" w:color="CAD2DF"/>
+              <w:bottom w:val="single" w:sz="6" w:color="CAD2DF"/>
+              <w:right w:val="single" w:sz="6" w:color="CAD2DF"/>
+              <w:insideH w:val="single" w:sz="6" w:color="CAD2DF"/>
+              <w:insideV w:val="single" w:sz="6" w:color="CAD2DF"/>
+            </w:tcBorders>
+            <w:vAlign w:val="center"/>
+          </w:tcPr>
+          <w:p>
+            <w:pPr>
+              <w:spacing w:after="0"/>
+            </w:pPr>
+            <w:r>
+              <w:rPr>
+                <w:rFonts w:ascii="Calibri" w:hAnsi="Calibri"/>
+                <w:b w:val="0"/>
+                <w:color w:val="111216"/>
+                <w:sz w:val="16"/>
+              </w:rPr>
+              <w:t>Desktop 권한과 프로젝트 root</w:t>
+            </w:r>
+          </w:p>
+        </w:tc>
+        <w:tc>
+          <w:tcPr>
+            <w:tcW w:type="dxa" w:w="5472"/>
+            <w:tcBorders>
+              <w:top w:val="single" w:sz="6" w:color="CAD2DF"/>
+              <w:left w:val="single" w:sz="6" w:color="CAD2DF"/>
+              <w:bottom w:val="single" w:sz="6" w:color="CAD2DF"/>
+              <w:right w:val="single" w:sz="6" w:color="CAD2DF"/>
+              <w:insideH w:val="single" w:sz="6" w:color="CAD2DF"/>
+              <w:insideV w:val="single" w:sz="6" w:color="CAD2DF"/>
+            </w:tcBorders>
+            <w:vAlign w:val="center"/>
+          </w:tcPr>
+          <w:p>
+            <w:pPr>
+              <w:spacing w:after="0"/>
+            </w:pPr>
+            <w:r>
+              <w:rPr>
+                <w:rFonts w:ascii="Calibri" w:hAnsi="Calibri"/>
+                <w:b w:val="0"/>
+                <w:color w:val="111216"/>
+                <w:sz w:val="16"/>
+              </w:rPr>
+              <w:t>프로젝트 파일 API를 사용하거나 로컬 작업 폴더 선택</w:t>
+            </w:r>
+          </w:p>
+        </w:tc>
+      </w:tr>
+      <w:tr>
+        <w:tc>
+          <w:tcPr>
+            <w:tcW w:type="dxa" w:w="2880"/>
+            <w:tcBorders>
+              <w:top w:val="single" w:sz="6" w:color="CAD2DF"/>
+              <w:left w:val="single" w:sz="6" w:color="CAD2DF"/>
+              <w:bottom w:val="single" w:sz="6" w:color="CAD2DF"/>
+              <w:right w:val="single" w:sz="6" w:color="CAD2DF"/>
+              <w:insideH w:val="single" w:sz="6" w:color="CAD2DF"/>
+              <w:insideV w:val="single" w:sz="6" w:color="CAD2DF"/>
+            </w:tcBorders>
+            <w:vAlign w:val="center"/>
+          </w:tcPr>
+          <w:p>
+            <w:pPr>
+              <w:spacing w:after="0"/>
+            </w:pPr>
+            <w:r>
+              <w:rPr>
+                <w:rFonts w:ascii="Calibri" w:hAnsi="Calibri"/>
+                <w:b w:val="0"/>
+                <w:color w:val="111216"/>
+                <w:sz w:val="16"/>
+              </w:rPr>
+              <w:t>모델 호출 실패</w:t>
+            </w:r>
+          </w:p>
+        </w:tc>
+        <w:tc>
+          <w:tcPr>
+            <w:tcW w:type="dxa" w:w="4608"/>
+            <w:tcBorders>
+              <w:top w:val="single" w:sz="6" w:color="CAD2DF"/>
+              <w:left w:val="single" w:sz="6" w:color="CAD2DF"/>
+              <w:bottom w:val="single" w:sz="6" w:color="CAD2DF"/>
+              <w:right w:val="single" w:sz="6" w:color="CAD2DF"/>
+              <w:insideH w:val="single" w:sz="6" w:color="CAD2DF"/>
+              <w:insideV w:val="single" w:sz="6" w:color="CAD2DF"/>
+            </w:tcBorders>
+            <w:vAlign w:val="center"/>
+          </w:tcPr>
+          <w:p>
+            <w:pPr>
+              <w:spacing w:after="0"/>
+            </w:pPr>
+            <w:r>
+              <w:rPr>
+                <w:rFonts w:ascii="Calibri" w:hAnsi="Calibri"/>
+                <w:b w:val="0"/>
+                <w:color w:val="111216"/>
+                <w:sz w:val="16"/>
+              </w:rPr>
+              <w:t>CLI 로그인·모델 권한·공급자 상태</w:t>
+            </w:r>
+          </w:p>
+        </w:tc>
+        <w:tc>
+          <w:tcPr>
+            <w:tcW w:type="dxa" w:w="5472"/>
+            <w:tcBorders>
+              <w:top w:val="single" w:sz="6" w:color="CAD2DF"/>
+              <w:left w:val="single" w:sz="6" w:color="CAD2DF"/>
+              <w:bottom w:val="single" w:sz="6" w:color="CAD2DF"/>
+              <w:right w:val="single" w:sz="6" w:color="CAD2DF"/>
+              <w:insideH w:val="single" w:sz="6" w:color="CAD2DF"/>
+              <w:insideV w:val="single" w:sz="6" w:color="CAD2DF"/>
+            </w:tcBorders>
+            <w:vAlign w:val="center"/>
+          </w:tcPr>
+          <w:p>
+            <w:pPr>
+              <w:spacing w:after="0"/>
+            </w:pPr>
+            <w:r>
+              <w:rPr>
+                <w:rFonts w:ascii="Calibri" w:hAnsi="Calibri"/>
+                <w:b w:val="0"/>
+                <w:color w:val="111216"/>
+                <w:sz w:val="16"/>
+              </w:rPr>
+              <w:t>설정에서 다시 스캔/테스트 후 재시도, 반복되면 이슈 또는 메일</w:t>
+            </w:r>
+          </w:p>
+        </w:tc>
+      </w:tr>
+      <w:tr>
+        <w:tc>
+          <w:tcPr>
+            <w:tcW w:type="dxa" w:w="2880"/>
+            <w:tcBorders>
+              <w:top w:val="single" w:sz="6" w:color="CAD2DF"/>
+              <w:left w:val="single" w:sz="6" w:color="CAD2DF"/>
+              <w:bottom w:val="single" w:sz="6" w:color="CAD2DF"/>
+              <w:right w:val="single" w:sz="6" w:color="CAD2DF"/>
+              <w:insideH w:val="single" w:sz="6" w:color="CAD2DF"/>
+              <w:insideV w:val="single" w:sz="6" w:color="CAD2DF"/>
+            </w:tcBorders>
+            <w:vAlign w:val="center"/>
+          </w:tcPr>
+          <w:p>
+            <w:pPr>
+              <w:spacing w:after="0"/>
+            </w:pPr>
+            <w:r>
+              <w:rPr>
+                <w:rFonts w:ascii="Calibri" w:hAnsi="Calibri"/>
+                <w:b w:val="0"/>
+                <w:color w:val="111216"/>
+                <w:sz w:val="16"/>
+              </w:rPr>
+              <w:t>가이드가 안 보임</w:t>
+            </w:r>
+          </w:p>
+        </w:tc>
+        <w:tc>
+          <w:tcPr>
+            <w:tcW w:type="dxa" w:w="4608"/>
+            <w:tcBorders>
+              <w:top w:val="single" w:sz="6" w:color="CAD2DF"/>
+              <w:left w:val="single" w:sz="6" w:color="CAD2DF"/>
+              <w:bottom w:val="single" w:sz="6" w:color="CAD2DF"/>
+              <w:right w:val="single" w:sz="6" w:color="CAD2DF"/>
+              <w:insideH w:val="single" w:sz="6" w:color="CAD2DF"/>
+              <w:insideV w:val="single" w:sz="6" w:color="CAD2DF"/>
+            </w:tcBorders>
+            <w:vAlign w:val="center"/>
+          </w:tcPr>
+          <w:p>
+            <w:pPr>
+              <w:spacing w:after="0"/>
+            </w:pPr>
+            <w:r>
+              <w:rPr>
+                <w:rFonts w:ascii="Calibri" w:hAnsi="Calibri"/>
+                <w:b w:val="0"/>
+                <w:color w:val="111216"/>
+                <w:sz w:val="16"/>
+              </w:rPr>
+              <w:t>? 도움말과 각 화면의 가이드 버튼</w:t>
+            </w:r>
+          </w:p>
+        </w:tc>
+        <w:tc>
+          <w:tcPr>
+            <w:tcW w:type="dxa" w:w="5472"/>
+            <w:tcBorders>
+              <w:top w:val="single" w:sz="6" w:color="CAD2DF"/>
+              <w:left w:val="single" w:sz="6" w:color="CAD2DF"/>
+              <w:bottom w:val="single" w:sz="6" w:color="CAD2DF"/>
+              <w:right w:val="single" w:sz="6" w:color="CAD2DF"/>
+              <w:insideH w:val="single" w:sz="6" w:color="CAD2DF"/>
+              <w:insideV w:val="single" w:sz="6" w:color="CAD2DF"/>
+            </w:tcBorders>
+            <w:vAlign w:val="center"/>
+          </w:tcPr>
+          <w:p>
+            <w:pPr>
+              <w:spacing w:after="0"/>
+            </w:pPr>
+            <w:r>
+              <w:rPr>
+                <w:rFonts w:ascii="Calibri" w:hAnsi="Calibri"/>
+                <w:b w:val="0"/>
+                <w:color w:val="111216"/>
+                <w:sz w:val="16"/>
+              </w:rPr>
+              <w:t>제품·개발·문서/디자인·설정 가이드를 수동으로 다시 열기</w:t>
+            </w:r>
+          </w:p>
+        </w:tc>
+      </w:tr>
+      <w:tr>
+        <w:tc>
+          <w:tcPr>
+            <w:tcW w:type="dxa" w:w="2880"/>
+            <w:tcBorders>
+              <w:top w:val="single" w:sz="6" w:color="CAD2DF"/>
+              <w:left w:val="single" w:sz="6" w:color="CAD2DF"/>
+              <w:bottom w:val="single" w:sz="6" w:color="CAD2DF"/>
+              <w:right w:val="single" w:sz="6" w:color="CAD2DF"/>
+              <w:insideH w:val="single" w:sz="6" w:color="CAD2DF"/>
+              <w:insideV w:val="single" w:sz="6" w:color="CAD2DF"/>
+            </w:tcBorders>
+            <w:vAlign w:val="center"/>
+          </w:tcPr>
+          <w:p>
+            <w:pPr>
+              <w:spacing w:after="0"/>
+            </w:pPr>
+            <w:r>
+              <w:rPr>
+                <w:rFonts w:ascii="Calibri" w:hAnsi="Calibri"/>
+                <w:b w:val="0"/>
+                <w:color w:val="111216"/>
+                <w:sz w:val="16"/>
+              </w:rPr>
+              <w:t>업데이트 발견</w:t>
+            </w:r>
+          </w:p>
+        </w:tc>
+        <w:tc>
+          <w:tcPr>
+            <w:tcW w:type="dxa" w:w="4608"/>
+            <w:tcBorders>
+              <w:top w:val="single" w:sz="6" w:color="CAD2DF"/>
+              <w:left w:val="single" w:sz="6" w:color="CAD2DF"/>
+              <w:bottom w:val="single" w:sz="6" w:color="CAD2DF"/>
+              <w:right w:val="single" w:sz="6" w:color="CAD2DF"/>
+              <w:insideH w:val="single" w:sz="6" w:color="CAD2DF"/>
+              <w:insideV w:val="single" w:sz="6" w:color="CAD2DF"/>
+            </w:tcBorders>
+            <w:vAlign w:val="center"/>
+          </w:tcPr>
+          <w:p>
+            <w:pPr>
+              <w:spacing w:after="0"/>
+            </w:pPr>
+            <w:r>
+              <w:rPr>
+                <w:rFonts w:ascii="Calibri" w:hAnsi="Calibri"/>
+                <w:b w:val="0"/>
+                <w:color w:val="111216"/>
+                <w:sz w:val="16"/>
+              </w:rPr>
+              <w:t>앱의 새 버전 알림과 GitHub Release</w:t>
+            </w:r>
+          </w:p>
+        </w:tc>
+        <w:tc>
+          <w:tcPr>
+            <w:tcW w:type="dxa" w:w="5472"/>
+            <w:tcBorders>
+              <w:top w:val="single" w:sz="6" w:color="CAD2DF"/>
+              <w:left w:val="single" w:sz="6" w:color="CAD2DF"/>
+              <w:bottom w:val="single" w:sz="6" w:color="CAD2DF"/>
+              <w:right w:val="single" w:sz="6" w:color="CAD2DF"/>
+              <w:insideH w:val="single" w:sz="6" w:color="CAD2DF"/>
+              <w:insideV w:val="single" w:sz="6" w:color="CAD2DF"/>
+            </w:tcBorders>
+            <w:vAlign w:val="center"/>
+          </w:tcPr>
+          <w:p>
+            <w:pPr>
+              <w:spacing w:after="0"/>
+            </w:pPr>
+            <w:r>
+              <w:rPr>
+                <w:rFonts w:ascii="Calibri" w:hAnsi="Calibri"/>
+                <w:b w:val="0"/>
+                <w:color w:val="111216"/>
+                <w:sz w:val="16"/>
+              </w:rPr>
+              <w:t>해시를 확인하고 최신 설치 파일 다운로드</w:t>
+            </w:r>
+          </w:p>
+        </w:tc>
+      </w:tr>
+    </w:tbl>
+    <w:p>
+      <w:pPr>
+        <w:spacing w:after="20"/>
+      </w:pPr>
+    </w:p>
+    <w:tbl>
+      <w:tblPr>
+        <w:tblW w:type="auto" w:w="0"/>
+        <w:jc w:val="center"/>
+        <w:tblLayout w:type="fixed"/>
+        <w:tblLook w:firstColumn="1" w:firstRow="1" w:lastColumn="0" w:lastRow="0" w:noHBand="0" w:noVBand="1" w:val="04A0"/>
+      </w:tblPr>
+      <w:tblGrid>
+        <w:gridCol w:w="7524"/>
+        <w:gridCol w:w="7524"/>
+      </w:tblGrid>
+      <w:tr>
+        <w:tc>
+          <w:tcPr>
+            <w:tcW w:type="dxa" w:w="1440"/>
+            <w:tcBorders>
+              <w:top w:val="single" w:sz="8" w:color="B43A3A"/>
+              <w:left w:val="single" w:sz="8" w:color="B43A3A"/>
+              <w:bottom w:val="single" w:sz="8" w:color="B43A3A"/>
+              <w:right w:val="single" w:sz="8" w:color="B43A3A"/>
+              <w:insideH w:val="single" w:sz="8" w:color="B43A3A"/>
+              <w:insideV w:val="single" w:sz="8" w:color="B43A3A"/>
+            </w:tcBorders>
+            <w:vAlign w:val="center"/>
+            <w:shd w:fill="B43A3A"/>
+          </w:tcPr>
+          <w:p>
+            <w:pPr>
+              <w:jc w:val="center"/>
+            </w:pPr>
+            <w:r>
+              <w:rPr>
+                <w:rFonts w:ascii="Calibri" w:hAnsi="Calibri"/>
+                <w:b/>
+                <w:color w:val="FFFFFF"/>
+                <w:sz w:val="17"/>
+              </w:rPr>
+              <w:t>문의 시 포함</w:t>
+            </w:r>
+          </w:p>
+        </w:tc>
+        <w:tc>
+          <w:tcPr>
+            <w:tcW w:type="dxa" w:w="11520"/>
+            <w:tcBorders>
+              <w:top w:val="single" w:sz="8" w:color="B43A3A"/>
+              <w:left w:val="single" w:sz="8" w:color="B43A3A"/>
+              <w:bottom w:val="single" w:sz="8" w:color="B43A3A"/>
+              <w:right w:val="single" w:sz="8" w:color="B43A3A"/>
+              <w:insideH w:val="single" w:sz="8" w:color="B43A3A"/>
+              <w:insideV w:val="single" w:sz="8" w:color="B43A3A"/>
+            </w:tcBorders>
+            <w:vAlign w:val="center"/>
+            <w:shd w:fill="F4F6FB"/>
+          </w:tcPr>
+          <w:p>
+            <w:r>
+              <w:rPr>
+                <w:rFonts w:ascii="Calibri" w:hAnsi="Calibri"/>
+                <w:b w:val="0"/>
+                <w:color w:val="111216"/>
+                <w:sz w:val="17"/>
+              </w:rPr>
+              <w:t>MonoField 버전, 활성 프로젝트 경로, 실행 구성명, CLI와 모델명, 실패 시각, 실행 로그 또는 진단 export를 함께 보내면 재현이 빨라집니다.</w:t>
+            </w:r>
+          </w:p>
+        </w:tc>
+      </w:tr>
+    </w:tbl>
+    <w:p>
+      <w:r>
+        <w:br w:type="page"/>
+      </w:r>
+    </w:p>
+    <w:p>
+      <w:pPr>
+        <w:spacing w:after="120"/>
+      </w:pPr>
+      <w:r>
+        <w:rPr>
+          <w:rFonts w:ascii="Calibri" w:hAnsi="Calibri"/>
+          <w:b/>
+          <w:color w:val="2E5BFF"/>
+          <w:sz w:val="17"/>
+        </w:rPr>
+        <w:t>18  /  FINAL CHECKLIST</w:t>
+      </w:r>
+    </w:p>
+    <w:p>
+      <w:pPr>
+        <w:spacing w:after="160"/>
+      </w:pPr>
+      <w:r>
+        <w:rPr>
+          <w:rFonts w:ascii="Calibri" w:hAnsi="Calibri"/>
+          <w:b/>
+          <w:color w:val="1737A6"/>
+          <w:sz w:val="42"/>
+        </w:rPr>
+        <w:t>출시 전, 이 순서로 한 번만 확인하세요</w:t>
+      </w:r>
+    </w:p>
+    <w:p>
+      <w:pPr>
+        <w:spacing w:after="200"/>
+      </w:pPr>
+      <w:r>
+        <w:rPr>
+          <w:rFonts w:ascii="Calibri" w:hAnsi="Calibri"/>
+          <w:b w:val="0"/>
+          <w:color w:val="5D6470"/>
+          <w:sz w:val="21"/>
+        </w:rPr>
+        <w:t>개발과 문서/디자인 모두 같은 원칙을 사용합니다. 입력 근거를 명시하고, 실행 상태를 확인하고, 결과를 눈으로 검토한 뒤 내보냅니다.</w:t>
+      </w:r>
+    </w:p>
+    <w:tbl>
+      <w:tblPr>
+        <w:tblW w:type="auto" w:w="0"/>
+        <w:jc w:val="center"/>
+        <w:tblLayout w:type="fixed"/>
+        <w:tblLook w:firstColumn="1" w:firstRow="1" w:lastColumn="0" w:lastRow="0" w:noHBand="0" w:noVBand="1" w:val="04A0"/>
+      </w:tblPr>
+      <w:tblGrid>
+        <w:gridCol w:w="5016"/>
+        <w:gridCol w:w="5016"/>
+        <w:gridCol w:w="5016"/>
+      </w:tblGrid>
+      <w:tr>
+        <w:trPr>
+          <w:tblHeader w:val="true"/>
+        </w:trPr>
+        <w:tc>
+          <w:tcPr>
+            <w:tcW w:type="dxa" w:w="2160"/>
+            <w:shd w:fill="DDE4EE"/>
+            <w:tcBorders>
+              <w:top w:val="single" w:sz="6" w:color="CAD2DF"/>
+              <w:left w:val="single" w:sz="6" w:color="CAD2DF"/>
+              <w:bottom w:val="single" w:sz="6" w:color="CAD2DF"/>
+              <w:right w:val="single" w:sz="6" w:color="CAD2DF"/>
+              <w:insideH w:val="single" w:sz="6" w:color="CAD2DF"/>
+              <w:insideV w:val="single" w:sz="6" w:color="CAD2DF"/>
+            </w:tcBorders>
+          </w:tcPr>
+          <w:p>
+            <w:pPr>
+              <w:spacing w:after="0"/>
+            </w:pPr>
+            <w:r>
+              <w:rPr>
+                <w:rFonts w:ascii="Calibri" w:hAnsi="Calibri"/>
+                <w:b/>
+                <w:color w:val="1737A6"/>
+                <w:sz w:val="17"/>
+              </w:rPr>
+              <w:t>단계</w:t>
+            </w:r>
+          </w:p>
+        </w:tc>
+        <w:tc>
+          <w:tcPr>
+            <w:tcW w:type="dxa" w:w="5472"/>
+            <w:shd w:fill="DDE4EE"/>
+            <w:tcBorders>
+              <w:top w:val="single" w:sz="6" w:color="CAD2DF"/>
+              <w:left w:val="single" w:sz="6" w:color="CAD2DF"/>
+              <w:bottom w:val="single" w:sz="6" w:color="CAD2DF"/>
+              <w:right w:val="single" w:sz="6" w:color="CAD2DF"/>
+              <w:insideH w:val="single" w:sz="6" w:color="CAD2DF"/>
+              <w:insideV w:val="single" w:sz="6" w:color="CAD2DF"/>
+            </w:tcBorders>
+          </w:tcPr>
+          <w:p>
+            <w:pPr>
+              <w:spacing w:after="0"/>
+            </w:pPr>
+            <w:r>
+              <w:rPr>
+                <w:rFonts w:ascii="Calibri" w:hAnsi="Calibri"/>
+                <w:b/>
+                <w:color w:val="1737A6"/>
+                <w:sz w:val="17"/>
+              </w:rPr>
+              <w:t>개발</w:t>
+            </w:r>
+          </w:p>
+        </w:tc>
+        <w:tc>
+          <w:tcPr>
+            <w:tcW w:type="dxa" w:w="5472"/>
+            <w:shd w:fill="DDE4EE"/>
+            <w:tcBorders>
+              <w:top w:val="single" w:sz="6" w:color="CAD2DF"/>
+              <w:left w:val="single" w:sz="6" w:color="CAD2DF"/>
+              <w:bottom w:val="single" w:sz="6" w:color="CAD2DF"/>
+              <w:right w:val="single" w:sz="6" w:color="CAD2DF"/>
+              <w:insideH w:val="single" w:sz="6" w:color="CAD2DF"/>
+              <w:insideV w:val="single" w:sz="6" w:color="CAD2DF"/>
+            </w:tcBorders>
+          </w:tcPr>
+          <w:p>
+            <w:pPr>
+              <w:spacing w:after="0"/>
+            </w:pPr>
+            <w:r>
+              <w:rPr>
+                <w:rFonts w:ascii="Calibri" w:hAnsi="Calibri"/>
+                <w:b/>
+                <w:color w:val="1737A6"/>
+                <w:sz w:val="17"/>
+              </w:rPr>
+              <w:t>문서/디자인</w:t>
+            </w:r>
+          </w:p>
+        </w:tc>
+      </w:tr>
+      <w:tr>
+        <w:tc>
+          <w:tcPr>
+            <w:tcW w:type="dxa" w:w="2160"/>
+            <w:tcBorders>
+              <w:top w:val="single" w:sz="6" w:color="CAD2DF"/>
+              <w:left w:val="single" w:sz="6" w:color="CAD2DF"/>
+              <w:bottom w:val="single" w:sz="6" w:color="CAD2DF"/>
+              <w:right w:val="single" w:sz="6" w:color="CAD2DF"/>
+              <w:insideH w:val="single" w:sz="6" w:color="CAD2DF"/>
+              <w:insideV w:val="single" w:sz="6" w:color="CAD2DF"/>
+            </w:tcBorders>
+            <w:vAlign w:val="center"/>
+          </w:tcPr>
+          <w:p>
+            <w:pPr>
+              <w:spacing w:after="0"/>
+            </w:pPr>
+            <w:r>
+              <w:rPr>
+                <w:rFonts w:ascii="Calibri" w:hAnsi="Calibri"/>
+                <w:b w:val="0"/>
+                <w:color w:val="111216"/>
+                <w:sz w:val="16"/>
+              </w:rPr>
+              <w:t>1 · 프로젝트</w:t>
+            </w:r>
+          </w:p>
+        </w:tc>
+        <w:tc>
+          <w:tcPr>
+            <w:tcW w:type="dxa" w:w="5472"/>
+            <w:tcBorders>
+              <w:top w:val="single" w:sz="6" w:color="CAD2DF"/>
+              <w:left w:val="single" w:sz="6" w:color="CAD2DF"/>
+              <w:bottom w:val="single" w:sz="6" w:color="CAD2DF"/>
+              <w:right w:val="single" w:sz="6" w:color="CAD2DF"/>
+              <w:insideH w:val="single" w:sz="6" w:color="CAD2DF"/>
+              <w:insideV w:val="single" w:sz="6" w:color="CAD2DF"/>
+            </w:tcBorders>
+            <w:vAlign w:val="center"/>
+          </w:tcPr>
+          <w:p>
+            <w:pPr>
+              <w:spacing w:after="0"/>
+            </w:pPr>
+            <w:r>
+              <w:rPr>
+                <w:rFonts w:ascii="Calibri" w:hAnsi="Calibri"/>
+                <w:b w:val="0"/>
+                <w:color w:val="111216"/>
+                <w:sz w:val="16"/>
+              </w:rPr>
+              <w:t>작업 폴더와 활성 모듈 확인</w:t>
+            </w:r>
+          </w:p>
+        </w:tc>
+        <w:tc>
+          <w:tcPr>
+            <w:tcW w:type="dxa" w:w="5472"/>
+            <w:tcBorders>
+              <w:top w:val="single" w:sz="6" w:color="CAD2DF"/>
+              <w:left w:val="single" w:sz="6" w:color="CAD2DF"/>
+              <w:bottom w:val="single" w:sz="6" w:color="CAD2DF"/>
+              <w:right w:val="single" w:sz="6" w:color="CAD2DF"/>
+              <w:insideH w:val="single" w:sz="6" w:color="CAD2DF"/>
+              <w:insideV w:val="single" w:sz="6" w:color="CAD2DF"/>
+            </w:tcBorders>
+            <w:vAlign w:val="center"/>
+          </w:tcPr>
+          <w:p>
+            <w:pPr>
+              <w:spacing w:after="0"/>
+            </w:pPr>
+            <w:r>
+              <w:rPr>
+                <w:rFonts w:ascii="Calibri" w:hAnsi="Calibri"/>
+                <w:b w:val="0"/>
+                <w:color w:val="111216"/>
+                <w:sz w:val="16"/>
+              </w:rPr>
+              <w:t>작업 폴더·참고 파일·용어사전 확인</w:t>
+            </w:r>
+          </w:p>
+        </w:tc>
+      </w:tr>
+      <w:tr>
+        <w:tc>
+          <w:tcPr>
+            <w:tcW w:type="dxa" w:w="2160"/>
+            <w:tcBorders>
+              <w:top w:val="single" w:sz="6" w:color="CAD2DF"/>
+              <w:left w:val="single" w:sz="6" w:color="CAD2DF"/>
+              <w:bottom w:val="single" w:sz="6" w:color="CAD2DF"/>
+              <w:right w:val="single" w:sz="6" w:color="CAD2DF"/>
+              <w:insideH w:val="single" w:sz="6" w:color="CAD2DF"/>
+              <w:insideV w:val="single" w:sz="6" w:color="CAD2DF"/>
+            </w:tcBorders>
+            <w:vAlign w:val="center"/>
+          </w:tcPr>
+          <w:p>
+            <w:pPr>
+              <w:spacing w:after="0"/>
+            </w:pPr>
+            <w:r>
+              <w:rPr>
+                <w:rFonts w:ascii="Calibri" w:hAnsi="Calibri"/>
+                <w:b w:val="0"/>
+                <w:color w:val="111216"/>
+                <w:sz w:val="16"/>
+              </w:rPr>
+              <w:t>2 · 엔진</w:t>
+            </w:r>
+          </w:p>
+        </w:tc>
+        <w:tc>
+          <w:tcPr>
+            <w:tcW w:type="dxa" w:w="5472"/>
+            <w:tcBorders>
+              <w:top w:val="single" w:sz="6" w:color="CAD2DF"/>
+              <w:left w:val="single" w:sz="6" w:color="CAD2DF"/>
+              <w:bottom w:val="single" w:sz="6" w:color="CAD2DF"/>
+              <w:right w:val="single" w:sz="6" w:color="CAD2DF"/>
+              <w:insideH w:val="single" w:sz="6" w:color="CAD2DF"/>
+              <w:insideV w:val="single" w:sz="6" w:color="CAD2DF"/>
+            </w:tcBorders>
+            <w:vAlign w:val="center"/>
+          </w:tcPr>
+          <w:p>
+            <w:pPr>
+              <w:spacing w:after="0"/>
+            </w:pPr>
+            <w:r>
+              <w:rPr>
+                <w:rFonts w:ascii="Calibri" w:hAnsi="Calibri"/>
+                <w:b w:val="0"/>
+                <w:color w:val="111216"/>
+                <w:sz w:val="16"/>
+              </w:rPr>
+              <w:t>CLI 로그인·모델·추론 설정 확인</w:t>
+            </w:r>
+          </w:p>
+        </w:tc>
+        <w:tc>
+          <w:tcPr>
+            <w:tcW w:type="dxa" w:w="5472"/>
+            <w:tcBorders>
+              <w:top w:val="single" w:sz="6" w:color="CAD2DF"/>
+              <w:left w:val="single" w:sz="6" w:color="CAD2DF"/>
+              <w:bottom w:val="single" w:sz="6" w:color="CAD2DF"/>
+              <w:right w:val="single" w:sz="6" w:color="CAD2DF"/>
+              <w:insideH w:val="single" w:sz="6" w:color="CAD2DF"/>
+              <w:insideV w:val="single" w:sz="6" w:color="CAD2DF"/>
+            </w:tcBorders>
+            <w:vAlign w:val="center"/>
+          </w:tcPr>
+          <w:p>
+            <w:pPr>
+              <w:spacing w:after="0"/>
+            </w:pPr>
+            <w:r>
+              <w:rPr>
+                <w:rFonts w:ascii="Calibri" w:hAnsi="Calibri"/>
+                <w:b w:val="0"/>
+                <w:color w:val="111216"/>
+                <w:sz w:val="16"/>
+              </w:rPr>
+              <w:t>CLI 또는 BYOK 연결 테스트</w:t>
+            </w:r>
+          </w:p>
+        </w:tc>
+      </w:tr>
+      <w:tr>
+        <w:tc>
+          <w:tcPr>
+            <w:tcW w:type="dxa" w:w="2160"/>
+            <w:tcBorders>
+              <w:top w:val="single" w:sz="6" w:color="CAD2DF"/>
+              <w:left w:val="single" w:sz="6" w:color="CAD2DF"/>
+              <w:bottom w:val="single" w:sz="6" w:color="CAD2DF"/>
+              <w:right w:val="single" w:sz="6" w:color="CAD2DF"/>
+              <w:insideH w:val="single" w:sz="6" w:color="CAD2DF"/>
+              <w:insideV w:val="single" w:sz="6" w:color="CAD2DF"/>
+            </w:tcBorders>
+            <w:vAlign w:val="center"/>
+          </w:tcPr>
+          <w:p>
+            <w:pPr>
+              <w:spacing w:after="0"/>
+            </w:pPr>
+            <w:r>
+              <w:rPr>
+                <w:rFonts w:ascii="Calibri" w:hAnsi="Calibri"/>
+                <w:b w:val="0"/>
+                <w:color w:val="111216"/>
+                <w:sz w:val="16"/>
+              </w:rPr>
+              <w:t>3 · 권한</w:t>
+            </w:r>
+          </w:p>
+        </w:tc>
+        <w:tc>
+          <w:tcPr>
+            <w:tcW w:type="dxa" w:w="5472"/>
+            <w:tcBorders>
+              <w:top w:val="single" w:sz="6" w:color="CAD2DF"/>
+              <w:left w:val="single" w:sz="6" w:color="CAD2DF"/>
+              <w:bottom w:val="single" w:sz="6" w:color="CAD2DF"/>
+              <w:right w:val="single" w:sz="6" w:color="CAD2DF"/>
+              <w:insideH w:val="single" w:sz="6" w:color="CAD2DF"/>
+              <w:insideV w:val="single" w:sz="6" w:color="CAD2DF"/>
+            </w:tcBorders>
+            <w:vAlign w:val="center"/>
+          </w:tcPr>
+          <w:p>
+            <w:pPr>
+              <w:spacing w:after="0"/>
+            </w:pPr>
+            <w:r>
+              <w:rPr>
+                <w:rFonts w:ascii="Calibri" w:hAnsi="Calibri"/>
+                <w:b w:val="0"/>
+                <w:color w:val="111216"/>
+                <w:sz w:val="16"/>
+              </w:rPr>
+              <w:t>DB 정책과 브라우저 탭 승인 확인</w:t>
+            </w:r>
+          </w:p>
+        </w:tc>
+        <w:tc>
+          <w:tcPr>
+            <w:tcW w:type="dxa" w:w="5472"/>
+            <w:tcBorders>
+              <w:top w:val="single" w:sz="6" w:color="CAD2DF"/>
+              <w:left w:val="single" w:sz="6" w:color="CAD2DF"/>
+              <w:bottom w:val="single" w:sz="6" w:color="CAD2DF"/>
+              <w:right w:val="single" w:sz="6" w:color="CAD2DF"/>
+              <w:insideH w:val="single" w:sz="6" w:color="CAD2DF"/>
+              <w:insideV w:val="single" w:sz="6" w:color="CAD2DF"/>
+            </w:tcBorders>
+            <w:vAlign w:val="center"/>
+          </w:tcPr>
+          <w:p>
+            <w:pPr>
+              <w:spacing w:after="0"/>
+            </w:pPr>
+            <w:r>
+              <w:rPr>
+                <w:rFonts w:ascii="Calibri" w:hAnsi="Calibri"/>
+                <w:b w:val="0"/>
+                <w:color w:val="111216"/>
+                <w:sz w:val="16"/>
+              </w:rPr>
+              <w:t>코드/브라우저/DB 근거가 필요한지 확인</w:t>
+            </w:r>
+          </w:p>
+        </w:tc>
+      </w:tr>
+      <w:tr>
+        <w:tc>
+          <w:tcPr>
+            <w:tcW w:type="dxa" w:w="2160"/>
+            <w:tcBorders>
+              <w:top w:val="single" w:sz="6" w:color="CAD2DF"/>
+              <w:left w:val="single" w:sz="6" w:color="CAD2DF"/>
+              <w:bottom w:val="single" w:sz="6" w:color="CAD2DF"/>
+              <w:right w:val="single" w:sz="6" w:color="CAD2DF"/>
+              <w:insideH w:val="single" w:sz="6" w:color="CAD2DF"/>
+              <w:insideV w:val="single" w:sz="6" w:color="CAD2DF"/>
+            </w:tcBorders>
+            <w:vAlign w:val="center"/>
+          </w:tcPr>
+          <w:p>
+            <w:pPr>
+              <w:spacing w:after="0"/>
+            </w:pPr>
+            <w:r>
+              <w:rPr>
+                <w:rFonts w:ascii="Calibri" w:hAnsi="Calibri"/>
+                <w:b w:val="0"/>
+                <w:color w:val="111216"/>
+                <w:sz w:val="16"/>
+              </w:rPr>
+              <w:t>4 · 실행</w:t>
+            </w:r>
+          </w:p>
+        </w:tc>
+        <w:tc>
+          <w:tcPr>
+            <w:tcW w:type="dxa" w:w="5472"/>
+            <w:tcBorders>
+              <w:top w:val="single" w:sz="6" w:color="CAD2DF"/>
+              <w:left w:val="single" w:sz="6" w:color="CAD2DF"/>
+              <w:bottom w:val="single" w:sz="6" w:color="CAD2DF"/>
+              <w:right w:val="single" w:sz="6" w:color="CAD2DF"/>
+              <w:insideH w:val="single" w:sz="6" w:color="CAD2DF"/>
+              <w:insideV w:val="single" w:sz="6" w:color="CAD2DF"/>
+            </w:tcBorders>
+            <w:vAlign w:val="center"/>
+          </w:tcPr>
+          <w:p>
+            <w:pPr>
+              <w:spacing w:after="0"/>
+            </w:pPr>
+            <w:r>
+              <w:rPr>
+                <w:rFonts w:ascii="Calibri" w:hAnsi="Calibri"/>
+                <w:b w:val="0"/>
+                <w:color w:val="111216"/>
+                <w:sz w:val="16"/>
+              </w:rPr>
+              <w:t>프로필·인자·포트·로그 확인</w:t>
+            </w:r>
+          </w:p>
+        </w:tc>
+        <w:tc>
+          <w:tcPr>
+            <w:tcW w:type="dxa" w:w="5472"/>
+            <w:tcBorders>
+              <w:top w:val="single" w:sz="6" w:color="CAD2DF"/>
+              <w:left w:val="single" w:sz="6" w:color="CAD2DF"/>
+              <w:bottom w:val="single" w:sz="6" w:color="CAD2DF"/>
+              <w:right w:val="single" w:sz="6" w:color="CAD2DF"/>
+              <w:insideH w:val="single" w:sz="6" w:color="CAD2DF"/>
+              <w:insideV w:val="single" w:sz="6" w:color="CAD2DF"/>
+            </w:tcBorders>
+            <w:vAlign w:val="center"/>
+          </w:tcPr>
+          <w:p>
+            <w:pPr>
+              <w:spacing w:after="0"/>
+            </w:pPr>
+            <w:r>
+              <w:rPr>
+                <w:rFonts w:ascii="Calibri" w:hAnsi="Calibri"/>
+                <w:b w:val="0"/>
+                <w:color w:val="111216"/>
+                <w:sz w:val="16"/>
+              </w:rPr>
+              <w:t>템플릿·스타일·필수 필드 확인</w:t>
+            </w:r>
+          </w:p>
+        </w:tc>
+      </w:tr>
+      <w:tr>
+        <w:tc>
+          <w:tcPr>
+            <w:tcW w:type="dxa" w:w="2160"/>
+            <w:tcBorders>
+              <w:top w:val="single" w:sz="6" w:color="CAD2DF"/>
+              <w:left w:val="single" w:sz="6" w:color="CAD2DF"/>
+              <w:bottom w:val="single" w:sz="6" w:color="CAD2DF"/>
+              <w:right w:val="single" w:sz="6" w:color="CAD2DF"/>
+              <w:insideH w:val="single" w:sz="6" w:color="CAD2DF"/>
+              <w:insideV w:val="single" w:sz="6" w:color="CAD2DF"/>
+            </w:tcBorders>
+            <w:vAlign w:val="center"/>
+          </w:tcPr>
+          <w:p>
+            <w:pPr>
+              <w:spacing w:after="0"/>
+            </w:pPr>
+            <w:r>
+              <w:rPr>
+                <w:rFonts w:ascii="Calibri" w:hAnsi="Calibri"/>
+                <w:b w:val="0"/>
+                <w:color w:val="111216"/>
+                <w:sz w:val="16"/>
+              </w:rPr>
+              <w:t>5 · 검토</w:t>
+            </w:r>
+          </w:p>
+        </w:tc>
+        <w:tc>
+          <w:tcPr>
+            <w:tcW w:type="dxa" w:w="5472"/>
+            <w:tcBorders>
+              <w:top w:val="single" w:sz="6" w:color="CAD2DF"/>
+              <w:left w:val="single" w:sz="6" w:color="CAD2DF"/>
+              <w:bottom w:val="single" w:sz="6" w:color="CAD2DF"/>
+              <w:right w:val="single" w:sz="6" w:color="CAD2DF"/>
+              <w:insideH w:val="single" w:sz="6" w:color="CAD2DF"/>
+              <w:insideV w:val="single" w:sz="6" w:color="CAD2DF"/>
+            </w:tcBorders>
+            <w:vAlign w:val="center"/>
+          </w:tcPr>
+          <w:p>
+            <w:pPr>
+              <w:spacing w:after="0"/>
+            </w:pPr>
+            <w:r>
+              <w:rPr>
+                <w:rFonts w:ascii="Calibri" w:hAnsi="Calibri"/>
+                <w:b w:val="0"/>
+                <w:color w:val="111216"/>
+                <w:sz w:val="16"/>
+              </w:rPr>
+              <w:t>diff·테스트·실제 화면 동작 확인</w:t>
+            </w:r>
+          </w:p>
+        </w:tc>
+        <w:tc>
+          <w:tcPr>
+            <w:tcW w:type="dxa" w:w="5472"/>
+            <w:tcBorders>
+              <w:top w:val="single" w:sz="6" w:color="CAD2DF"/>
+              <w:left w:val="single" w:sz="6" w:color="CAD2DF"/>
+              <w:bottom w:val="single" w:sz="6" w:color="CAD2DF"/>
+              <w:right w:val="single" w:sz="6" w:color="CAD2DF"/>
+              <w:insideH w:val="single" w:sz="6" w:color="CAD2DF"/>
+              <w:insideV w:val="single" w:sz="6" w:color="CAD2DF"/>
+            </w:tcBorders>
+            <w:vAlign w:val="center"/>
+          </w:tcPr>
+          <w:p>
+            <w:pPr>
+              <w:spacing w:after="0"/>
+            </w:pPr>
+            <w:r>
+              <w:rPr>
+                <w:rFonts w:ascii="Calibri" w:hAnsi="Calibri"/>
+                <w:b w:val="0"/>
+                <w:color w:val="111216"/>
+                <w:sz w:val="16"/>
+              </w:rPr>
+              <w:t>미리보기·표시·편집·검증 확인</w:t>
+            </w:r>
+          </w:p>
+        </w:tc>
+      </w:tr>
+      <w:tr>
+        <w:tc>
+          <w:tcPr>
+            <w:tcW w:type="dxa" w:w="2160"/>
+            <w:tcBorders>
+              <w:top w:val="single" w:sz="6" w:color="CAD2DF"/>
+              <w:left w:val="single" w:sz="6" w:color="CAD2DF"/>
+              <w:bottom w:val="single" w:sz="6" w:color="CAD2DF"/>
+              <w:right w:val="single" w:sz="6" w:color="CAD2DF"/>
+              <w:insideH w:val="single" w:sz="6" w:color="CAD2DF"/>
+              <w:insideV w:val="single" w:sz="6" w:color="CAD2DF"/>
+            </w:tcBorders>
+            <w:vAlign w:val="center"/>
+          </w:tcPr>
+          <w:p>
+            <w:pPr>
+              <w:spacing w:after="0"/>
+            </w:pPr>
+            <w:r>
+              <w:rPr>
+                <w:rFonts w:ascii="Calibri" w:hAnsi="Calibri"/>
+                <w:b w:val="0"/>
+                <w:color w:val="111216"/>
+                <w:sz w:val="16"/>
+              </w:rPr>
+              <w:t>6 · 완료</w:t>
+            </w:r>
+          </w:p>
+        </w:tc>
+        <w:tc>
+          <w:tcPr>
+            <w:tcW w:type="dxa" w:w="5472"/>
+            <w:tcBorders>
+              <w:top w:val="single" w:sz="6" w:color="CAD2DF"/>
+              <w:left w:val="single" w:sz="6" w:color="CAD2DF"/>
+              <w:bottom w:val="single" w:sz="6" w:color="CAD2DF"/>
+              <w:right w:val="single" w:sz="6" w:color="CAD2DF"/>
+              <w:insideH w:val="single" w:sz="6" w:color="CAD2DF"/>
+              <w:insideV w:val="single" w:sz="6" w:color="CAD2DF"/>
+            </w:tcBorders>
+            <w:vAlign w:val="center"/>
+          </w:tcPr>
+          <w:p>
+            <w:pPr>
+              <w:spacing w:after="0"/>
+            </w:pPr>
+            <w:r>
+              <w:rPr>
+                <w:rFonts w:ascii="Calibri" w:hAnsi="Calibri"/>
+                <w:b w:val="0"/>
+                <w:color w:val="111216"/>
+                <w:sz w:val="16"/>
+              </w:rPr>
+              <w:t>커밋·배포·회귀 결과 기록</w:t>
+            </w:r>
+          </w:p>
+        </w:tc>
+        <w:tc>
+          <w:tcPr>
+            <w:tcW w:type="dxa" w:w="5472"/>
+            <w:tcBorders>
+              <w:top w:val="single" w:sz="6" w:color="CAD2DF"/>
+              <w:left w:val="single" w:sz="6" w:color="CAD2DF"/>
+              <w:bottom w:val="single" w:sz="6" w:color="CAD2DF"/>
+              <w:right w:val="single" w:sz="6" w:color="CAD2DF"/>
+              <w:insideH w:val="single" w:sz="6" w:color="CAD2DF"/>
+              <w:insideV w:val="single" w:sz="6" w:color="CAD2DF"/>
+            </w:tcBorders>
+            <w:vAlign w:val="center"/>
+          </w:tcPr>
+          <w:p>
+            <w:pPr>
+              <w:spacing w:after="0"/>
+            </w:pPr>
+            <w:r>
+              <w:rPr>
+                <w:rFonts w:ascii="Calibri" w:hAnsi="Calibri"/>
+                <w:b w:val="0"/>
+                <w:color w:val="111216"/>
+                <w:sz w:val="16"/>
+              </w:rPr>
+              <w:t>XLSX·PPTX·PDF·HTML export 확인</w:t>
+            </w:r>
+          </w:p>
+        </w:tc>
+      </w:tr>
+    </w:tbl>
+    <w:p>
+      <w:pPr>
+        <w:spacing w:after="20"/>
+      </w:pPr>
+    </w:p>
+    <w:tbl>
+      <w:tblPr>
+        <w:tblW w:type="auto" w:w="0"/>
+        <w:jc w:val="center"/>
+        <w:tblLayout w:type="fixed"/>
+        <w:tblLook w:firstColumn="1" w:firstRow="1" w:lastColumn="0" w:lastRow="0" w:noHBand="0" w:noVBand="1" w:val="04A0"/>
+      </w:tblPr>
+      <w:tblGrid>
+        <w:gridCol w:w="7524"/>
+        <w:gridCol w:w="7524"/>
+      </w:tblGrid>
+      <w:tr>
+        <w:tc>
+          <w:tcPr>
+            <w:tcW w:type="dxa" w:w="1440"/>
+            <w:tcBorders>
+              <w:top w:val="single" w:sz="8" w:color="2E5BFF"/>
+              <w:left w:val="single" w:sz="8" w:color="2E5BFF"/>
+              <w:bottom w:val="single" w:sz="8" w:color="2E5BFF"/>
+              <w:right w:val="single" w:sz="8" w:color="2E5BFF"/>
+              <w:insideH w:val="single" w:sz="8" w:color="2E5BFF"/>
+              <w:insideV w:val="single" w:sz="8" w:color="2E5BFF"/>
+            </w:tcBorders>
+            <w:vAlign w:val="center"/>
+            <w:shd w:fill="2E5BFF"/>
+          </w:tcPr>
+          <w:p>
+            <w:pPr>
+              <w:jc w:val="center"/>
+            </w:pPr>
+            <w:r>
+              <w:rPr>
+                <w:rFonts w:ascii="Calibri" w:hAnsi="Calibri"/>
+                <w:b/>
+                <w:color w:val="FFFFFF"/>
+                <w:sz w:val="17"/>
+              </w:rPr>
+              <w:t>다시 보기</w:t>
+            </w:r>
+          </w:p>
+        </w:tc>
+        <w:tc>
+          <w:tcPr>
+            <w:tcW w:type="dxa" w:w="11520"/>
+            <w:tcBorders>
+              <w:top w:val="single" w:sz="8" w:color="2E5BFF"/>
+              <w:left w:val="single" w:sz="8" w:color="2E5BFF"/>
+              <w:bottom w:val="single" w:sz="8" w:color="2E5BFF"/>
+              <w:right w:val="single" w:sz="8" w:color="2E5BFF"/>
+              <w:insideH w:val="single" w:sz="8" w:color="2E5BFF"/>
+              <w:insideV w:val="single" w:sz="8" w:color="2E5BFF"/>
+            </w:tcBorders>
+            <w:vAlign w:val="center"/>
+            <w:shd w:fill="F4F6FB"/>
+          </w:tcPr>
+          <w:p>
+            <w:r>
+              <w:rPr>
+                <w:rFonts w:ascii="Calibri" w:hAnsi="Calibri"/>
+                <w:b w:val="0"/>
+                <w:color w:val="111216"/>
+                <w:sz w:val="17"/>
+              </w:rPr>
+              <w:t>앱의 ? 메뉴에서는 제품 가이드를, 개발 바의 ?에서는 개발 가이드를, 문서 파일 탭의 ?에서는 문서/디자인 가이드를 다시 열 수 있습니다. 설정과 좌측 기능도 처음 열 때 각 기능의 역할을 안내합니다.</w:t>
             </w:r>
           </w:p>
         </w:tc>

</xml_diff>